<commit_message>
Timer + AV timeline: querystring auto-start, one-click break countdowns
- timer/index.html: accept ?to=HH:MM (24-hour or with am/pm) and ?min=N
  to configure and auto-start the countdown. AV can bookmark or link a
  single URL per break instead of manually setting the duration.
- AV-Timeline.docx: replaced generic 'Set timer to 15:00' with direct
  timer URLs for each break (8:00, 9:50, 10:55, 1:10, 2:55, 4:45).
- Contacts: Max Reich added as emcee (max.reich@eosworldwide.com);
  Shane Spillers removed from AV contact block. Meagan Harris reworded
  as stage-side coordinator supporting emcee Max.
- README: documented ?to= and ?min= query params.
</commit_message>
<xml_diff>
--- a/deliverables/av-package/AV-Timeline.docx
+++ b/deliverables/av-package/AV-Timeline.docx
@@ -102,7 +102,7 @@
             <w:pPr>
               <w:spacing w:after="40" w:before="0"/>
             </w:pPr>
-            <w:hyperlink w:history="1" r:id="rIdps9b2qywudckjw6zgkj3o">
+            <w:hyperlink w:history="1" r:id="rIdi0eeg7ph8fvd3r1xlrnt7">
               <w:r>
                 <w:rPr>
                   <w:rStyle w:val="Hyperlink"/>
@@ -180,7 +180,7 @@
             <w:pPr>
               <w:spacing w:after="40" w:before="0"/>
             </w:pPr>
-            <w:hyperlink w:history="1" r:id="rIdthyiovlxtv2wsehtlwz3v">
+            <w:hyperlink w:history="1" r:id="rId8pckdbgaqojd9yv_-aaac">
               <w:r>
                 <w:rPr>
                   <w:rStyle w:val="Hyperlink"/>
@@ -199,7 +199,7 @@
               </w:rPr>
               <w:t xml:space="preserve"> · </w:t>
             </w:r>
-            <w:hyperlink w:history="1" r:id="rId4okjvnup07wod5mtretkd">
+            <w:hyperlink w:history="1" r:id="rIdsq30y7vqa2sjxrvegw7js">
               <w:r>
                 <w:rPr>
                   <w:rStyle w:val="Hyperlink"/>
@@ -218,7 +218,7 @@
               </w:rPr>
               <w:t xml:space="preserve"> · </w:t>
             </w:r>
-            <w:hyperlink w:history="1" r:id="rIdypvqbr8qx0jlhgwmvyg8y">
+            <w:hyperlink w:history="1" r:id="rIdw4jedmgcpcp4cm1soy_nj">
               <w:r>
                 <w:rPr>
                   <w:rStyle w:val="Hyperlink"/>
@@ -237,7 +237,7 @@
               </w:rPr>
               <w:t xml:space="preserve"> · </w:t>
             </w:r>
-            <w:hyperlink w:history="1" r:id="rIdhnxiwi8velo5wqmowujj7">
+            <w:hyperlink w:history="1" r:id="rId5fvzjdmsggjb8wwxl80cf">
               <w:r>
                 <w:rPr>
                   <w:rStyle w:val="Hyperlink"/>
@@ -867,7 +867,7 @@
             <w:pPr>
               <w:spacing w:after="40" w:before="0"/>
             </w:pPr>
-            <w:hyperlink w:history="1" r:id="rIdj-jbwo4i86jmvfgtx6msx">
+            <w:hyperlink w:history="1" r:id="rId63j-wslpwl3mciu5mohqr">
               <w:r>
                 <w:rPr>
                   <w:rStyle w:val="Hyperlink"/>
@@ -909,7 +909,7 @@
               </w:rPr>
               <w:t xml:space="preserve">Open </w:t>
             </w:r>
-            <w:hyperlink w:history="1" r:id="rIdm8ovn_catx6yd865ekp5o">
+            <w:hyperlink w:history="1" r:id="rIdmeeqopo4fvjdjogce3at-">
               <w:r>
                 <w:rPr>
                   <w:rStyle w:val="Hyperlink"/>
@@ -917,7 +917,7 @@
                   <w:sz w:val="18"/>
                   <w:szCs w:val="18"/>
                 </w:rPr>
-                <w:t xml:space="preserve">https://EOSNorthTexas.com/timer</w:t>
+                <w:t xml:space="preserve">countdown to 8:00 AM</w:t>
               </w:r>
             </w:hyperlink>
             <w:r>
@@ -926,7 +926,7 @@
                 <w:sz w:val="18"/>
                 <w:szCs w:val="18"/>
               </w:rPr>
-              <w:t xml:space="preserve"> on main screen. Set to 30:00 countdown. Start playlist.</w:t>
+              <w:t xml:space="preserve"> on main screen. Start playlist.</w:t>
             </w:r>
           </w:p>
         </w:tc>
@@ -1076,7 +1076,7 @@
               </w:rPr>
               <w:t xml:space="preserve">Walk-on: </w:t>
             </w:r>
-            <w:hyperlink w:history="1" r:id="rIdahmgjxsojvqtllpsxipqu">
+            <w:hyperlink w:history="1" r:id="rIdhrtiyp7mwoccpn9zpilel">
               <w:r>
                 <w:rPr>
                   <w:rStyle w:val="Hyperlink"/>
@@ -1232,7 +1232,7 @@
                 <w:sz w:val="18"/>
                 <w:szCs w:val="18"/>
               </w:rPr>
-              <w:t xml:space="preserve">Timer page (15:00)</w:t>
+              <w:t xml:space="preserve">Timer page (countdown to 9:50)</w:t>
             </w:r>
           </w:p>
         </w:tc>
@@ -1257,7 +1257,7 @@
             <w:pPr>
               <w:spacing w:after="40" w:before="0"/>
             </w:pPr>
-            <w:hyperlink w:history="1" r:id="rIdhthkmv-bywiuf2joja8rr">
+            <w:hyperlink w:history="1" r:id="rIdngcnguu1blul6khfmh3kr">
               <w:r>
                 <w:rPr>
                   <w:rStyle w:val="Hyperlink"/>
@@ -1297,7 +1297,26 @@
                 <w:sz w:val="18"/>
                 <w:szCs w:val="18"/>
               </w:rPr>
-              <w:t xml:space="preserve">Set timer to 15:00. Resume playlist.</w:t>
+              <w:t xml:space="preserve">One-click: </w:t>
+            </w:r>
+            <w:hyperlink w:history="1" r:id="rIdysrnl76j2yxjcbzt0reov">
+              <w:r>
+                <w:rPr>
+                  <w:rStyle w:val="Hyperlink"/>
+                  <w:rFonts w:ascii="Calibri" w:cs="Calibri" w:eastAsia="Calibri" w:hAnsi="Calibri"/>
+                  <w:sz w:val="18"/>
+                  <w:szCs w:val="18"/>
+                </w:rPr>
+                <w:t xml:space="preserve">countdown to 9:50 AM</w:t>
+              </w:r>
+            </w:hyperlink>
+            <w:r>
+              <w:rPr>
+                <w:rFonts w:ascii="Calibri" w:cs="Calibri" w:eastAsia="Calibri" w:hAnsi="Calibri"/>
+                <w:sz w:val="18"/>
+                <w:szCs w:val="18"/>
+              </w:rPr>
+              <w:t xml:space="preserve">. Resume playlist.</w:t>
             </w:r>
           </w:p>
         </w:tc>
@@ -1447,7 +1466,7 @@
               </w:rPr>
               <w:t xml:space="preserve">Walk-on: </w:t>
             </w:r>
-            <w:hyperlink w:history="1" r:id="rId0zicgtqxuazetksxwvjae">
+            <w:hyperlink w:history="1" r:id="rId6olaw0rc3bdsdsgfkdcsl">
               <w:r>
                 <w:rPr>
                   <w:rStyle w:val="Hyperlink"/>
@@ -1593,7 +1612,7 @@
                 <w:sz w:val="18"/>
                 <w:szCs w:val="18"/>
               </w:rPr>
-              <w:t xml:space="preserve">Timer page (15:00)</w:t>
+              <w:t xml:space="preserve">Timer page (countdown to 10:55)</w:t>
             </w:r>
           </w:p>
         </w:tc>
@@ -1618,7 +1637,7 @@
             <w:pPr>
               <w:spacing w:after="40" w:before="0"/>
             </w:pPr>
-            <w:hyperlink w:history="1" r:id="rIdnheui_q2snrvriunpzbld">
+            <w:hyperlink w:history="1" r:id="rIdxfd31tgnlcvqzll9i_4hf">
               <w:r>
                 <w:rPr>
                   <w:rStyle w:val="Hyperlink"/>
@@ -1658,7 +1677,26 @@
                 <w:sz w:val="18"/>
                 <w:szCs w:val="18"/>
               </w:rPr>
-              <w:t xml:space="preserve">Set timer to 15:00. Resume playlist.</w:t>
+              <w:t xml:space="preserve">One-click: </w:t>
+            </w:r>
+            <w:hyperlink w:history="1" r:id="rIdw9ieocldkxz7rwr_07sdn">
+              <w:r>
+                <w:rPr>
+                  <w:rStyle w:val="Hyperlink"/>
+                  <w:rFonts w:ascii="Calibri" w:cs="Calibri" w:eastAsia="Calibri" w:hAnsi="Calibri"/>
+                  <w:sz w:val="18"/>
+                  <w:szCs w:val="18"/>
+                </w:rPr>
+                <w:t xml:space="preserve">countdown to 10:55 AM</w:t>
+              </w:r>
+            </w:hyperlink>
+            <w:r>
+              <w:rPr>
+                <w:rFonts w:ascii="Calibri" w:cs="Calibri" w:eastAsia="Calibri" w:hAnsi="Calibri"/>
+                <w:sz w:val="18"/>
+                <w:szCs w:val="18"/>
+              </w:rPr>
+              <w:t xml:space="preserve">. Resume playlist.</w:t>
             </w:r>
           </w:p>
         </w:tc>
@@ -1808,7 +1846,7 @@
               </w:rPr>
               <w:t xml:space="preserve">Walk-on: </w:t>
             </w:r>
-            <w:hyperlink w:history="1" r:id="rIdwhnktucqn-g-d2tabfz1m">
+            <w:hyperlink w:history="1" r:id="rIdvjmkbbsppny_mr2hszlae">
               <w:r>
                 <w:rPr>
                   <w:rStyle w:val="Hyperlink"/>
@@ -1989,7 +2027,7 @@
               </w:rPr>
               <w:t xml:space="preserve">Pre-Lunch: </w:t>
             </w:r>
-            <w:hyperlink w:history="1" r:id="rIdko5ycsetb5iylmsg9pqqv">
+            <w:hyperlink w:history="1" r:id="rIdbo9n3kx44hpqn60zvhytb">
               <w:r>
                 <w:rPr>
                   <w:rStyle w:val="Hyperlink"/>
@@ -2223,7 +2261,7 @@
               </w:rPr>
               <w:t xml:space="preserve">Walk-on: </w:t>
             </w:r>
-            <w:hyperlink w:history="1" r:id="rIdo1ztqdcpdhwz-fdduscz8">
+            <w:hyperlink w:history="1" r:id="rIdsvaonon_ym7zpxdfdvtmt">
               <w:r>
                 <w:rPr>
                   <w:rStyle w:val="Hyperlink"/>
@@ -2369,8 +2407,24 @@
                 <w:sz w:val="18"/>
                 <w:szCs w:val="18"/>
               </w:rPr>
-              <w:t xml:space="preserve">Pre-event loop (Deck.pptx slides 1-5 auto-advance)</w:t>
-            </w:r>
+              <w:t xml:space="preserve">Pre-event loop (Deck.pptx slides 1-5 auto-advance) OR </w:t>
+            </w:r>
+          </w:p>
+          <w:p>
+            <w:pPr>
+              <w:spacing w:after="40" w:before="0"/>
+            </w:pPr>
+            <w:hyperlink w:history="1" r:id="rIdzxuvqyqq8cjus8r3rzhki">
+              <w:r>
+                <w:rPr>
+                  <w:rStyle w:val="Hyperlink"/>
+                  <w:rFonts w:ascii="Calibri" w:cs="Calibri" w:eastAsia="Calibri" w:hAnsi="Calibri"/>
+                  <w:sz w:val="18"/>
+                  <w:szCs w:val="18"/>
+                </w:rPr>
+                <w:t xml:space="preserve">timer countdown to 1:10 PM</w:t>
+              </w:r>
+            </w:hyperlink>
           </w:p>
         </w:tc>
         <w:tc>
@@ -2404,7 +2458,7 @@
               </w:rPr>
               <w:t xml:space="preserve">Post-Lunch: </w:t>
             </w:r>
-            <w:hyperlink w:history="1" r:id="rIdupcqpagonbbxycq4zsmcx">
+            <w:hyperlink w:history="1" r:id="rId4er5ghh9r9b-ubhpibyvk">
               <w:r>
                 <w:rPr>
                   <w:rStyle w:val="Hyperlink"/>
@@ -2425,7 +2479,7 @@
               </w:rPr>
               <w:t xml:space="preserve"> — Dolly Parton, then </w:t>
             </w:r>
-            <w:hyperlink w:history="1" r:id="rId21ow7uelna2jdk9t1c_ai">
+            <w:hyperlink w:history="1" r:id="rIdys0udxqtodf4-ln5yz_bj">
               <w:r>
                 <w:rPr>
                   <w:rStyle w:val="Hyperlink"/>
@@ -2649,7 +2703,7 @@
               </w:rPr>
               <w:t xml:space="preserve">Walk-on: </w:t>
             </w:r>
-            <w:hyperlink w:history="1" r:id="rIdlrmcjyuzyvlmvnofotsls">
+            <w:hyperlink w:history="1" r:id="rIdx2_uuc8xshzcqfhcxwmmk">
               <w:r>
                 <w:rPr>
                   <w:rStyle w:val="Hyperlink"/>
@@ -2849,7 +2903,7 @@
                 <w:sz w:val="18"/>
                 <w:szCs w:val="18"/>
               </w:rPr>
-              <w:t xml:space="preserve">Timer page (15:00) OR Celebrations Loop</w:t>
+              <w:t xml:space="preserve">Timer page (countdown to 2:55) OR Celebrations Loop</w:t>
             </w:r>
           </w:p>
         </w:tc>
@@ -2874,7 +2928,7 @@
             <w:pPr>
               <w:spacing w:after="40" w:before="0"/>
             </w:pPr>
-            <w:hyperlink w:history="1" r:id="rIdtbh3z2ayjqg71pip4svss">
+            <w:hyperlink w:history="1" r:id="rIducstdgnxbutaff4ok4gg6">
               <w:r>
                 <w:rPr>
                   <w:rStyle w:val="Hyperlink"/>
@@ -2914,7 +2968,26 @@
                 <w:sz w:val="18"/>
                 <w:szCs w:val="18"/>
               </w:rPr>
-              <w:t xml:space="preserve">Set timer to 15:00. </w:t>
+              <w:t xml:space="preserve">One-click: </w:t>
+            </w:r>
+            <w:hyperlink w:history="1" r:id="rIduyjekqy0cl8r_bckluoui">
+              <w:r>
+                <w:rPr>
+                  <w:rStyle w:val="Hyperlink"/>
+                  <w:rFonts w:ascii="Calibri" w:cs="Calibri" w:eastAsia="Calibri" w:hAnsi="Calibri"/>
+                  <w:sz w:val="18"/>
+                  <w:szCs w:val="18"/>
+                </w:rPr>
+                <w:t xml:space="preserve">countdown to 2:55 PM</w:t>
+              </w:r>
+            </w:hyperlink>
+            <w:r>
+              <w:rPr>
+                <w:rFonts w:ascii="Calibri" w:cs="Calibri" w:eastAsia="Calibri" w:hAnsi="Calibri"/>
+                <w:sz w:val="18"/>
+                <w:szCs w:val="18"/>
+              </w:rPr>
+              <w:t xml:space="preserve">. </w:t>
             </w:r>
             <w:r>
               <w:rPr>
@@ -3082,7 +3155,7 @@
               </w:rPr>
               <w:t xml:space="preserve">Walk-on: </w:t>
             </w:r>
-            <w:hyperlink w:history="1" r:id="rIdwjxgezf3i28jvgn2y5-ua">
+            <w:hyperlink w:history="1" r:id="rIdfslz70ccop1umahs0apr6">
               <w:r>
                 <w:rPr>
                   <w:rStyle w:val="Hyperlink"/>
@@ -3228,7 +3301,7 @@
                 <w:sz w:val="18"/>
                 <w:szCs w:val="18"/>
               </w:rPr>
-              <w:t xml:space="preserve">Timer page (20:00) OR Celebrations Loop</w:t>
+              <w:t xml:space="preserve">Timer page (countdown to 4:45) OR Celebrations Loop</w:t>
             </w:r>
           </w:p>
         </w:tc>
@@ -3253,7 +3326,7 @@
             <w:pPr>
               <w:spacing w:after="40" w:before="0"/>
             </w:pPr>
-            <w:hyperlink w:history="1" r:id="rIdmkfiey13q0xh_wtnjowdg">
+            <w:hyperlink w:history="1" r:id="rIdpdvnwkkyt8hxp_84z5jox">
               <w:r>
                 <w:rPr>
                   <w:rStyle w:val="Hyperlink"/>
@@ -3293,7 +3366,26 @@
                 <w:sz w:val="18"/>
                 <w:szCs w:val="18"/>
               </w:rPr>
-              <w:t xml:space="preserve">Set timer to 20:00. </w:t>
+              <w:t xml:space="preserve">One-click: </w:t>
+            </w:r>
+            <w:hyperlink w:history="1" r:id="rIdzcf6rxvfv6ci1ei84w-lc">
+              <w:r>
+                <w:rPr>
+                  <w:rStyle w:val="Hyperlink"/>
+                  <w:rFonts w:ascii="Calibri" w:cs="Calibri" w:eastAsia="Calibri" w:hAnsi="Calibri"/>
+                  <w:sz w:val="18"/>
+                  <w:szCs w:val="18"/>
+                </w:rPr>
+                <w:t xml:space="preserve">countdown to 4:45 PM</w:t>
+              </w:r>
+            </w:hyperlink>
+            <w:r>
+              <w:rPr>
+                <w:rFonts w:ascii="Calibri" w:cs="Calibri" w:eastAsia="Calibri" w:hAnsi="Calibri"/>
+                <w:sz w:val="18"/>
+                <w:szCs w:val="18"/>
+              </w:rPr>
+              <w:t xml:space="preserve">. </w:t>
             </w:r>
             <w:r>
               <w:rPr>
@@ -4006,7 +4098,7 @@
             <w:pPr>
               <w:spacing w:after="40" w:before="0"/>
             </w:pPr>
-            <w:hyperlink w:history="1" r:id="rIdayn8rliu5kavne_0lpcic">
+            <w:hyperlink w:history="1" r:id="rIdovms7qevdc4od-y-wmpne">
               <w:r>
                 <w:rPr>
                   <w:rStyle w:val="Hyperlink"/>
@@ -4109,7 +4201,7 @@
             <w:pPr>
               <w:spacing w:after="40" w:before="0"/>
             </w:pPr>
-            <w:hyperlink w:history="1" r:id="rIdh2bsjvdn1joi8qjkherha">
+            <w:hyperlink w:history="1" r:id="rId9_qstxg35dxc5dniua5np">
               <w:r>
                 <w:rPr>
                   <w:rStyle w:val="Hyperlink"/>
@@ -4209,7 +4301,7 @@
             <w:pPr>
               <w:spacing w:after="40" w:before="0"/>
             </w:pPr>
-            <w:hyperlink w:history="1" r:id="rIdwajllcnynfdkwgnxcymk6">
+            <w:hyperlink w:history="1" r:id="rIdd0d7tf8mtrsaqu2in2r02">
               <w:r>
                 <w:rPr>
                   <w:rStyle w:val="Hyperlink"/>
@@ -4312,7 +4404,7 @@
             <w:pPr>
               <w:spacing w:after="40" w:before="0"/>
             </w:pPr>
-            <w:hyperlink w:history="1" r:id="rIds2f884avvt4g2vftp787o">
+            <w:hyperlink w:history="1" r:id="rId28xkdpzo2pxxzx6t7ctt9">
               <w:r>
                 <w:rPr>
                   <w:rStyle w:val="Hyperlink"/>
@@ -4596,7 +4688,7 @@
             <w:pPr>
               <w:spacing w:after="40" w:before="0"/>
             </w:pPr>
-            <w:hyperlink w:history="1" r:id="rIdc768qfkdr9km8ya7_k_c-">
+            <w:hyperlink w:history="1" r:id="rIdrxcej3pzi7k_fh3xxvqpp">
               <w:r>
                 <w:rPr>
                   <w:rStyle w:val="Hyperlink"/>
@@ -4740,7 +4832,7 @@
             <w:pPr>
               <w:spacing w:after="40" w:before="0"/>
             </w:pPr>
-            <w:hyperlink w:history="1" r:id="rIdz6c15obrs2fcxb95o9tad">
+            <w:hyperlink w:history="1" r:id="rIdldzkzmyzjvqacqrjebpks">
               <w:r>
                 <w:rPr>
                   <w:rStyle w:val="Hyperlink"/>
@@ -4884,7 +4976,7 @@
             <w:pPr>
               <w:spacing w:after="40" w:before="0"/>
             </w:pPr>
-            <w:hyperlink w:history="1" r:id="rIdtbvopdapobf_w9tnbeu5k">
+            <w:hyperlink w:history="1" r:id="rIdhccwucuyuojyn7z2e2m-u">
               <w:r>
                 <w:rPr>
                   <w:rStyle w:val="Hyperlink"/>
@@ -5026,7 +5118,7 @@
             <w:pPr>
               <w:spacing w:after="40" w:before="0"/>
             </w:pPr>
-            <w:hyperlink w:history="1" r:id="rIdphegtu_83ikziuqcxswzi">
+            <w:hyperlink w:history="1" r:id="rId-al9ztc1m78dbc8ap3_58">
               <w:r>
                 <w:rPr>
                   <w:rStyle w:val="Hyperlink"/>
@@ -5170,7 +5262,7 @@
             <w:pPr>
               <w:spacing w:after="40" w:before="0"/>
             </w:pPr>
-            <w:hyperlink w:history="1" r:id="rIdrlxzfwxoqdhdgt4t0fi4a">
+            <w:hyperlink w:history="1" r:id="rIdqlv2got0dzfyiydulptib">
               <w:r>
                 <w:rPr>
                   <w:rStyle w:val="Hyperlink"/>
@@ -5312,7 +5404,7 @@
             <w:pPr>
               <w:spacing w:after="40" w:before="0"/>
             </w:pPr>
-            <w:hyperlink w:history="1" r:id="rIdhfvzatnhtsn_gxppswt8x">
+            <w:hyperlink w:history="1" r:id="rIdfuodg5n-ftpa7cozfmqit">
               <w:r>
                 <w:rPr>
                   <w:rStyle w:val="Hyperlink"/>
@@ -5499,7 +5591,7 @@
               </w:rPr>
               <w:t xml:space="preserve">Default to </w:t>
             </w:r>
-            <w:hyperlink w:history="1" r:id="rIdowpkdjrkysps_pts28bzi">
+            <w:hyperlink w:history="1" r:id="rIdmeg8bsbm62jtknx9lj07g">
               <w:r>
                 <w:rPr>
                   <w:rStyle w:val="Hyperlink"/>
@@ -5565,7 +5657,7 @@
         </w:rPr>
         <w:t xml:space="preserve">•  Pre-Lunch bridge (11:55 AM): </w:t>
       </w:r>
-      <w:hyperlink w:history="1" r:id="rIdyud1cgrvxmljxrswxidoc">
+      <w:hyperlink w:history="1" r:id="rIdoii9z1ajebtzjskqfpa0y">
         <w:r>
           <w:rPr>
             <w:rStyle w:val="Hyperlink"/>
@@ -5601,7 +5693,7 @@
         </w:rPr>
         <w:t xml:space="preserve">•  Post-Lunch return (1:00 PM): </w:t>
       </w:r>
-      <w:hyperlink w:history="1" r:id="rId6nvwt-wi9zxumopauj1ei">
+      <w:hyperlink w:history="1" r:id="rIdqbcx6fms9_uldikf877vl">
         <w:r>
           <w:rPr>
             <w:rStyle w:val="Hyperlink"/>
@@ -5622,7 +5714,7 @@
         </w:rPr>
         <w:t xml:space="preserve"> by Dolly Parton, then resume </w:t>
       </w:r>
-      <w:hyperlink w:history="1" r:id="rIdhsljbvklez3inx7ri51si">
+      <w:hyperlink w:history="1" r:id="rIdparcns8rhgrkrz5fhal-9">
         <w:r>
           <w:rPr>
             <w:rStyle w:val="Hyperlink"/>
@@ -5907,7 +5999,7 @@
         </w:rPr>
         <w:t xml:space="preserve"> (deck / files / AV lead) · </w:t>
       </w:r>
-      <w:hyperlink w:history="1" r:id="rIdbkpt8e0mwoqfauidn-wuk">
+      <w:hyperlink w:history="1" r:id="rIdpxcbl1rr5vy0fayoerozo">
         <w:r>
           <w:rPr>
             <w:rStyle w:val="Hyperlink"/>
@@ -5926,7 +6018,7 @@
         </w:rPr>
         <w:t xml:space="preserve"> · </w:t>
       </w:r>
-      <w:hyperlink w:history="1" r:id="rIdmlbbhz7theq-ncjr2bewi">
+      <w:hyperlink w:history="1" r:id="rId6aprbxmi5kz4du6hjov2j">
         <w:r>
           <w:rPr>
             <w:rStyle w:val="Hyperlink"/>
@@ -5960,7 +6052,7 @@
         </w:rPr>
         <w:t xml:space="preserve"> (Encore / Statler AV contact) · </w:t>
       </w:r>
-      <w:hyperlink w:history="1" r:id="rId6q32kkn4wtsdijqkmocpl">
+      <w:hyperlink w:history="1" r:id="rIdws3kkgpdswxhq20hgwtez">
         <w:r>
           <w:rPr>
             <w:rStyle w:val="Hyperlink"/>
@@ -5979,7 +6071,7 @@
         </w:rPr>
         <w:t xml:space="preserve"> · </w:t>
       </w:r>
-      <w:hyperlink w:history="1" r:id="rId6rhcx479mwgwyor0gcvcz">
+      <w:hyperlink w:history="1" r:id="rIdciz5owp_djmyuejt1nphg">
         <w:r>
           <w:rPr>
             <w:rStyle w:val="Hyperlink"/>
@@ -6003,7 +6095,7 @@
           <w:sz w:val="18"/>
           <w:szCs w:val="18"/>
         </w:rPr>
-        <w:t xml:space="preserve">•  Shane Spillers</w:t>
+        <w:t xml:space="preserve">•  Max Reich</w:t>
       </w:r>
       <w:r>
         <w:rPr>
@@ -6011,9 +6103,9 @@
           <w:sz w:val="18"/>
           <w:szCs w:val="18"/>
         </w:rPr>
-        <w:t xml:space="preserve"> (emcee / event lead) · </w:t>
+        <w:t xml:space="preserve"> (emcee) · </w:t>
       </w:r>
-      <w:hyperlink w:history="1" r:id="rIdfd9glpohdtipgffbxszhv">
+      <w:hyperlink w:history="1" r:id="rId2hhswscxnrdseprooswob">
         <w:r>
           <w:rPr>
             <w:rStyle w:val="Hyperlink"/>
@@ -6021,26 +6113,7 @@
             <w:sz w:val="18"/>
             <w:szCs w:val="18"/>
           </w:rPr>
-          <w:t xml:space="preserve">214-519-9599</w:t>
-        </w:r>
-      </w:hyperlink>
-      <w:r>
-        <w:rPr>
-          <w:rFonts w:ascii="Calibri" w:cs="Calibri" w:eastAsia="Calibri" w:hAnsi="Calibri"/>
-          <w:sz w:val="18"/>
-          <w:szCs w:val="18"/>
-        </w:rPr>
-        <w:t xml:space="preserve"> · </w:t>
-      </w:r>
-      <w:hyperlink w:history="1" r:id="rIdwzkm2jfat9bdezm5mafe1">
-        <w:r>
-          <w:rPr>
-            <w:rStyle w:val="Hyperlink"/>
-            <w:rFonts w:ascii="Calibri" w:cs="Calibri" w:eastAsia="Calibri" w:hAnsi="Calibri"/>
-            <w:sz w:val="18"/>
-            <w:szCs w:val="18"/>
-          </w:rPr>
-          <w:t xml:space="preserve">shane.spillers@eosworldwide.com</w:t>
+          <w:t xml:space="preserve">max.reich@eosworldwide.com</w:t>
         </w:r>
       </w:hyperlink>
     </w:p>
@@ -6064,9 +6137,9 @@
           <w:sz w:val="18"/>
           <w:szCs w:val="18"/>
         </w:rPr>
-        <w:t xml:space="preserve"> (music coordinator) · </w:t>
+        <w:t xml:space="preserve"> (stage-side coordinator (eyes on stage all day, supports emcee Max)) · </w:t>
       </w:r>
-      <w:hyperlink w:history="1" r:id="rId0fybryryt4nwwvn7e_p6v">
+      <w:hyperlink w:history="1" r:id="rIdlxwl7vechupk9i8y7ob0x">
         <w:r>
           <w:rPr>
             <w:rStyle w:val="Hyperlink"/>
@@ -6146,7 +6219,7 @@
       </w:rPr>
       <w:t xml:space="preserve">Timer page: </w:t>
     </w:r>
-    <w:hyperlink w:history="1" r:id="rIdjeargs4arh_zolaotenvv">
+    <w:hyperlink w:history="1" r:id="rIdhpqivsql6fkyh2uqpggkc">
       <w:r>
         <w:rPr>
           <w:rStyle w:val="Hyperlink"/>

</xml_diff>

<commit_message>
Timer + AV timeline: custom minutes input, contacts refresh
- timer/index.html: added a custom minutes input (1-600 min) next to the
  preset buttons. Type a number and hit Enter or Go to start a countdown
  of any duration. Keyboard shortcuts (Space/R/F) are ignored while the
  input is focused.
- AV-Timeline.docx: contact roster updated
    - Shane Spillers back in as Venue Liaison (knows the Statler)
    - Erin Thiem added as Day-of Show Operations (event lead)
    - Max Reich role clarified to MC (emcee)
    - Meagan wording updated to reference MC Max
</commit_message>
<xml_diff>
--- a/deliverables/av-package/AV-Timeline.docx
+++ b/deliverables/av-package/AV-Timeline.docx
@@ -102,7 +102,7 @@
             <w:pPr>
               <w:spacing w:after="40" w:before="0"/>
             </w:pPr>
-            <w:hyperlink w:history="1" r:id="rIdi0eeg7ph8fvd3r1xlrnt7">
+            <w:hyperlink w:history="1" r:id="rIdp46na4zwzv_xkc2zwuikd">
               <w:r>
                 <w:rPr>
                   <w:rStyle w:val="Hyperlink"/>
@@ -180,7 +180,7 @@
             <w:pPr>
               <w:spacing w:after="40" w:before="0"/>
             </w:pPr>
-            <w:hyperlink w:history="1" r:id="rId8pckdbgaqojd9yv_-aaac">
+            <w:hyperlink w:history="1" r:id="rIddretxztmq0uhmi5crdf33">
               <w:r>
                 <w:rPr>
                   <w:rStyle w:val="Hyperlink"/>
@@ -199,7 +199,7 @@
               </w:rPr>
               <w:t xml:space="preserve"> · </w:t>
             </w:r>
-            <w:hyperlink w:history="1" r:id="rIdsq30y7vqa2sjxrvegw7js">
+            <w:hyperlink w:history="1" r:id="rIdd5cmac5izthmyaj1kgr25">
               <w:r>
                 <w:rPr>
                   <w:rStyle w:val="Hyperlink"/>
@@ -218,7 +218,7 @@
               </w:rPr>
               <w:t xml:space="preserve"> · </w:t>
             </w:r>
-            <w:hyperlink w:history="1" r:id="rIdw4jedmgcpcp4cm1soy_nj">
+            <w:hyperlink w:history="1" r:id="rId9dwjv3muavrv7gmqbeewv">
               <w:r>
                 <w:rPr>
                   <w:rStyle w:val="Hyperlink"/>
@@ -237,7 +237,7 @@
               </w:rPr>
               <w:t xml:space="preserve"> · </w:t>
             </w:r>
-            <w:hyperlink w:history="1" r:id="rId5fvzjdmsggjb8wwxl80cf">
+            <w:hyperlink w:history="1" r:id="rIdcobijmcgc9zrv3so8wjfn">
               <w:r>
                 <w:rPr>
                   <w:rStyle w:val="Hyperlink"/>
@@ -867,7 +867,7 @@
             <w:pPr>
               <w:spacing w:after="40" w:before="0"/>
             </w:pPr>
-            <w:hyperlink w:history="1" r:id="rId63j-wslpwl3mciu5mohqr">
+            <w:hyperlink w:history="1" r:id="rId5uvvs6zxaedfpuuwk5p07">
               <w:r>
                 <w:rPr>
                   <w:rStyle w:val="Hyperlink"/>
@@ -909,7 +909,7 @@
               </w:rPr>
               <w:t xml:space="preserve">Open </w:t>
             </w:r>
-            <w:hyperlink w:history="1" r:id="rIdmeeqopo4fvjdjogce3at-">
+            <w:hyperlink w:history="1" r:id="rIdpzf7qmobvi11qolx-dfoc">
               <w:r>
                 <w:rPr>
                   <w:rStyle w:val="Hyperlink"/>
@@ -1076,7 +1076,7 @@
               </w:rPr>
               <w:t xml:space="preserve">Walk-on: </w:t>
             </w:r>
-            <w:hyperlink w:history="1" r:id="rIdhrtiyp7mwoccpn9zpilel">
+            <w:hyperlink w:history="1" r:id="rIdiyslszuvtepe4pnfm6c95">
               <w:r>
                 <w:rPr>
                   <w:rStyle w:val="Hyperlink"/>
@@ -1257,7 +1257,7 @@
             <w:pPr>
               <w:spacing w:after="40" w:before="0"/>
             </w:pPr>
-            <w:hyperlink w:history="1" r:id="rIdngcnguu1blul6khfmh3kr">
+            <w:hyperlink w:history="1" r:id="rIdmb39004cr6fl4ub8igyf5">
               <w:r>
                 <w:rPr>
                   <w:rStyle w:val="Hyperlink"/>
@@ -1299,7 +1299,7 @@
               </w:rPr>
               <w:t xml:space="preserve">One-click: </w:t>
             </w:r>
-            <w:hyperlink w:history="1" r:id="rIdysrnl76j2yxjcbzt0reov">
+            <w:hyperlink w:history="1" r:id="rIdct5lcrcc7oda9mbisjgil">
               <w:r>
                 <w:rPr>
                   <w:rStyle w:val="Hyperlink"/>
@@ -1466,7 +1466,7 @@
               </w:rPr>
               <w:t xml:space="preserve">Walk-on: </w:t>
             </w:r>
-            <w:hyperlink w:history="1" r:id="rId6olaw0rc3bdsdsgfkdcsl">
+            <w:hyperlink w:history="1" r:id="rIdcniixuzlrkoomacq2zssm">
               <w:r>
                 <w:rPr>
                   <w:rStyle w:val="Hyperlink"/>
@@ -1637,7 +1637,7 @@
             <w:pPr>
               <w:spacing w:after="40" w:before="0"/>
             </w:pPr>
-            <w:hyperlink w:history="1" r:id="rIdxfd31tgnlcvqzll9i_4hf">
+            <w:hyperlink w:history="1" r:id="rIdhwj3x4dfosehoeh3veaww">
               <w:r>
                 <w:rPr>
                   <w:rStyle w:val="Hyperlink"/>
@@ -1679,7 +1679,7 @@
               </w:rPr>
               <w:t xml:space="preserve">One-click: </w:t>
             </w:r>
-            <w:hyperlink w:history="1" r:id="rIdw9ieocldkxz7rwr_07sdn">
+            <w:hyperlink w:history="1" r:id="rIdg8szdnknnhv0py9uut2mf">
               <w:r>
                 <w:rPr>
                   <w:rStyle w:val="Hyperlink"/>
@@ -1846,7 +1846,7 @@
               </w:rPr>
               <w:t xml:space="preserve">Walk-on: </w:t>
             </w:r>
-            <w:hyperlink w:history="1" r:id="rIdvjmkbbsppny_mr2hszlae">
+            <w:hyperlink w:history="1" r:id="rId0_jrjnvasc84jlqz94uoc">
               <w:r>
                 <w:rPr>
                   <w:rStyle w:val="Hyperlink"/>
@@ -2027,7 +2027,7 @@
               </w:rPr>
               <w:t xml:space="preserve">Pre-Lunch: </w:t>
             </w:r>
-            <w:hyperlink w:history="1" r:id="rIdbo9n3kx44hpqn60zvhytb">
+            <w:hyperlink w:history="1" r:id="rId6c9t_eq5p3pbqiafos5un">
               <w:r>
                 <w:rPr>
                   <w:rStyle w:val="Hyperlink"/>
@@ -2261,7 +2261,7 @@
               </w:rPr>
               <w:t xml:space="preserve">Walk-on: </w:t>
             </w:r>
-            <w:hyperlink w:history="1" r:id="rIdsvaonon_ym7zpxdfdvtmt">
+            <w:hyperlink w:history="1" r:id="rIde8qho66pmbl2oimof_owf">
               <w:r>
                 <w:rPr>
                   <w:rStyle w:val="Hyperlink"/>
@@ -2414,7 +2414,7 @@
             <w:pPr>
               <w:spacing w:after="40" w:before="0"/>
             </w:pPr>
-            <w:hyperlink w:history="1" r:id="rIdzxuvqyqq8cjus8r3rzhki">
+            <w:hyperlink w:history="1" r:id="rIdxtq5tfz-ushqzear58ltq">
               <w:r>
                 <w:rPr>
                   <w:rStyle w:val="Hyperlink"/>
@@ -2458,7 +2458,7 @@
               </w:rPr>
               <w:t xml:space="preserve">Post-Lunch: </w:t>
             </w:r>
-            <w:hyperlink w:history="1" r:id="rId4er5ghh9r9b-ubhpibyvk">
+            <w:hyperlink w:history="1" r:id="rId042djhv_upqax8umdqvdo">
               <w:r>
                 <w:rPr>
                   <w:rStyle w:val="Hyperlink"/>
@@ -2479,7 +2479,7 @@
               </w:rPr>
               <w:t xml:space="preserve"> — Dolly Parton, then </w:t>
             </w:r>
-            <w:hyperlink w:history="1" r:id="rIdys0udxqtodf4-ln5yz_bj">
+            <w:hyperlink w:history="1" r:id="rIds2m4gc13anakbwmzjdbfy">
               <w:r>
                 <w:rPr>
                   <w:rStyle w:val="Hyperlink"/>
@@ -2703,7 +2703,7 @@
               </w:rPr>
               <w:t xml:space="preserve">Walk-on: </w:t>
             </w:r>
-            <w:hyperlink w:history="1" r:id="rIdx2_uuc8xshzcqfhcxwmmk">
+            <w:hyperlink w:history="1" r:id="rIdsq6emgtkq3m-9-fz2phbb">
               <w:r>
                 <w:rPr>
                   <w:rStyle w:val="Hyperlink"/>
@@ -2928,7 +2928,7 @@
             <w:pPr>
               <w:spacing w:after="40" w:before="0"/>
             </w:pPr>
-            <w:hyperlink w:history="1" r:id="rIducstdgnxbutaff4ok4gg6">
+            <w:hyperlink w:history="1" r:id="rId7q6ap3m0yuj4cnjxqttjs">
               <w:r>
                 <w:rPr>
                   <w:rStyle w:val="Hyperlink"/>
@@ -2970,7 +2970,7 @@
               </w:rPr>
               <w:t xml:space="preserve">One-click: </w:t>
             </w:r>
-            <w:hyperlink w:history="1" r:id="rIduyjekqy0cl8r_bckluoui">
+            <w:hyperlink w:history="1" r:id="rIdc8wbyt1aexxazql7vtwaa">
               <w:r>
                 <w:rPr>
                   <w:rStyle w:val="Hyperlink"/>
@@ -3155,7 +3155,7 @@
               </w:rPr>
               <w:t xml:space="preserve">Walk-on: </w:t>
             </w:r>
-            <w:hyperlink w:history="1" r:id="rIdfslz70ccop1umahs0apr6">
+            <w:hyperlink w:history="1" r:id="rIdespj39dw3xx9-dtr4mbxf">
               <w:r>
                 <w:rPr>
                   <w:rStyle w:val="Hyperlink"/>
@@ -3326,7 +3326,7 @@
             <w:pPr>
               <w:spacing w:after="40" w:before="0"/>
             </w:pPr>
-            <w:hyperlink w:history="1" r:id="rIdpdvnwkkyt8hxp_84z5jox">
+            <w:hyperlink w:history="1" r:id="rIdqhitrnlu1ltvop5bka09d">
               <w:r>
                 <w:rPr>
                   <w:rStyle w:val="Hyperlink"/>
@@ -3368,7 +3368,7 @@
               </w:rPr>
               <w:t xml:space="preserve">One-click: </w:t>
             </w:r>
-            <w:hyperlink w:history="1" r:id="rIdzcf6rxvfv6ci1ei84w-lc">
+            <w:hyperlink w:history="1" r:id="rIdqixdh1-k6ppncuuskxtm6">
               <w:r>
                 <w:rPr>
                   <w:rStyle w:val="Hyperlink"/>
@@ -4098,7 +4098,7 @@
             <w:pPr>
               <w:spacing w:after="40" w:before="0"/>
             </w:pPr>
-            <w:hyperlink w:history="1" r:id="rIdovms7qevdc4od-y-wmpne">
+            <w:hyperlink w:history="1" r:id="rIdyeqyabqkjx1u8_-ssymhm">
               <w:r>
                 <w:rPr>
                   <w:rStyle w:val="Hyperlink"/>
@@ -4201,7 +4201,7 @@
             <w:pPr>
               <w:spacing w:after="40" w:before="0"/>
             </w:pPr>
-            <w:hyperlink w:history="1" r:id="rId9_qstxg35dxc5dniua5np">
+            <w:hyperlink w:history="1" r:id="rIdfsqhkgfh8brstog-7elbw">
               <w:r>
                 <w:rPr>
                   <w:rStyle w:val="Hyperlink"/>
@@ -4301,7 +4301,7 @@
             <w:pPr>
               <w:spacing w:after="40" w:before="0"/>
             </w:pPr>
-            <w:hyperlink w:history="1" r:id="rIdd0d7tf8mtrsaqu2in2r02">
+            <w:hyperlink w:history="1" r:id="rIdr4rp3lhbczpbnepd_2hfs">
               <w:r>
                 <w:rPr>
                   <w:rStyle w:val="Hyperlink"/>
@@ -4404,7 +4404,7 @@
             <w:pPr>
               <w:spacing w:after="40" w:before="0"/>
             </w:pPr>
-            <w:hyperlink w:history="1" r:id="rId28xkdpzo2pxxzx6t7ctt9">
+            <w:hyperlink w:history="1" r:id="rIdh0qb1ysi8xpvgtjvo9ysy">
               <w:r>
                 <w:rPr>
                   <w:rStyle w:val="Hyperlink"/>
@@ -4688,7 +4688,7 @@
             <w:pPr>
               <w:spacing w:after="40" w:before="0"/>
             </w:pPr>
-            <w:hyperlink w:history="1" r:id="rIdrxcej3pzi7k_fh3xxvqpp">
+            <w:hyperlink w:history="1" r:id="rIdpnyvogsxbokicmd6ofz5x">
               <w:r>
                 <w:rPr>
                   <w:rStyle w:val="Hyperlink"/>
@@ -4832,7 +4832,7 @@
             <w:pPr>
               <w:spacing w:after="40" w:before="0"/>
             </w:pPr>
-            <w:hyperlink w:history="1" r:id="rIdldzkzmyzjvqacqrjebpks">
+            <w:hyperlink w:history="1" r:id="rIdxk2n0enkrvrpqjpyizntw">
               <w:r>
                 <w:rPr>
                   <w:rStyle w:val="Hyperlink"/>
@@ -4976,7 +4976,7 @@
             <w:pPr>
               <w:spacing w:after="40" w:before="0"/>
             </w:pPr>
-            <w:hyperlink w:history="1" r:id="rIdhccwucuyuojyn7z2e2m-u">
+            <w:hyperlink w:history="1" r:id="rIdlphngleekn8z5hfzkjaud">
               <w:r>
                 <w:rPr>
                   <w:rStyle w:val="Hyperlink"/>
@@ -5118,7 +5118,7 @@
             <w:pPr>
               <w:spacing w:after="40" w:before="0"/>
             </w:pPr>
-            <w:hyperlink w:history="1" r:id="rId-al9ztc1m78dbc8ap3_58">
+            <w:hyperlink w:history="1" r:id="rId9oxrtjbv7tgydzncgljbm">
               <w:r>
                 <w:rPr>
                   <w:rStyle w:val="Hyperlink"/>
@@ -5262,7 +5262,7 @@
             <w:pPr>
               <w:spacing w:after="40" w:before="0"/>
             </w:pPr>
-            <w:hyperlink w:history="1" r:id="rIdqlv2got0dzfyiydulptib">
+            <w:hyperlink w:history="1" r:id="rIdtn4tsxnqakdjj-quxyk3q">
               <w:r>
                 <w:rPr>
                   <w:rStyle w:val="Hyperlink"/>
@@ -5404,7 +5404,7 @@
             <w:pPr>
               <w:spacing w:after="40" w:before="0"/>
             </w:pPr>
-            <w:hyperlink w:history="1" r:id="rIdfuodg5n-ftpa7cozfmqit">
+            <w:hyperlink w:history="1" r:id="rIdoqnjc2rg9hurn_2izxn-m">
               <w:r>
                 <w:rPr>
                   <w:rStyle w:val="Hyperlink"/>
@@ -5591,7 +5591,7 @@
               </w:rPr>
               <w:t xml:space="preserve">Default to </w:t>
             </w:r>
-            <w:hyperlink w:history="1" r:id="rIdmeg8bsbm62jtknx9lj07g">
+            <w:hyperlink w:history="1" r:id="rIdujncgk1pdpnajwerx_ijf">
               <w:r>
                 <w:rPr>
                   <w:rStyle w:val="Hyperlink"/>
@@ -5657,7 +5657,7 @@
         </w:rPr>
         <w:t xml:space="preserve">•  Pre-Lunch bridge (11:55 AM): </w:t>
       </w:r>
-      <w:hyperlink w:history="1" r:id="rIdoii9z1ajebtzjskqfpa0y">
+      <w:hyperlink w:history="1" r:id="rIdrib1wwnosz_vfgavawsqj">
         <w:r>
           <w:rPr>
             <w:rStyle w:val="Hyperlink"/>
@@ -5693,7 +5693,7 @@
         </w:rPr>
         <w:t xml:space="preserve">•  Post-Lunch return (1:00 PM): </w:t>
       </w:r>
-      <w:hyperlink w:history="1" r:id="rIdqbcx6fms9_uldikf877vl">
+      <w:hyperlink w:history="1" r:id="rId6jdd2kqn6ben0sjpy8fco">
         <w:r>
           <w:rPr>
             <w:rStyle w:val="Hyperlink"/>
@@ -5714,7 +5714,7 @@
         </w:rPr>
         <w:t xml:space="preserve"> by Dolly Parton, then resume </w:t>
       </w:r>
-      <w:hyperlink w:history="1" r:id="rIdparcns8rhgrkrz5fhal-9">
+      <w:hyperlink w:history="1" r:id="rIdzxcxdx2v47xrugxh1fued">
         <w:r>
           <w:rPr>
             <w:rStyle w:val="Hyperlink"/>
@@ -5999,7 +5999,7 @@
         </w:rPr>
         <w:t xml:space="preserve"> (deck / files / AV lead) · </w:t>
       </w:r>
-      <w:hyperlink w:history="1" r:id="rIdpxcbl1rr5vy0fayoerozo">
+      <w:hyperlink w:history="1" r:id="rIdfiosgdcezjbnt5yrcoisf">
         <w:r>
           <w:rPr>
             <w:rStyle w:val="Hyperlink"/>
@@ -6018,7 +6018,7 @@
         </w:rPr>
         <w:t xml:space="preserve"> · </w:t>
       </w:r>
-      <w:hyperlink w:history="1" r:id="rId6aprbxmi5kz4du6hjov2j">
+      <w:hyperlink w:history="1" r:id="rIdpdugnno_z3ehm6jpo5uqw">
         <w:r>
           <w:rPr>
             <w:rStyle w:val="Hyperlink"/>
@@ -6027,6 +6027,112 @@
             <w:szCs w:val="18"/>
           </w:rPr>
           <w:t xml:space="preserve">ray.myers@eosworldwide.com</w:t>
+        </w:r>
+      </w:hyperlink>
+    </w:p>
+    <w:p>
+      <w:pPr>
+        <w:spacing w:after="30" w:before="0"/>
+      </w:pPr>
+      <w:r>
+        <w:rPr>
+          <w:rFonts w:ascii="Calibri" w:cs="Calibri" w:eastAsia="Calibri" w:hAnsi="Calibri"/>
+          <w:b/>
+          <w:bCs/>
+          <w:sz w:val="18"/>
+          <w:szCs w:val="18"/>
+        </w:rPr>
+        <w:t xml:space="preserve">•  Erin Thiem</w:t>
+      </w:r>
+      <w:r>
+        <w:rPr>
+          <w:rFonts w:ascii="Calibri" w:cs="Calibri" w:eastAsia="Calibri" w:hAnsi="Calibri"/>
+          <w:sz w:val="18"/>
+          <w:szCs w:val="18"/>
+        </w:rPr>
+        <w:t xml:space="preserve"> (Day-of Show Operations (event lead, run of show)) · </w:t>
+      </w:r>
+      <w:hyperlink w:history="1" r:id="rIdcith7mzlqnekfzzswocm5">
+        <w:r>
+          <w:rPr>
+            <w:rStyle w:val="Hyperlink"/>
+            <w:rFonts w:ascii="Calibri" w:cs="Calibri" w:eastAsia="Calibri" w:hAnsi="Calibri"/>
+            <w:sz w:val="18"/>
+            <w:szCs w:val="18"/>
+          </w:rPr>
+          <w:t xml:space="preserve">979-575-4585</w:t>
+        </w:r>
+      </w:hyperlink>
+      <w:r>
+        <w:rPr>
+          <w:rFonts w:ascii="Calibri" w:cs="Calibri" w:eastAsia="Calibri" w:hAnsi="Calibri"/>
+          <w:sz w:val="18"/>
+          <w:szCs w:val="18"/>
+        </w:rPr>
+        <w:t xml:space="preserve"> · </w:t>
+      </w:r>
+      <w:hyperlink w:history="1" r:id="rId74ovezvnz-tnq3xejjf83">
+        <w:r>
+          <w:rPr>
+            <w:rStyle w:val="Hyperlink"/>
+            <w:rFonts w:ascii="Calibri" w:cs="Calibri" w:eastAsia="Calibri" w:hAnsi="Calibri"/>
+            <w:sz w:val="18"/>
+            <w:szCs w:val="18"/>
+          </w:rPr>
+          <w:t xml:space="preserve">erin.thiem@eosworldwide.com</w:t>
+        </w:r>
+      </w:hyperlink>
+    </w:p>
+    <w:p>
+      <w:pPr>
+        <w:spacing w:after="30" w:before="0"/>
+      </w:pPr>
+      <w:r>
+        <w:rPr>
+          <w:rFonts w:ascii="Calibri" w:cs="Calibri" w:eastAsia="Calibri" w:hAnsi="Calibri"/>
+          <w:b/>
+          <w:bCs/>
+          <w:sz w:val="18"/>
+          <w:szCs w:val="18"/>
+        </w:rPr>
+        <w:t xml:space="preserve">•  Shane Spillers</w:t>
+      </w:r>
+      <w:r>
+        <w:rPr>
+          <w:rFonts w:ascii="Calibri" w:cs="Calibri" w:eastAsia="Calibri" w:hAnsi="Calibri"/>
+          <w:sz w:val="18"/>
+          <w:szCs w:val="18"/>
+        </w:rPr>
+        <w:t xml:space="preserve"> (Venue Liaison (knows the Statler)) · </w:t>
+      </w:r>
+      <w:hyperlink w:history="1" r:id="rIdmbwsp86bngouzwp73sncv">
+        <w:r>
+          <w:rPr>
+            <w:rStyle w:val="Hyperlink"/>
+            <w:rFonts w:ascii="Calibri" w:cs="Calibri" w:eastAsia="Calibri" w:hAnsi="Calibri"/>
+            <w:sz w:val="18"/>
+            <w:szCs w:val="18"/>
+          </w:rPr>
+          <w:t xml:space="preserve">214-519-9599</w:t>
+        </w:r>
+      </w:hyperlink>
+      <w:r>
+        <w:rPr>
+          <w:rFonts w:ascii="Calibri" w:cs="Calibri" w:eastAsia="Calibri" w:hAnsi="Calibri"/>
+          <w:sz w:val="18"/>
+          <w:szCs w:val="18"/>
+        </w:rPr>
+        <w:t xml:space="preserve"> · </w:t>
+      </w:r>
+      <w:hyperlink w:history="1" r:id="rIdrzdpqtm2hudp089_tuloc">
+        <w:r>
+          <w:rPr>
+            <w:rStyle w:val="Hyperlink"/>
+            <w:rFonts w:ascii="Calibri" w:cs="Calibri" w:eastAsia="Calibri" w:hAnsi="Calibri"/>
+            <w:sz w:val="18"/>
+            <w:szCs w:val="18"/>
+          </w:rPr>
+          <w:t xml:space="preserve">shane.spillers@eosworldwide.com</w:t>
         </w:r>
       </w:hyperlink>
     </w:p>
@@ -6052,7 +6158,7 @@
         </w:rPr>
         <w:t xml:space="preserve"> (Encore / Statler AV contact) · </w:t>
       </w:r>
-      <w:hyperlink w:history="1" r:id="rIdws3kkgpdswxhq20hgwtez">
+      <w:hyperlink w:history="1" r:id="rIdus3r8ljzbgfjx2revqewd">
         <w:r>
           <w:rPr>
             <w:rStyle w:val="Hyperlink"/>
@@ -6071,7 +6177,7 @@
         </w:rPr>
         <w:t xml:space="preserve"> · </w:t>
       </w:r>
-      <w:hyperlink w:history="1" r:id="rIdciz5owp_djmyuejt1nphg">
+      <w:hyperlink w:history="1" r:id="rIdhppvopi_axvssxdv29zgd">
         <w:r>
           <w:rPr>
             <w:rStyle w:val="Hyperlink"/>
@@ -6103,9 +6209,9 @@
           <w:sz w:val="18"/>
           <w:szCs w:val="18"/>
         </w:rPr>
-        <w:t xml:space="preserve"> (emcee) · </w:t>
+        <w:t xml:space="preserve"> (MC (emcee)) · </w:t>
       </w:r>
-      <w:hyperlink w:history="1" r:id="rId2hhswscxnrdseprooswob">
+      <w:hyperlink w:history="1" r:id="rId0gjk8wzo8zxkhyym5udbm">
         <w:r>
           <w:rPr>
             <w:rStyle w:val="Hyperlink"/>
@@ -6137,9 +6243,9 @@
           <w:sz w:val="18"/>
           <w:szCs w:val="18"/>
         </w:rPr>
-        <w:t xml:space="preserve"> (stage-side coordinator (eyes on stage all day, supports emcee Max)) · </w:t>
+        <w:t xml:space="preserve"> (stage-side coordinator (eyes on stage all day, supports MC Max)) · </w:t>
       </w:r>
-      <w:hyperlink w:history="1" r:id="rIdlxwl7vechupk9i8y7ob0x">
+      <w:hyperlink w:history="1" r:id="rIdsr8k5jh43enbkuygeguni">
         <w:r>
           <w:rPr>
             <w:rStyle w:val="Hyperlink"/>
@@ -6219,7 +6325,7 @@
       </w:rPr>
       <w:t xml:space="preserve">Timer page: </w:t>
     </w:r>
-    <w:hyperlink w:history="1" r:id="rIdhpqivsql6fkyh2uqpggkc">
+    <w:hyperlink w:history="1" r:id="rIdlngylibv0zvk5jech46wd">
       <w:r>
         <w:rPr>
           <w:rStyle w:val="Hyperlink"/>

</xml_diff>

<commit_message>
AV timeline: Ann's deck is in speaker-decks/, no USB
Ann Sheu's deck is committed to the repo and mirrored in Drive
(Ann_Sheu_Get_A_Grip.pptx). Timeline row and README updated to
reflect that instead of the old 'she brings USB' note.
</commit_message>
<xml_diff>
--- a/deliverables/av-package/AV-Timeline.docx
+++ b/deliverables/av-package/AV-Timeline.docx
@@ -102,7 +102,7 @@
             <w:pPr>
               <w:spacing w:after="40" w:before="0"/>
             </w:pPr>
-            <w:hyperlink w:history="1" r:id="rIdp46na4zwzv_xkc2zwuikd">
+            <w:hyperlink w:history="1" r:id="rIdlu3uf4gmh-jskd1qxbsht">
               <w:r>
                 <w:rPr>
                   <w:rStyle w:val="Hyperlink"/>
@@ -180,7 +180,7 @@
             <w:pPr>
               <w:spacing w:after="40" w:before="0"/>
             </w:pPr>
-            <w:hyperlink w:history="1" r:id="rIddretxztmq0uhmi5crdf33">
+            <w:hyperlink w:history="1" r:id="rIdw-ajfqua_46boxb6cuzkz">
               <w:r>
                 <w:rPr>
                   <w:rStyle w:val="Hyperlink"/>
@@ -199,7 +199,7 @@
               </w:rPr>
               <w:t xml:space="preserve"> · </w:t>
             </w:r>
-            <w:hyperlink w:history="1" r:id="rIdd5cmac5izthmyaj1kgr25">
+            <w:hyperlink w:history="1" r:id="rIdz17pezuzcva4enta9uqdi">
               <w:r>
                 <w:rPr>
                   <w:rStyle w:val="Hyperlink"/>
@@ -218,7 +218,7 @@
               </w:rPr>
               <w:t xml:space="preserve"> · </w:t>
             </w:r>
-            <w:hyperlink w:history="1" r:id="rId9dwjv3muavrv7gmqbeewv">
+            <w:hyperlink w:history="1" r:id="rIduqhmiy2yowc16ljuv4zui">
               <w:r>
                 <w:rPr>
                   <w:rStyle w:val="Hyperlink"/>
@@ -237,7 +237,7 @@
               </w:rPr>
               <w:t xml:space="preserve"> · </w:t>
             </w:r>
-            <w:hyperlink w:history="1" r:id="rIdcobijmcgc9zrv3so8wjfn">
+            <w:hyperlink w:history="1" r:id="rIdtalzn2vnkw9lqlcbdx4wm">
               <w:r>
                 <w:rPr>
                   <w:rStyle w:val="Hyperlink"/>
@@ -867,7 +867,7 @@
             <w:pPr>
               <w:spacing w:after="40" w:before="0"/>
             </w:pPr>
-            <w:hyperlink w:history="1" r:id="rId5uvvs6zxaedfpuuwk5p07">
+            <w:hyperlink w:history="1" r:id="rIdt-ir408ld-libszhtutif">
               <w:r>
                 <w:rPr>
                   <w:rStyle w:val="Hyperlink"/>
@@ -909,7 +909,7 @@
               </w:rPr>
               <w:t xml:space="preserve">Open </w:t>
             </w:r>
-            <w:hyperlink w:history="1" r:id="rIdpzf7qmobvi11qolx-dfoc">
+            <w:hyperlink w:history="1" r:id="rIdan_qk0h7jyghwa7gidmiu">
               <w:r>
                 <w:rPr>
                   <w:rStyle w:val="Hyperlink"/>
@@ -1040,7 +1040,7 @@
                 <w:sz w:val="18"/>
                 <w:szCs w:val="18"/>
               </w:rPr>
-              <w:t xml:space="preserve">Ann Sheu's deck (she brings USB)</w:t>
+              <w:t xml:space="preserve">Ann's deck (in speaker-decks/)</w:t>
             </w:r>
           </w:p>
         </w:tc>
@@ -1076,7 +1076,7 @@
               </w:rPr>
               <w:t xml:space="preserve">Walk-on: </w:t>
             </w:r>
-            <w:hyperlink w:history="1" r:id="rIdiyslszuvtepe4pnfm6c95">
+            <w:hyperlink w:history="1" r:id="rIdrsyej5cutccqflqd5z5kn">
               <w:r>
                 <w:rPr>
                   <w:rStyle w:val="Hyperlink"/>
@@ -1137,7 +1137,7 @@
                 <w:sz w:val="18"/>
                 <w:szCs w:val="18"/>
               </w:rPr>
-              <w:t xml:space="preserve">Fade playlist. Play Ann's walk-on song. Load her deck when she takes the stage.</w:t>
+              <w:t xml:space="preserve">Fade playlist. Play Ann's walk-on song. Load Ann_Sheu_Get_A_Grip.pptx when she takes the stage.</w:t>
             </w:r>
           </w:p>
         </w:tc>
@@ -1257,7 +1257,7 @@
             <w:pPr>
               <w:spacing w:after="40" w:before="0"/>
             </w:pPr>
-            <w:hyperlink w:history="1" r:id="rIdmb39004cr6fl4ub8igyf5">
+            <w:hyperlink w:history="1" r:id="rIdxziczjstixfs7tlyknh3s">
               <w:r>
                 <w:rPr>
                   <w:rStyle w:val="Hyperlink"/>
@@ -1299,7 +1299,7 @@
               </w:rPr>
               <w:t xml:space="preserve">One-click: </w:t>
             </w:r>
-            <w:hyperlink w:history="1" r:id="rIdct5lcrcc7oda9mbisjgil">
+            <w:hyperlink w:history="1" r:id="rId_phevklygly7uacnchdn6">
               <w:r>
                 <w:rPr>
                   <w:rStyle w:val="Hyperlink"/>
@@ -1466,7 +1466,7 @@
               </w:rPr>
               <w:t xml:space="preserve">Walk-on: </w:t>
             </w:r>
-            <w:hyperlink w:history="1" r:id="rIdcniixuzlrkoomacq2zssm">
+            <w:hyperlink w:history="1" r:id="rIdivcgqt-zp_4piixgvljun">
               <w:r>
                 <w:rPr>
                   <w:rStyle w:val="Hyperlink"/>
@@ -1637,7 +1637,7 @@
             <w:pPr>
               <w:spacing w:after="40" w:before="0"/>
             </w:pPr>
-            <w:hyperlink w:history="1" r:id="rIdhwj3x4dfosehoeh3veaww">
+            <w:hyperlink w:history="1" r:id="rIdqtu0weluljvout1eqxwx3">
               <w:r>
                 <w:rPr>
                   <w:rStyle w:val="Hyperlink"/>
@@ -1679,7 +1679,7 @@
               </w:rPr>
               <w:t xml:space="preserve">One-click: </w:t>
             </w:r>
-            <w:hyperlink w:history="1" r:id="rIdg8szdnknnhv0py9uut2mf">
+            <w:hyperlink w:history="1" r:id="rId9awd7zup-byk98xkqauiv">
               <w:r>
                 <w:rPr>
                   <w:rStyle w:val="Hyperlink"/>
@@ -1846,7 +1846,7 @@
               </w:rPr>
               <w:t xml:space="preserve">Walk-on: </w:t>
             </w:r>
-            <w:hyperlink w:history="1" r:id="rId0_jrjnvasc84jlqz94uoc">
+            <w:hyperlink w:history="1" r:id="rIdgwbtbsa3o64r89wvovndl">
               <w:r>
                 <w:rPr>
                   <w:rStyle w:val="Hyperlink"/>
@@ -2027,7 +2027,7 @@
               </w:rPr>
               <w:t xml:space="preserve">Pre-Lunch: </w:t>
             </w:r>
-            <w:hyperlink w:history="1" r:id="rId6c9t_eq5p3pbqiafos5un">
+            <w:hyperlink w:history="1" r:id="rIdwx21gk8ghval0stipxtfz">
               <w:r>
                 <w:rPr>
                   <w:rStyle w:val="Hyperlink"/>
@@ -2261,7 +2261,7 @@
               </w:rPr>
               <w:t xml:space="preserve">Walk-on: </w:t>
             </w:r>
-            <w:hyperlink w:history="1" r:id="rIde8qho66pmbl2oimof_owf">
+            <w:hyperlink w:history="1" r:id="rIdxvqklwryv4y-3k1bb0guu">
               <w:r>
                 <w:rPr>
                   <w:rStyle w:val="Hyperlink"/>
@@ -2414,7 +2414,7 @@
             <w:pPr>
               <w:spacing w:after="40" w:before="0"/>
             </w:pPr>
-            <w:hyperlink w:history="1" r:id="rIdxtq5tfz-ushqzear58ltq">
+            <w:hyperlink w:history="1" r:id="rIdabmwhtqftbhnvcrcqgyz2">
               <w:r>
                 <w:rPr>
                   <w:rStyle w:val="Hyperlink"/>
@@ -2458,7 +2458,7 @@
               </w:rPr>
               <w:t xml:space="preserve">Post-Lunch: </w:t>
             </w:r>
-            <w:hyperlink w:history="1" r:id="rId042djhv_upqax8umdqvdo">
+            <w:hyperlink w:history="1" r:id="rIdulcixrfgccrsqkams3lu4">
               <w:r>
                 <w:rPr>
                   <w:rStyle w:val="Hyperlink"/>
@@ -2479,7 +2479,7 @@
               </w:rPr>
               <w:t xml:space="preserve"> — Dolly Parton, then </w:t>
             </w:r>
-            <w:hyperlink w:history="1" r:id="rIds2m4gc13anakbwmzjdbfy">
+            <w:hyperlink w:history="1" r:id="rIdv4xqmbwj-yel8xoa1td-a">
               <w:r>
                 <w:rPr>
                   <w:rStyle w:val="Hyperlink"/>
@@ -2703,7 +2703,7 @@
               </w:rPr>
               <w:t xml:space="preserve">Walk-on: </w:t>
             </w:r>
-            <w:hyperlink w:history="1" r:id="rIdsq6emgtkq3m-9-fz2phbb">
+            <w:hyperlink w:history="1" r:id="rId9pw70je8hbmcnfmnx44dv">
               <w:r>
                 <w:rPr>
                   <w:rStyle w:val="Hyperlink"/>
@@ -2928,7 +2928,7 @@
             <w:pPr>
               <w:spacing w:after="40" w:before="0"/>
             </w:pPr>
-            <w:hyperlink w:history="1" r:id="rId7q6ap3m0yuj4cnjxqttjs">
+            <w:hyperlink w:history="1" r:id="rIdpw4adp3wmtnt7ejr7tejc">
               <w:r>
                 <w:rPr>
                   <w:rStyle w:val="Hyperlink"/>
@@ -2970,7 +2970,7 @@
               </w:rPr>
               <w:t xml:space="preserve">One-click: </w:t>
             </w:r>
-            <w:hyperlink w:history="1" r:id="rIdc8wbyt1aexxazql7vtwaa">
+            <w:hyperlink w:history="1" r:id="rIdyrunatnqg80fjn-8zark6">
               <w:r>
                 <w:rPr>
                   <w:rStyle w:val="Hyperlink"/>
@@ -3155,7 +3155,7 @@
               </w:rPr>
               <w:t xml:space="preserve">Walk-on: </w:t>
             </w:r>
-            <w:hyperlink w:history="1" r:id="rIdespj39dw3xx9-dtr4mbxf">
+            <w:hyperlink w:history="1" r:id="rIdwakjqablofbjtbd34wx4i">
               <w:r>
                 <w:rPr>
                   <w:rStyle w:val="Hyperlink"/>
@@ -3326,7 +3326,7 @@
             <w:pPr>
               <w:spacing w:after="40" w:before="0"/>
             </w:pPr>
-            <w:hyperlink w:history="1" r:id="rIdqhitrnlu1ltvop5bka09d">
+            <w:hyperlink w:history="1" r:id="rIddss3f1j6rnp3hlw5a-x8d">
               <w:r>
                 <w:rPr>
                   <w:rStyle w:val="Hyperlink"/>
@@ -3368,7 +3368,7 @@
               </w:rPr>
               <w:t xml:space="preserve">One-click: </w:t>
             </w:r>
-            <w:hyperlink w:history="1" r:id="rIdqixdh1-k6ppncuuskxtm6">
+            <w:hyperlink w:history="1" r:id="rId9blozco4xyx_conefsm1y">
               <w:r>
                 <w:rPr>
                   <w:rStyle w:val="Hyperlink"/>
@@ -4098,7 +4098,7 @@
             <w:pPr>
               <w:spacing w:after="40" w:before="0"/>
             </w:pPr>
-            <w:hyperlink w:history="1" r:id="rIdyeqyabqkjx1u8_-ssymhm">
+            <w:hyperlink w:history="1" r:id="rIdezc6-i2ufvksgtek0ilqz">
               <w:r>
                 <w:rPr>
                   <w:rStyle w:val="Hyperlink"/>
@@ -4201,7 +4201,7 @@
             <w:pPr>
               <w:spacing w:after="40" w:before="0"/>
             </w:pPr>
-            <w:hyperlink w:history="1" r:id="rIdfsqhkgfh8brstog-7elbw">
+            <w:hyperlink w:history="1" r:id="rIdlzya8d7ovofazuv-8hezo">
               <w:r>
                 <w:rPr>
                   <w:rStyle w:val="Hyperlink"/>
@@ -4301,7 +4301,7 @@
             <w:pPr>
               <w:spacing w:after="40" w:before="0"/>
             </w:pPr>
-            <w:hyperlink w:history="1" r:id="rIdr4rp3lhbczpbnepd_2hfs">
+            <w:hyperlink w:history="1" r:id="rIda0lpjyakphpb22nljcygd">
               <w:r>
                 <w:rPr>
                   <w:rStyle w:val="Hyperlink"/>
@@ -4404,7 +4404,7 @@
             <w:pPr>
               <w:spacing w:after="40" w:before="0"/>
             </w:pPr>
-            <w:hyperlink w:history="1" r:id="rIdh0qb1ysi8xpvgtjvo9ysy">
+            <w:hyperlink w:history="1" r:id="rIdgvtqfr74ogoe8etdeyzg5">
               <w:r>
                 <w:rPr>
                   <w:rStyle w:val="Hyperlink"/>
@@ -4688,7 +4688,7 @@
             <w:pPr>
               <w:spacing w:after="40" w:before="0"/>
             </w:pPr>
-            <w:hyperlink w:history="1" r:id="rIdpnyvogsxbokicmd6ofz5x">
+            <w:hyperlink w:history="1" r:id="rId3dc_sblttpbyfliwy0vbz">
               <w:r>
                 <w:rPr>
                   <w:rStyle w:val="Hyperlink"/>
@@ -4832,7 +4832,7 @@
             <w:pPr>
               <w:spacing w:after="40" w:before="0"/>
             </w:pPr>
-            <w:hyperlink w:history="1" r:id="rIdxk2n0enkrvrpqjpyizntw">
+            <w:hyperlink w:history="1" r:id="rIdfwoo6l5yrauqijgizvjff">
               <w:r>
                 <w:rPr>
                   <w:rStyle w:val="Hyperlink"/>
@@ -4976,7 +4976,7 @@
             <w:pPr>
               <w:spacing w:after="40" w:before="0"/>
             </w:pPr>
-            <w:hyperlink w:history="1" r:id="rIdlphngleekn8z5hfzkjaud">
+            <w:hyperlink w:history="1" r:id="rIdcodmogq2_6szjvf-x9g00">
               <w:r>
                 <w:rPr>
                   <w:rStyle w:val="Hyperlink"/>
@@ -5118,7 +5118,7 @@
             <w:pPr>
               <w:spacing w:after="40" w:before="0"/>
             </w:pPr>
-            <w:hyperlink w:history="1" r:id="rId9oxrtjbv7tgydzncgljbm">
+            <w:hyperlink w:history="1" r:id="rIdmsb7sqqagmjysl6anegla">
               <w:r>
                 <w:rPr>
                   <w:rStyle w:val="Hyperlink"/>
@@ -5262,7 +5262,7 @@
             <w:pPr>
               <w:spacing w:after="40" w:before="0"/>
             </w:pPr>
-            <w:hyperlink w:history="1" r:id="rIdtn4tsxnqakdjj-quxyk3q">
+            <w:hyperlink w:history="1" r:id="rId7tjdpt1i-oulonmw9pj_y">
               <w:r>
                 <w:rPr>
                   <w:rStyle w:val="Hyperlink"/>
@@ -5404,7 +5404,7 @@
             <w:pPr>
               <w:spacing w:after="40" w:before="0"/>
             </w:pPr>
-            <w:hyperlink w:history="1" r:id="rIdoqnjc2rg9hurn_2izxn-m">
+            <w:hyperlink w:history="1" r:id="rIdbiyzr_rkwzvpbiigdjt6b">
               <w:r>
                 <w:rPr>
                   <w:rStyle w:val="Hyperlink"/>
@@ -5591,7 +5591,7 @@
               </w:rPr>
               <w:t xml:space="preserve">Default to </w:t>
             </w:r>
-            <w:hyperlink w:history="1" r:id="rIdujncgk1pdpnajwerx_ijf">
+            <w:hyperlink w:history="1" r:id="rIdhbgb46pvpqrjpz4d2vz8s">
               <w:r>
                 <w:rPr>
                   <w:rStyle w:val="Hyperlink"/>
@@ -5657,7 +5657,7 @@
         </w:rPr>
         <w:t xml:space="preserve">•  Pre-Lunch bridge (11:55 AM): </w:t>
       </w:r>
-      <w:hyperlink w:history="1" r:id="rIdrib1wwnosz_vfgavawsqj">
+      <w:hyperlink w:history="1" r:id="rIdcm-opoddyjwovzx9psb03">
         <w:r>
           <w:rPr>
             <w:rStyle w:val="Hyperlink"/>
@@ -5693,7 +5693,7 @@
         </w:rPr>
         <w:t xml:space="preserve">•  Post-Lunch return (1:00 PM): </w:t>
       </w:r>
-      <w:hyperlink w:history="1" r:id="rId6jdd2kqn6ben0sjpy8fco">
+      <w:hyperlink w:history="1" r:id="rIdizxprpaakkn8fkaeq4ftw">
         <w:r>
           <w:rPr>
             <w:rStyle w:val="Hyperlink"/>
@@ -5714,7 +5714,7 @@
         </w:rPr>
         <w:t xml:space="preserve"> by Dolly Parton, then resume </w:t>
       </w:r>
-      <w:hyperlink w:history="1" r:id="rIdzxcxdx2v47xrugxh1fued">
+      <w:hyperlink w:history="1" r:id="rId-0t7vrw6xiajo0rxh9vnc">
         <w:r>
           <w:rPr>
             <w:rStyle w:val="Hyperlink"/>
@@ -5999,7 +5999,7 @@
         </w:rPr>
         <w:t xml:space="preserve"> (deck / files / AV lead) · </w:t>
       </w:r>
-      <w:hyperlink w:history="1" r:id="rIdfiosgdcezjbnt5yrcoisf">
+      <w:hyperlink w:history="1" r:id="rIdu6mdsftmumagse9m4i_no">
         <w:r>
           <w:rPr>
             <w:rStyle w:val="Hyperlink"/>
@@ -6018,7 +6018,7 @@
         </w:rPr>
         <w:t xml:space="preserve"> · </w:t>
       </w:r>
-      <w:hyperlink w:history="1" r:id="rIdpdugnno_z3ehm6jpo5uqw">
+      <w:hyperlink w:history="1" r:id="rIdlaitanm0ch86fqtavgakr">
         <w:r>
           <w:rPr>
             <w:rStyle w:val="Hyperlink"/>
@@ -6052,7 +6052,7 @@
         </w:rPr>
         <w:t xml:space="preserve"> (Day-of Show Operations (event lead, run of show)) · </w:t>
       </w:r>
-      <w:hyperlink w:history="1" r:id="rIdcith7mzlqnekfzzswocm5">
+      <w:hyperlink w:history="1" r:id="rId8znpr9etcxl4cdgravmh4">
         <w:r>
           <w:rPr>
             <w:rStyle w:val="Hyperlink"/>
@@ -6071,7 +6071,7 @@
         </w:rPr>
         <w:t xml:space="preserve"> · </w:t>
       </w:r>
-      <w:hyperlink w:history="1" r:id="rId74ovezvnz-tnq3xejjf83">
+      <w:hyperlink w:history="1" r:id="rIdpe7irfxkxjkbbq1vlfk2l">
         <w:r>
           <w:rPr>
             <w:rStyle w:val="Hyperlink"/>
@@ -6105,7 +6105,7 @@
         </w:rPr>
         <w:t xml:space="preserve"> (Venue Liaison (knows the Statler)) · </w:t>
       </w:r>
-      <w:hyperlink w:history="1" r:id="rIdmbwsp86bngouzwp73sncv">
+      <w:hyperlink w:history="1" r:id="rIdwevn-sjlrcxw2aliqivrr">
         <w:r>
           <w:rPr>
             <w:rStyle w:val="Hyperlink"/>
@@ -6124,7 +6124,7 @@
         </w:rPr>
         <w:t xml:space="preserve"> · </w:t>
       </w:r>
-      <w:hyperlink w:history="1" r:id="rIdrzdpqtm2hudp089_tuloc">
+      <w:hyperlink w:history="1" r:id="rIddirhnbgyd9dp6vvlp75mu">
         <w:r>
           <w:rPr>
             <w:rStyle w:val="Hyperlink"/>
@@ -6158,7 +6158,7 @@
         </w:rPr>
         <w:t xml:space="preserve"> (Encore / Statler AV contact) · </w:t>
       </w:r>
-      <w:hyperlink w:history="1" r:id="rIdus3r8ljzbgfjx2revqewd">
+      <w:hyperlink w:history="1" r:id="rIdnpqambkh868brb0srtset">
         <w:r>
           <w:rPr>
             <w:rStyle w:val="Hyperlink"/>
@@ -6177,7 +6177,7 @@
         </w:rPr>
         <w:t xml:space="preserve"> · </w:t>
       </w:r>
-      <w:hyperlink w:history="1" r:id="rIdhppvopi_axvssxdv29zgd">
+      <w:hyperlink w:history="1" r:id="rIdscioezi1owhe37-h2qmqy">
         <w:r>
           <w:rPr>
             <w:rStyle w:val="Hyperlink"/>
@@ -6211,7 +6211,7 @@
         </w:rPr>
         <w:t xml:space="preserve"> (MC (emcee)) · </w:t>
       </w:r>
-      <w:hyperlink w:history="1" r:id="rId0gjk8wzo8zxkhyym5udbm">
+      <w:hyperlink w:history="1" r:id="rIdtb-wg4scj30tugte9gd08">
         <w:r>
           <w:rPr>
             <w:rStyle w:val="Hyperlink"/>
@@ -6245,7 +6245,7 @@
         </w:rPr>
         <w:t xml:space="preserve"> (stage-side coordinator (eyes on stage all day, supports MC Max)) · </w:t>
       </w:r>
-      <w:hyperlink w:history="1" r:id="rIdsr8k5jh43enbkuygeguni">
+      <w:hyperlink w:history="1" r:id="rIdzaxxq_dtzmggyzslyopnf">
         <w:r>
           <w:rPr>
             <w:rStyle w:val="Hyperlink"/>
@@ -6325,7 +6325,7 @@
       </w:rPr>
       <w:t xml:space="preserve">Timer page: </w:t>
     </w:r>
-    <w:hyperlink w:history="1" r:id="rIdlngylibv0zvk5jech46wd">
+    <w:hyperlink w:history="1" r:id="rIdhrh4ooxg2cgac8cyl0hfn">
       <w:r>
         <w:rPr>
           <w:rStyle w:val="Hyperlink"/>

</xml_diff>

<commit_message>
AV timeline: minimal footer, just page X of Y
</commit_message>
<xml_diff>
--- a/deliverables/av-package/AV-Timeline.docx
+++ b/deliverables/av-package/AV-Timeline.docx
@@ -102,7 +102,7 @@
             <w:pPr>
               <w:spacing w:after="40" w:before="0"/>
             </w:pPr>
-            <w:hyperlink w:history="1" r:id="rIdlu3uf4gmh-jskd1qxbsht">
+            <w:hyperlink w:history="1" r:id="rIdd9lvnchawafovude7qhgm">
               <w:r>
                 <w:rPr>
                   <w:rStyle w:val="Hyperlink"/>
@@ -180,7 +180,7 @@
             <w:pPr>
               <w:spacing w:after="40" w:before="0"/>
             </w:pPr>
-            <w:hyperlink w:history="1" r:id="rIdw-ajfqua_46boxb6cuzkz">
+            <w:hyperlink w:history="1" r:id="rId6ws2m04r5mf4qauyp4jmu">
               <w:r>
                 <w:rPr>
                   <w:rStyle w:val="Hyperlink"/>
@@ -199,7 +199,7 @@
               </w:rPr>
               <w:t xml:space="preserve"> · </w:t>
             </w:r>
-            <w:hyperlink w:history="1" r:id="rIdz17pezuzcva4enta9uqdi">
+            <w:hyperlink w:history="1" r:id="rIdaettuwjrvvtzswkoggil6">
               <w:r>
                 <w:rPr>
                   <w:rStyle w:val="Hyperlink"/>
@@ -218,7 +218,7 @@
               </w:rPr>
               <w:t xml:space="preserve"> · </w:t>
             </w:r>
-            <w:hyperlink w:history="1" r:id="rIduqhmiy2yowc16ljuv4zui">
+            <w:hyperlink w:history="1" r:id="rId_tmubjcjmqwed16lebzf0">
               <w:r>
                 <w:rPr>
                   <w:rStyle w:val="Hyperlink"/>
@@ -237,7 +237,7 @@
               </w:rPr>
               <w:t xml:space="preserve"> · </w:t>
             </w:r>
-            <w:hyperlink w:history="1" r:id="rIdtalzn2vnkw9lqlcbdx4wm">
+            <w:hyperlink w:history="1" r:id="rIdmx8qtpestk8z2bs5joioj">
               <w:r>
                 <w:rPr>
                   <w:rStyle w:val="Hyperlink"/>
@@ -867,7 +867,7 @@
             <w:pPr>
               <w:spacing w:after="40" w:before="0"/>
             </w:pPr>
-            <w:hyperlink w:history="1" r:id="rIdt-ir408ld-libszhtutif">
+            <w:hyperlink w:history="1" r:id="rIdnvq8wxik3gexu1vfxtgrm">
               <w:r>
                 <w:rPr>
                   <w:rStyle w:val="Hyperlink"/>
@@ -909,7 +909,7 @@
               </w:rPr>
               <w:t xml:space="preserve">Open </w:t>
             </w:r>
-            <w:hyperlink w:history="1" r:id="rIdan_qk0h7jyghwa7gidmiu">
+            <w:hyperlink w:history="1" r:id="rIdp-rvhjgxuipoy3fvosrxe">
               <w:r>
                 <w:rPr>
                   <w:rStyle w:val="Hyperlink"/>
@@ -1076,7 +1076,7 @@
               </w:rPr>
               <w:t xml:space="preserve">Walk-on: </w:t>
             </w:r>
-            <w:hyperlink w:history="1" r:id="rIdrsyej5cutccqflqd5z5kn">
+            <w:hyperlink w:history="1" r:id="rIdzob7wpu3-jtvxoyfl-6wn">
               <w:r>
                 <w:rPr>
                   <w:rStyle w:val="Hyperlink"/>
@@ -1257,7 +1257,7 @@
             <w:pPr>
               <w:spacing w:after="40" w:before="0"/>
             </w:pPr>
-            <w:hyperlink w:history="1" r:id="rIdxziczjstixfs7tlyknh3s">
+            <w:hyperlink w:history="1" r:id="rId_7wkkmruazkldhmwleeeu">
               <w:r>
                 <w:rPr>
                   <w:rStyle w:val="Hyperlink"/>
@@ -1299,7 +1299,7 @@
               </w:rPr>
               <w:t xml:space="preserve">One-click: </w:t>
             </w:r>
-            <w:hyperlink w:history="1" r:id="rId_phevklygly7uacnchdn6">
+            <w:hyperlink w:history="1" r:id="rIdzoe5b-wj2cnjveltfl8xq">
               <w:r>
                 <w:rPr>
                   <w:rStyle w:val="Hyperlink"/>
@@ -1466,7 +1466,7 @@
               </w:rPr>
               <w:t xml:space="preserve">Walk-on: </w:t>
             </w:r>
-            <w:hyperlink w:history="1" r:id="rIdivcgqt-zp_4piixgvljun">
+            <w:hyperlink w:history="1" r:id="rIdaueqe_i9ulucfwyumje5a">
               <w:r>
                 <w:rPr>
                   <w:rStyle w:val="Hyperlink"/>
@@ -1637,7 +1637,7 @@
             <w:pPr>
               <w:spacing w:after="40" w:before="0"/>
             </w:pPr>
-            <w:hyperlink w:history="1" r:id="rIdqtu0weluljvout1eqxwx3">
+            <w:hyperlink w:history="1" r:id="rIdzuftyr0zig5zcxfz6jpud">
               <w:r>
                 <w:rPr>
                   <w:rStyle w:val="Hyperlink"/>
@@ -1679,7 +1679,7 @@
               </w:rPr>
               <w:t xml:space="preserve">One-click: </w:t>
             </w:r>
-            <w:hyperlink w:history="1" r:id="rId9awd7zup-byk98xkqauiv">
+            <w:hyperlink w:history="1" r:id="rId945ntsji4zgpiboywjs9l">
               <w:r>
                 <w:rPr>
                   <w:rStyle w:val="Hyperlink"/>
@@ -1846,7 +1846,7 @@
               </w:rPr>
               <w:t xml:space="preserve">Walk-on: </w:t>
             </w:r>
-            <w:hyperlink w:history="1" r:id="rIdgwbtbsa3o64r89wvovndl">
+            <w:hyperlink w:history="1" r:id="rIdysfzvs5_wq4me_77dsmpn">
               <w:r>
                 <w:rPr>
                   <w:rStyle w:val="Hyperlink"/>
@@ -2027,7 +2027,7 @@
               </w:rPr>
               <w:t xml:space="preserve">Pre-Lunch: </w:t>
             </w:r>
-            <w:hyperlink w:history="1" r:id="rIdwx21gk8ghval0stipxtfz">
+            <w:hyperlink w:history="1" r:id="rIdeha5welclezb5gkm6xgat">
               <w:r>
                 <w:rPr>
                   <w:rStyle w:val="Hyperlink"/>
@@ -2261,7 +2261,7 @@
               </w:rPr>
               <w:t xml:space="preserve">Walk-on: </w:t>
             </w:r>
-            <w:hyperlink w:history="1" r:id="rIdxvqklwryv4y-3k1bb0guu">
+            <w:hyperlink w:history="1" r:id="rId7eyrwlaeiodtziyafpe_7">
               <w:r>
                 <w:rPr>
                   <w:rStyle w:val="Hyperlink"/>
@@ -2414,7 +2414,7 @@
             <w:pPr>
               <w:spacing w:after="40" w:before="0"/>
             </w:pPr>
-            <w:hyperlink w:history="1" r:id="rIdabmwhtqftbhnvcrcqgyz2">
+            <w:hyperlink w:history="1" r:id="rIdalwo8hqgkn2wwshyor5_4">
               <w:r>
                 <w:rPr>
                   <w:rStyle w:val="Hyperlink"/>
@@ -2458,7 +2458,7 @@
               </w:rPr>
               <w:t xml:space="preserve">Post-Lunch: </w:t>
             </w:r>
-            <w:hyperlink w:history="1" r:id="rIdulcixrfgccrsqkams3lu4">
+            <w:hyperlink w:history="1" r:id="rIdjpxbgoh0zbgzthy7a8_sn">
               <w:r>
                 <w:rPr>
                   <w:rStyle w:val="Hyperlink"/>
@@ -2479,7 +2479,7 @@
               </w:rPr>
               <w:t xml:space="preserve"> — Dolly Parton, then </w:t>
             </w:r>
-            <w:hyperlink w:history="1" r:id="rIdv4xqmbwj-yel8xoa1td-a">
+            <w:hyperlink w:history="1" r:id="rIdr4jaordu9mdvta23wrzqf">
               <w:r>
                 <w:rPr>
                   <w:rStyle w:val="Hyperlink"/>
@@ -2703,7 +2703,7 @@
               </w:rPr>
               <w:t xml:space="preserve">Walk-on: </w:t>
             </w:r>
-            <w:hyperlink w:history="1" r:id="rId9pw70je8hbmcnfmnx44dv">
+            <w:hyperlink w:history="1" r:id="rIdizpjcenjbvqiecrnn8yi-">
               <w:r>
                 <w:rPr>
                   <w:rStyle w:val="Hyperlink"/>
@@ -2928,7 +2928,7 @@
             <w:pPr>
               <w:spacing w:after="40" w:before="0"/>
             </w:pPr>
-            <w:hyperlink w:history="1" r:id="rIdpw4adp3wmtnt7ejr7tejc">
+            <w:hyperlink w:history="1" r:id="rIdgorujklhh_ufjia6lsuga">
               <w:r>
                 <w:rPr>
                   <w:rStyle w:val="Hyperlink"/>
@@ -2970,7 +2970,7 @@
               </w:rPr>
               <w:t xml:space="preserve">One-click: </w:t>
             </w:r>
-            <w:hyperlink w:history="1" r:id="rIdyrunatnqg80fjn-8zark6">
+            <w:hyperlink w:history="1" r:id="rIdm73ut_r8mrpx46oavdos4">
               <w:r>
                 <w:rPr>
                   <w:rStyle w:val="Hyperlink"/>
@@ -3155,7 +3155,7 @@
               </w:rPr>
               <w:t xml:space="preserve">Walk-on: </w:t>
             </w:r>
-            <w:hyperlink w:history="1" r:id="rIdwakjqablofbjtbd34wx4i">
+            <w:hyperlink w:history="1" r:id="rId6m55gzkbviahdlun_wxuo">
               <w:r>
                 <w:rPr>
                   <w:rStyle w:val="Hyperlink"/>
@@ -3326,7 +3326,7 @@
             <w:pPr>
               <w:spacing w:after="40" w:before="0"/>
             </w:pPr>
-            <w:hyperlink w:history="1" r:id="rIddss3f1j6rnp3hlw5a-x8d">
+            <w:hyperlink w:history="1" r:id="rIdphhmmlhjw_mjl2tcced7q">
               <w:r>
                 <w:rPr>
                   <w:rStyle w:val="Hyperlink"/>
@@ -3368,7 +3368,7 @@
               </w:rPr>
               <w:t xml:space="preserve">One-click: </w:t>
             </w:r>
-            <w:hyperlink w:history="1" r:id="rId9blozco4xyx_conefsm1y">
+            <w:hyperlink w:history="1" r:id="rIds420g7xfixre7j9pipei8">
               <w:r>
                 <w:rPr>
                   <w:rStyle w:val="Hyperlink"/>
@@ -4098,7 +4098,7 @@
             <w:pPr>
               <w:spacing w:after="40" w:before="0"/>
             </w:pPr>
-            <w:hyperlink w:history="1" r:id="rIdezc6-i2ufvksgtek0ilqz">
+            <w:hyperlink w:history="1" r:id="rIdnrzhtpujnmbegevstlu_t">
               <w:r>
                 <w:rPr>
                   <w:rStyle w:val="Hyperlink"/>
@@ -4201,7 +4201,7 @@
             <w:pPr>
               <w:spacing w:after="40" w:before="0"/>
             </w:pPr>
-            <w:hyperlink w:history="1" r:id="rIdlzya8d7ovofazuv-8hezo">
+            <w:hyperlink w:history="1" r:id="rIdmd3sbsnhalonogzxhrzyv">
               <w:r>
                 <w:rPr>
                   <w:rStyle w:val="Hyperlink"/>
@@ -4301,7 +4301,7 @@
             <w:pPr>
               <w:spacing w:after="40" w:before="0"/>
             </w:pPr>
-            <w:hyperlink w:history="1" r:id="rIda0lpjyakphpb22nljcygd">
+            <w:hyperlink w:history="1" r:id="rIdoirech_utbmq5q17sf_dn">
               <w:r>
                 <w:rPr>
                   <w:rStyle w:val="Hyperlink"/>
@@ -4404,7 +4404,7 @@
             <w:pPr>
               <w:spacing w:after="40" w:before="0"/>
             </w:pPr>
-            <w:hyperlink w:history="1" r:id="rIdgvtqfr74ogoe8etdeyzg5">
+            <w:hyperlink w:history="1" r:id="rIdddp0w2e85-knusopcwa_b">
               <w:r>
                 <w:rPr>
                   <w:rStyle w:val="Hyperlink"/>
@@ -4688,7 +4688,7 @@
             <w:pPr>
               <w:spacing w:after="40" w:before="0"/>
             </w:pPr>
-            <w:hyperlink w:history="1" r:id="rId3dc_sblttpbyfliwy0vbz">
+            <w:hyperlink w:history="1" r:id="rIdo381ovjaoplbk6m1aqoso">
               <w:r>
                 <w:rPr>
                   <w:rStyle w:val="Hyperlink"/>
@@ -4832,7 +4832,7 @@
             <w:pPr>
               <w:spacing w:after="40" w:before="0"/>
             </w:pPr>
-            <w:hyperlink w:history="1" r:id="rIdfwoo6l5yrauqijgizvjff">
+            <w:hyperlink w:history="1" r:id="rIdwlchcl2a4gs7epvcmsjq8">
               <w:r>
                 <w:rPr>
                   <w:rStyle w:val="Hyperlink"/>
@@ -4976,7 +4976,7 @@
             <w:pPr>
               <w:spacing w:after="40" w:before="0"/>
             </w:pPr>
-            <w:hyperlink w:history="1" r:id="rIdcodmogq2_6szjvf-x9g00">
+            <w:hyperlink w:history="1" r:id="rIdft90lbbcbfvzyjrabpy_v">
               <w:r>
                 <w:rPr>
                   <w:rStyle w:val="Hyperlink"/>
@@ -5118,7 +5118,7 @@
             <w:pPr>
               <w:spacing w:after="40" w:before="0"/>
             </w:pPr>
-            <w:hyperlink w:history="1" r:id="rIdmsb7sqqagmjysl6anegla">
+            <w:hyperlink w:history="1" r:id="rIdecz7h1bg2xg-se-9spt7z">
               <w:r>
                 <w:rPr>
                   <w:rStyle w:val="Hyperlink"/>
@@ -5262,7 +5262,7 @@
             <w:pPr>
               <w:spacing w:after="40" w:before="0"/>
             </w:pPr>
-            <w:hyperlink w:history="1" r:id="rId7tjdpt1i-oulonmw9pj_y">
+            <w:hyperlink w:history="1" r:id="rIddq5dpjhpcknbxqz1fldxj">
               <w:r>
                 <w:rPr>
                   <w:rStyle w:val="Hyperlink"/>
@@ -5404,7 +5404,7 @@
             <w:pPr>
               <w:spacing w:after="40" w:before="0"/>
             </w:pPr>
-            <w:hyperlink w:history="1" r:id="rIdbiyzr_rkwzvpbiigdjt6b">
+            <w:hyperlink w:history="1" r:id="rIdbnz90sfbrvg2unnghexea">
               <w:r>
                 <w:rPr>
                   <w:rStyle w:val="Hyperlink"/>
@@ -5591,7 +5591,7 @@
               </w:rPr>
               <w:t xml:space="preserve">Default to </w:t>
             </w:r>
-            <w:hyperlink w:history="1" r:id="rIdhbgb46pvpqrjpz4d2vz8s">
+            <w:hyperlink w:history="1" r:id="rIdhdghhdos15isjbgmitrjq">
               <w:r>
                 <w:rPr>
                   <w:rStyle w:val="Hyperlink"/>
@@ -5657,7 +5657,7 @@
         </w:rPr>
         <w:t xml:space="preserve">•  Pre-Lunch bridge (11:55 AM): </w:t>
       </w:r>
-      <w:hyperlink w:history="1" r:id="rIdcm-opoddyjwovzx9psb03">
+      <w:hyperlink w:history="1" r:id="rId1tscfapdtmfxw64l9ziig">
         <w:r>
           <w:rPr>
             <w:rStyle w:val="Hyperlink"/>
@@ -5693,7 +5693,7 @@
         </w:rPr>
         <w:t xml:space="preserve">•  Post-Lunch return (1:00 PM): </w:t>
       </w:r>
-      <w:hyperlink w:history="1" r:id="rIdizxprpaakkn8fkaeq4ftw">
+      <w:hyperlink w:history="1" r:id="rIdwiljlktv73tgpnuz9hew1">
         <w:r>
           <w:rPr>
             <w:rStyle w:val="Hyperlink"/>
@@ -5714,7 +5714,7 @@
         </w:rPr>
         <w:t xml:space="preserve"> by Dolly Parton, then resume </w:t>
       </w:r>
-      <w:hyperlink w:history="1" r:id="rId-0t7vrw6xiajo0rxh9vnc">
+      <w:hyperlink w:history="1" r:id="rIddp3s8b1nixt_g4gud6phn">
         <w:r>
           <w:rPr>
             <w:rStyle w:val="Hyperlink"/>
@@ -5999,7 +5999,7 @@
         </w:rPr>
         <w:t xml:space="preserve"> (deck / files / AV lead) · </w:t>
       </w:r>
-      <w:hyperlink w:history="1" r:id="rIdu6mdsftmumagse9m4i_no">
+      <w:hyperlink w:history="1" r:id="rIdleam1atdm-wdcyobuogkp">
         <w:r>
           <w:rPr>
             <w:rStyle w:val="Hyperlink"/>
@@ -6018,7 +6018,7 @@
         </w:rPr>
         <w:t xml:space="preserve"> · </w:t>
       </w:r>
-      <w:hyperlink w:history="1" r:id="rIdlaitanm0ch86fqtavgakr">
+      <w:hyperlink w:history="1" r:id="rId-3jz_icpxvp6panoetgvu">
         <w:r>
           <w:rPr>
             <w:rStyle w:val="Hyperlink"/>
@@ -6052,7 +6052,7 @@
         </w:rPr>
         <w:t xml:space="preserve"> (Day-of Show Operations (event lead, run of show)) · </w:t>
       </w:r>
-      <w:hyperlink w:history="1" r:id="rId8znpr9etcxl4cdgravmh4">
+      <w:hyperlink w:history="1" r:id="rIdx9cxf61dsjw67ftn5hsc-">
         <w:r>
           <w:rPr>
             <w:rStyle w:val="Hyperlink"/>
@@ -6071,7 +6071,7 @@
         </w:rPr>
         <w:t xml:space="preserve"> · </w:t>
       </w:r>
-      <w:hyperlink w:history="1" r:id="rIdpe7irfxkxjkbbq1vlfk2l">
+      <w:hyperlink w:history="1" r:id="rIde4mfntrec7v-y5uum6ams">
         <w:r>
           <w:rPr>
             <w:rStyle w:val="Hyperlink"/>
@@ -6105,7 +6105,7 @@
         </w:rPr>
         <w:t xml:space="preserve"> (Venue Liaison (knows the Statler)) · </w:t>
       </w:r>
-      <w:hyperlink w:history="1" r:id="rIdwevn-sjlrcxw2aliqivrr">
+      <w:hyperlink w:history="1" r:id="rIdlrxmidm7olstnjzsrxofp">
         <w:r>
           <w:rPr>
             <w:rStyle w:val="Hyperlink"/>
@@ -6124,7 +6124,7 @@
         </w:rPr>
         <w:t xml:space="preserve"> · </w:t>
       </w:r>
-      <w:hyperlink w:history="1" r:id="rIddirhnbgyd9dp6vvlp75mu">
+      <w:hyperlink w:history="1" r:id="rId8tw9frmjfqi_rzqg2snfd">
         <w:r>
           <w:rPr>
             <w:rStyle w:val="Hyperlink"/>
@@ -6158,7 +6158,7 @@
         </w:rPr>
         <w:t xml:space="preserve"> (Encore / Statler AV contact) · </w:t>
       </w:r>
-      <w:hyperlink w:history="1" r:id="rIdnpqambkh868brb0srtset">
+      <w:hyperlink w:history="1" r:id="rIdhih5zno2ydfcquzuvoaig">
         <w:r>
           <w:rPr>
             <w:rStyle w:val="Hyperlink"/>
@@ -6177,7 +6177,7 @@
         </w:rPr>
         <w:t xml:space="preserve"> · </w:t>
       </w:r>
-      <w:hyperlink w:history="1" r:id="rIdscioezi1owhe37-h2qmqy">
+      <w:hyperlink w:history="1" r:id="rIdr7bkyhvxopvabo2ecaajd">
         <w:r>
           <w:rPr>
             <w:rStyle w:val="Hyperlink"/>
@@ -6211,7 +6211,7 @@
         </w:rPr>
         <w:t xml:space="preserve"> (MC (emcee)) · </w:t>
       </w:r>
-      <w:hyperlink w:history="1" r:id="rIdtb-wg4scj30tugte9gd08">
+      <w:hyperlink w:history="1" r:id="rIdbvd_thzjdxwwtxirixfma">
         <w:r>
           <w:rPr>
             <w:rStyle w:val="Hyperlink"/>
@@ -6245,7 +6245,7 @@
         </w:rPr>
         <w:t xml:space="preserve"> (stage-side coordinator (eyes on stage all day, supports MC Max)) · </w:t>
       </w:r>
-      <w:hyperlink w:history="1" r:id="rIdzaxxq_dtzmggyzslyopnf">
+      <w:hyperlink w:history="1" r:id="rId4zst6n7vsf_1lxbrzxvnz">
         <w:r>
           <w:rPr>
             <w:rStyle w:val="Hyperlink"/>
@@ -6314,7 +6314,7 @@
 <w:ftr xmlns:wpc="http://schemas.microsoft.com/office/word/2010/wordprocessingCanvas" xmlns:mc="http://schemas.openxmlformats.org/markup-compatibility/2006" xmlns:o="urn:schemas-microsoft-com:office:office" xmlns:r="http://schemas.openxmlformats.org/officeDocument/2006/relationships" xmlns:m="http://schemas.openxmlformats.org/officeDocument/2006/math" xmlns:v="urn:schemas-microsoft-com:vml" xmlns:wp14="http://schemas.microsoft.com/office/word/2010/wordprocessingDrawing" xmlns:wp="http://schemas.openxmlformats.org/drawingml/2006/wordprocessingDrawing" xmlns:w10="urn:schemas-microsoft-com:office:word" xmlns:w="http://schemas.openxmlformats.org/wordprocessingml/2006/main" xmlns:w14="http://schemas.microsoft.com/office/word/2010/wordml" xmlns:w15="http://schemas.microsoft.com/office/word/2012/wordml" xmlns:wpg="http://schemas.microsoft.com/office/word/2010/wordprocessingGroup" xmlns:wpi="http://schemas.microsoft.com/office/word/2010/wordprocessingInk" xmlns:wne="http://schemas.microsoft.com/office/word/2006/wordml" xmlns:wps="http://schemas.microsoft.com/office/word/2010/wordprocessingShape">
   <w:p>
     <w:pPr>
-      <w:jc w:val="left"/>
+      <w:jc w:val="center"/>
     </w:pPr>
     <w:r>
       <w:rPr>
@@ -6323,27 +6323,7 @@
         <w:sz w:val="16"/>
         <w:szCs w:val="16"/>
       </w:rPr>
-      <w:t xml:space="preserve">Timer page: </w:t>
-    </w:r>
-    <w:hyperlink w:history="1" r:id="rIdhrh4ooxg2cgac8cyl0hfn">
-      <w:r>
-        <w:rPr>
-          <w:rStyle w:val="Hyperlink"/>
-          <w:rFonts w:ascii="Calibri" w:cs="Calibri" w:eastAsia="Calibri" w:hAnsi="Calibri"/>
-          <w:sz w:val="16"/>
-          <w:szCs w:val="16"/>
-        </w:rPr>
-        <w:t xml:space="preserve">https://EOSNorthTexas.com/timer</w:t>
-      </w:r>
-    </w:hyperlink>
-    <w:r>
-      <w:rPr>
-        <w:rFonts w:ascii="Calibri" w:cs="Calibri" w:eastAsia="Calibri" w:hAnsi="Calibri"/>
-        <w:color w:val="7A7974"/>
-        <w:sz w:val="16"/>
-        <w:szCs w:val="16"/>
-      </w:rPr>
-      <w:t xml:space="preserve">  ·  Break Timer + Sponsor Marquee                                                                                                              Page </w:t>
+      <w:t xml:space="preserve">Page </w:t>
     </w:r>
     <w:r>
       <w:rPr>

</xml_diff>

<commit_message>
AV timeline: retire Deck.pptx, use timer + speaker decks only
</commit_message>
<xml_diff>
--- a/deliverables/av-package/AV-Timeline.docx
+++ b/deliverables/av-package/AV-Timeline.docx
@@ -102,7 +102,7 @@
             <w:pPr>
               <w:spacing w:after="40" w:before="0"/>
             </w:pPr>
-            <w:hyperlink w:history="1" r:id="rIdd9lvnchawafovude7qhgm">
+            <w:hyperlink w:history="1" r:id="rIdit8_w7fcoyurvhizlrip-">
               <w:r>
                 <w:rPr>
                   <w:rStyle w:val="Hyperlink"/>
@@ -180,7 +180,7 @@
             <w:pPr>
               <w:spacing w:after="40" w:before="0"/>
             </w:pPr>
-            <w:hyperlink w:history="1" r:id="rId6ws2m04r5mf4qauyp4jmu">
+            <w:hyperlink w:history="1" r:id="rIdnv6sutaqb5xn3gj1f7lyy">
               <w:r>
                 <w:rPr>
                   <w:rStyle w:val="Hyperlink"/>
@@ -199,7 +199,7 @@
               </w:rPr>
               <w:t xml:space="preserve"> · </w:t>
             </w:r>
-            <w:hyperlink w:history="1" r:id="rIdaettuwjrvvtzswkoggil6">
+            <w:hyperlink w:history="1" r:id="rIdma8u3wynk8jei6picqc61">
               <w:r>
                 <w:rPr>
                   <w:rStyle w:val="Hyperlink"/>
@@ -218,7 +218,7 @@
               </w:rPr>
               <w:t xml:space="preserve"> · </w:t>
             </w:r>
-            <w:hyperlink w:history="1" r:id="rId_tmubjcjmqwed16lebzf0">
+            <w:hyperlink w:history="1" r:id="rIdgxkylfe29xy1vi2z9h-s6">
               <w:r>
                 <w:rPr>
                   <w:rStyle w:val="Hyperlink"/>
@@ -237,7 +237,7 @@
               </w:rPr>
               <w:t xml:space="preserve"> · </w:t>
             </w:r>
-            <w:hyperlink w:history="1" r:id="rIdmx8qtpestk8z2bs5joioj">
+            <w:hyperlink w:history="1" r:id="rIdij99f_kylpwtfcpsyguvm">
               <w:r>
                 <w:rPr>
                   <w:rStyle w:val="Hyperlink"/>
@@ -288,7 +288,7 @@
                 <w:sz w:val="18"/>
                 <w:szCs w:val="18"/>
               </w:rPr>
-              <w:t xml:space="preserve">MAIN DECK</w:t>
+              <w:t xml:space="preserve">SPEAKER DECKS</w:t>
             </w:r>
           </w:p>
         </w:tc>
@@ -321,51 +321,15 @@
                 <w:sz w:val="18"/>
                 <w:szCs w:val="18"/>
               </w:rPr>
-              <w:t xml:space="preserve">deliverables/deck/Deck.pptx</w:t>
-            </w:r>
-            <w:r>
-              <w:rPr>
-                <w:rFonts w:ascii="Calibri" w:cs="Calibri" w:eastAsia="Calibri" w:hAnsi="Calibri"/>
-                <w:sz w:val="18"/>
-                <w:szCs w:val="18"/>
-              </w:rPr>
-              <w:t xml:space="preserve"> · 17 slides · Two Custom Shows: </w:t>
-            </w:r>
-            <w:r>
-              <w:rPr>
-                <w:rFonts w:ascii="Calibri" w:cs="Calibri" w:eastAsia="Calibri" w:hAnsi="Calibri"/>
-                <w:b/>
-                <w:bCs/>
-                <w:sz w:val="18"/>
-                <w:szCs w:val="18"/>
-              </w:rPr>
-              <w:t xml:space="preserve">Pre-Event Loop</w:t>
-            </w:r>
-            <w:r>
-              <w:rPr>
-                <w:rFonts w:ascii="Calibri" w:cs="Calibri" w:eastAsia="Calibri" w:hAnsi="Calibri"/>
-                <w:sz w:val="18"/>
-                <w:szCs w:val="18"/>
-              </w:rPr>
-              <w:t xml:space="preserve"> (slides 1-5, auto-advances) and </w:t>
-            </w:r>
-            <w:r>
-              <w:rPr>
-                <w:rFonts w:ascii="Calibri" w:cs="Calibri" w:eastAsia="Calibri" w:hAnsi="Calibri"/>
-                <w:b/>
-                <w:bCs/>
-                <w:sz w:val="18"/>
-                <w:szCs w:val="18"/>
-              </w:rPr>
-              <w:t xml:space="preserve">Event</w:t>
-            </w:r>
-            <w:r>
-              <w:rPr>
-                <w:rFonts w:ascii="Calibri" w:cs="Calibri" w:eastAsia="Calibri" w:hAnsi="Calibri"/>
-                <w:sz w:val="18"/>
-                <w:szCs w:val="18"/>
-              </w:rPr>
-              <w:t xml:space="preserve"> (slides 6-17).</w:t>
+              <w:t xml:space="preserve">Speaker Decks/</w:t>
+            </w:r>
+            <w:r>
+              <w:rPr>
+                <w:rFonts w:ascii="Calibri" w:cs="Calibri" w:eastAsia="Calibri" w:hAnsi="Calibri"/>
+                <w:sz w:val="18"/>
+                <w:szCs w:val="18"/>
+              </w:rPr>
+              <w:t xml:space="preserve"> subfolder · open each speaker's file in PowerPoint at the handoff. After each speaker, return to the timer page or Celebrations Loop.</w:t>
             </w:r>
           </w:p>
         </w:tc>
@@ -399,7 +363,7 @@
                 <w:sz w:val="18"/>
                 <w:szCs w:val="18"/>
               </w:rPr>
-              <w:t xml:space="preserve">SPEAKER DECKS</w:t>
+              <w:t xml:space="preserve">CELEBRATIONS LOOP</w:t>
             </w:r>
           </w:p>
         </w:tc>
@@ -432,90 +396,15 @@
                 <w:sz w:val="18"/>
                 <w:szCs w:val="18"/>
               </w:rPr>
-              <w:t xml:space="preserve">deliverables/speaker-decks/</w:t>
-            </w:r>
-            <w:r>
-              <w:rPr>
-                <w:rFonts w:ascii="Calibri" w:cs="Calibri" w:eastAsia="Calibri" w:hAnsi="Calibri"/>
-                <w:sz w:val="18"/>
-                <w:szCs w:val="18"/>
-              </w:rPr>
-              <w:t xml:space="preserve"> · open each speaker's file in PowerPoint at the handoff. Return to Deck.pptx afterward via Slide Show » Custom Show » Event.</w:t>
-            </w:r>
-          </w:p>
-        </w:tc>
-      </w:tr>
-      <w:tr>
-        <w:tc>
-          <w:tcPr>
-            <w:tcW w:type="dxa" w:w="2000"/>
-            <w:tcBorders>
-              <w:top w:val="single" w:color="D4D1CA" w:sz="4"/>
-              <w:left w:val="single" w:color="D4D1CA" w:sz="4"/>
-              <w:bottom w:val="single" w:color="D4D1CA" w:sz="4"/>
-              <w:right w:val="single" w:color="D4D1CA" w:sz="4"/>
-            </w:tcBorders>
-            <w:shd w:fill="0B1F3A" w:val="clear"/>
-            <w:tcMar>
-              <w:top w:type="dxa" w:w="80"/>
-              <w:left w:type="dxa" w:w="120"/>
-              <w:bottom w:type="dxa" w:w="80"/>
-              <w:right w:type="dxa" w:w="120"/>
-            </w:tcMar>
-            <w:vAlign w:val="center"/>
-          </w:tcPr>
-          <w:p>
-            <w:r>
-              <w:rPr>
-                <w:rFonts w:ascii="Calibri" w:cs="Calibri" w:eastAsia="Calibri" w:hAnsi="Calibri"/>
-                <w:b/>
-                <w:bCs/>
-                <w:color w:val="FFFFFF"/>
-                <w:sz w:val="18"/>
-                <w:szCs w:val="18"/>
-              </w:rPr>
-              <w:t xml:space="preserve">CELEBRATIONS LOOP</w:t>
-            </w:r>
-          </w:p>
-        </w:tc>
-        <w:tc>
-          <w:tcPr>
-            <w:tcW w:type="dxa" w:w="12400"/>
-            <w:tcBorders>
-              <w:top w:val="single" w:color="D4D1CA" w:sz="4"/>
-              <w:left w:val="single" w:color="D4D1CA" w:sz="4"/>
-              <w:bottom w:val="single" w:color="D4D1CA" w:sz="4"/>
-              <w:right w:val="single" w:color="D4D1CA" w:sz="4"/>
-            </w:tcBorders>
-            <w:tcMar>
-              <w:top w:type="dxa" w:w="80"/>
-              <w:left w:type="dxa" w:w="100"/>
-              <w:bottom w:type="dxa" w:w="80"/>
-              <w:right w:type="dxa" w:w="100"/>
-            </w:tcMar>
-            <w:vAlign w:val="center"/>
-          </w:tcPr>
-          <w:p>
-            <w:pPr>
-              <w:spacing w:after="40" w:before="0"/>
-            </w:pPr>
-            <w:r>
-              <w:rPr>
-                <w:rFonts w:ascii="Calibri" w:cs="Calibri" w:eastAsia="Calibri" w:hAnsi="Calibri"/>
-                <w:b/>
-                <w:bCs/>
-                <w:sz w:val="18"/>
-                <w:szCs w:val="18"/>
-              </w:rPr>
-              <w:t xml:space="preserve">deliverables/celebrations-loop/Celebrations-Loop.pptx</w:t>
-            </w:r>
-            <w:r>
-              <w:rPr>
-                <w:rFonts w:ascii="Calibri" w:cs="Calibri" w:eastAsia="Calibri" w:hAnsi="Calibri"/>
-                <w:sz w:val="18"/>
-                <w:szCs w:val="18"/>
-              </w:rPr>
-              <w:t xml:space="preserve"> · 18-slide auto-looping customer wins deck. Optional backup for breaks if you want a second visual instead of the timer page.</w:t>
+              <w:t xml:space="preserve">Celebrations-Loop.pptx</w:t>
+            </w:r>
+            <w:r>
+              <w:rPr>
+                <w:rFonts w:ascii="Calibri" w:cs="Calibri" w:eastAsia="Calibri" w:hAnsi="Calibri"/>
+                <w:sz w:val="18"/>
+                <w:szCs w:val="18"/>
+              </w:rPr>
+              <w:t xml:space="preserve"> · 18-slide auto-looping customer wins deck. Optional visual for breaks or between speakers if you want something other than the timer page.</w:t>
             </w:r>
           </w:p>
         </w:tc>
@@ -867,7 +756,7 @@
             <w:pPr>
               <w:spacing w:after="40" w:before="0"/>
             </w:pPr>
-            <w:hyperlink w:history="1" r:id="rIdnvq8wxik3gexu1vfxtgrm">
+            <w:hyperlink w:history="1" r:id="rIdnyiftd2yy52snoaiidy0n">
               <w:r>
                 <w:rPr>
                   <w:rStyle w:val="Hyperlink"/>
@@ -909,7 +798,7 @@
               </w:rPr>
               <w:t xml:space="preserve">Open </w:t>
             </w:r>
-            <w:hyperlink w:history="1" r:id="rIdp-rvhjgxuipoy3fvosrxe">
+            <w:hyperlink w:history="1" r:id="rIdqabjds-ptfyhy56dg8t3f">
               <w:r>
                 <w:rPr>
                   <w:rStyle w:val="Hyperlink"/>
@@ -1040,7 +929,7 @@
                 <w:sz w:val="18"/>
                 <w:szCs w:val="18"/>
               </w:rPr>
-              <w:t xml:space="preserve">Ann's deck (in speaker-decks/)</w:t>
+              <w:t xml:space="preserve">Ann's deck (in Speaker Decks/)</w:t>
             </w:r>
           </w:p>
         </w:tc>
@@ -1076,7 +965,7 @@
               </w:rPr>
               <w:t xml:space="preserve">Walk-on: </w:t>
             </w:r>
-            <w:hyperlink w:history="1" r:id="rIdzob7wpu3-jtvxoyfl-6wn">
+            <w:hyperlink w:history="1" r:id="rIdtnsvzcquxdcs08prmieqt">
               <w:r>
                 <w:rPr>
                   <w:rStyle w:val="Hyperlink"/>
@@ -1257,7 +1146,7 @@
             <w:pPr>
               <w:spacing w:after="40" w:before="0"/>
             </w:pPr>
-            <w:hyperlink w:history="1" r:id="rId_7wkkmruazkldhmwleeeu">
+            <w:hyperlink w:history="1" r:id="rIdvyyxrnz9qdvnpnmejpj46">
               <w:r>
                 <w:rPr>
                   <w:rStyle w:val="Hyperlink"/>
@@ -1299,7 +1188,7 @@
               </w:rPr>
               <w:t xml:space="preserve">One-click: </w:t>
             </w:r>
-            <w:hyperlink w:history="1" r:id="rIdzoe5b-wj2cnjveltfl8xq">
+            <w:hyperlink w:history="1" r:id="rIdvider5tjlo0fzwwzvrprr">
               <w:r>
                 <w:rPr>
                   <w:rStyle w:val="Hyperlink"/>
@@ -1430,7 +1319,7 @@
                 <w:sz w:val="18"/>
                 <w:szCs w:val="18"/>
               </w:rPr>
-              <w:t xml:space="preserve">Brian's deck (in speaker-decks/)</w:t>
+              <w:t xml:space="preserve">Brian's deck (in Speaker Decks/)</w:t>
             </w:r>
           </w:p>
         </w:tc>
@@ -1466,7 +1355,7 @@
               </w:rPr>
               <w:t xml:space="preserve">Walk-on: </w:t>
             </w:r>
-            <w:hyperlink w:history="1" r:id="rIdaueqe_i9ulucfwyumje5a">
+            <w:hyperlink w:history="1" r:id="rId_4x9j7trjkv-yikv47ruc">
               <w:r>
                 <w:rPr>
                   <w:rStyle w:val="Hyperlink"/>
@@ -1637,7 +1526,7 @@
             <w:pPr>
               <w:spacing w:after="40" w:before="0"/>
             </w:pPr>
-            <w:hyperlink w:history="1" r:id="rIdzuftyr0zig5zcxfz6jpud">
+            <w:hyperlink w:history="1" r:id="rIdemgm94dsks4eodgeny3dx">
               <w:r>
                 <w:rPr>
                   <w:rStyle w:val="Hyperlink"/>
@@ -1679,7 +1568,7 @@
               </w:rPr>
               <w:t xml:space="preserve">One-click: </w:t>
             </w:r>
-            <w:hyperlink w:history="1" r:id="rId945ntsji4zgpiboywjs9l">
+            <w:hyperlink w:history="1" r:id="rIdr6vkwh8v94vtvth3u4kx5">
               <w:r>
                 <w:rPr>
                   <w:rStyle w:val="Hyperlink"/>
@@ -1810,7 +1699,7 @@
                 <w:sz w:val="18"/>
                 <w:szCs w:val="18"/>
               </w:rPr>
-              <w:t xml:space="preserve">Steve's deck (in speaker-decks/)</w:t>
+              <w:t xml:space="preserve">Steve's deck (in Speaker Decks/)</w:t>
             </w:r>
           </w:p>
         </w:tc>
@@ -1846,7 +1735,7 @@
               </w:rPr>
               <w:t xml:space="preserve">Walk-on: </w:t>
             </w:r>
-            <w:hyperlink w:history="1" r:id="rIdysfzvs5_wq4me_77dsmpn">
+            <w:hyperlink w:history="1" r:id="rIdrmtdsbxssfsbub6ubfwg4">
               <w:r>
                 <w:rPr>
                   <w:rStyle w:val="Hyperlink"/>
@@ -2027,7 +1916,7 @@
               </w:rPr>
               <w:t xml:space="preserve">Pre-Lunch: </w:t>
             </w:r>
-            <w:hyperlink w:history="1" r:id="rIdeha5welclezb5gkm6xgat">
+            <w:hyperlink w:history="1" r:id="rIdkcyqjgvbec04wxkdfuizj">
               <w:r>
                 <w:rPr>
                   <w:rStyle w:val="Hyperlink"/>
@@ -2225,7 +2114,7 @@
                 <w:sz w:val="18"/>
                 <w:szCs w:val="18"/>
               </w:rPr>
-              <w:t xml:space="preserve">Walt's deck (in speaker-decks/)</w:t>
+              <w:t xml:space="preserve">Walt's deck (in Speaker Decks/)</w:t>
             </w:r>
           </w:p>
         </w:tc>
@@ -2261,7 +2150,7 @@
               </w:rPr>
               <w:t xml:space="preserve">Walk-on: </w:t>
             </w:r>
-            <w:hyperlink w:history="1" r:id="rId7eyrwlaeiodtziyafpe_7">
+            <w:hyperlink w:history="1" r:id="rIdmcebcynsrjqjrcgse-hfi">
               <w:r>
                 <w:rPr>
                   <w:rStyle w:val="Hyperlink"/>
@@ -2401,20 +2290,7 @@
             <w:pPr>
               <w:spacing w:after="40" w:before="0"/>
             </w:pPr>
-            <w:r>
-              <w:rPr>
-                <w:rFonts w:ascii="Calibri" w:cs="Calibri" w:eastAsia="Calibri" w:hAnsi="Calibri"/>
-                <w:sz w:val="18"/>
-                <w:szCs w:val="18"/>
-              </w:rPr>
-              <w:t xml:space="preserve">Pre-event loop (Deck.pptx slides 1-5 auto-advance) OR </w:t>
-            </w:r>
-          </w:p>
-          <w:p>
-            <w:pPr>
-              <w:spacing w:after="40" w:before="0"/>
-            </w:pPr>
-            <w:hyperlink w:history="1" r:id="rIdalwo8hqgkn2wwshyor5_4">
+            <w:hyperlink w:history="1" r:id="rIdyd_bknjarrubnsj1iozn3">
               <w:r>
                 <w:rPr>
                   <w:rStyle w:val="Hyperlink"/>
@@ -2422,9 +2298,17 @@
                   <w:sz w:val="18"/>
                   <w:szCs w:val="18"/>
                 </w:rPr>
-                <w:t xml:space="preserve">timer countdown to 1:10 PM</w:t>
+                <w:t xml:space="preserve">Timer countdown to 1:10 PM</w:t>
               </w:r>
             </w:hyperlink>
+            <w:r>
+              <w:rPr>
+                <w:rFonts w:ascii="Calibri" w:cs="Calibri" w:eastAsia="Calibri" w:hAnsi="Calibri"/>
+                <w:sz w:val="18"/>
+                <w:szCs w:val="18"/>
+              </w:rPr>
+              <w:t xml:space="preserve"> (or Celebrations Loop)</w:t>
+            </w:r>
           </w:p>
         </w:tc>
         <w:tc>
@@ -2458,7 +2342,7 @@
               </w:rPr>
               <w:t xml:space="preserve">Post-Lunch: </w:t>
             </w:r>
-            <w:hyperlink w:history="1" r:id="rIdjpxbgoh0zbgzthy7a8_sn">
+            <w:hyperlink w:history="1" r:id="rId33dsjdc1ssvepbd0yx2ry">
               <w:r>
                 <w:rPr>
                   <w:rStyle w:val="Hyperlink"/>
@@ -2479,7 +2363,7 @@
               </w:rPr>
               <w:t xml:space="preserve"> — Dolly Parton, then </w:t>
             </w:r>
-            <w:hyperlink w:history="1" r:id="rIdr4jaordu9mdvta23wrzqf">
+            <w:hyperlink w:history="1" r:id="rIdclddg0jk5dad1ph98utf4">
               <w:r>
                 <w:rPr>
                   <w:rStyle w:val="Hyperlink"/>
@@ -2519,7 +2403,26 @@
                 <w:sz w:val="18"/>
                 <w:szCs w:val="18"/>
               </w:rPr>
-              <w:t xml:space="preserve">Play post-lunch song. Load Deck.pptx — start Custom Show "Pre-Event Loop" (auto-advances 15s per slide).</w:t>
+              <w:t xml:space="preserve">Play post-lunch song. One-click: </w:t>
+            </w:r>
+            <w:hyperlink w:history="1" r:id="rIdpjbjoqanduyxnc_7e_os0">
+              <w:r>
+                <w:rPr>
+                  <w:rStyle w:val="Hyperlink"/>
+                  <w:rFonts w:ascii="Calibri" w:cs="Calibri" w:eastAsia="Calibri" w:hAnsi="Calibri"/>
+                  <w:sz w:val="18"/>
+                  <w:szCs w:val="18"/>
+                </w:rPr>
+                <w:t xml:space="preserve">countdown to 1:10 PM</w:t>
+              </w:r>
+            </w:hyperlink>
+            <w:r>
+              <w:rPr>
+                <w:rFonts w:ascii="Calibri" w:cs="Calibri" w:eastAsia="Calibri" w:hAnsi="Calibri"/>
+                <w:sz w:val="18"/>
+                <w:szCs w:val="18"/>
+              </w:rPr>
+              <w:t xml:space="preserve">.</w:t>
             </w:r>
           </w:p>
         </w:tc>
@@ -2667,7 +2570,7 @@
                 <w:sz w:val="18"/>
                 <w:szCs w:val="18"/>
               </w:rPr>
-              <w:t xml:space="preserve">Deck.pptx slide 6-8, then Mark's deck</w:t>
+              <w:t xml:space="preserve">Mark's deck (in Speaker Decks/)</w:t>
             </w:r>
           </w:p>
         </w:tc>
@@ -2703,7 +2606,7 @@
               </w:rPr>
               <w:t xml:space="preserve">Walk-on: </w:t>
             </w:r>
-            <w:hyperlink w:history="1" r:id="rIdizpjcenjbvqiecrnn8yi-">
+            <w:hyperlink w:history="1" r:id="rId7brbec7d7sistphmydihp">
               <w:r>
                 <w:rPr>
                   <w:rStyle w:val="Hyperlink"/>
@@ -2754,43 +2657,7 @@
                 <w:sz w:val="18"/>
                 <w:szCs w:val="18"/>
               </w:rPr>
-              <w:t xml:space="preserve">Advance Deck.pptx to Custom Show </w:t>
-            </w:r>
-            <w:r>
-              <w:rPr>
-                <w:rFonts w:ascii="Calibri" w:cs="Calibri" w:eastAsia="Calibri" w:hAnsi="Calibri"/>
-                <w:b/>
-                <w:bCs/>
-                <w:sz w:val="18"/>
-                <w:szCs w:val="18"/>
-              </w:rPr>
-              <w:t xml:space="preserve">"Event"</w:t>
-            </w:r>
-            <w:r>
-              <w:rPr>
-                <w:rFonts w:ascii="Calibri" w:cs="Calibri" w:eastAsia="Calibri" w:hAnsi="Calibri"/>
-                <w:sz w:val="18"/>
-                <w:szCs w:val="18"/>
-              </w:rPr>
-              <w:t xml:space="preserve"> (starts at slide 6). At slide 8, </w:t>
-            </w:r>
-            <w:r>
-              <w:rPr>
-                <w:rFonts w:ascii="Calibri" w:cs="Calibri" w:eastAsia="Calibri" w:hAnsi="Calibri"/>
-                <w:b/>
-                <w:bCs/>
-                <w:sz w:val="18"/>
-                <w:szCs w:val="18"/>
-              </w:rPr>
-              <w:t xml:space="preserve">Esc</w:t>
-            </w:r>
-            <w:r>
-              <w:rPr>
-                <w:rFonts w:ascii="Calibri" w:cs="Calibri" w:eastAsia="Calibri" w:hAnsi="Calibri"/>
-                <w:sz w:val="18"/>
-                <w:szCs w:val="18"/>
-              </w:rPr>
-              <w:t xml:space="preserve">, then open </w:t>
+              <w:t xml:space="preserve">Fade playlist. Play walk-on. Load </w:t>
             </w:r>
             <w:r>
               <w:rPr>
@@ -2808,7 +2675,7 @@
                 <w:sz w:val="18"/>
                 <w:szCs w:val="18"/>
               </w:rPr>
-              <w:t xml:space="preserve"> and press F5. Play walk-on before he takes stage.</w:t>
+              <w:t xml:space="preserve"> and press F5 when Mark takes the stage.</w:t>
             </w:r>
           </w:p>
         </w:tc>
@@ -2928,7 +2795,7 @@
             <w:pPr>
               <w:spacing w:after="40" w:before="0"/>
             </w:pPr>
-            <w:hyperlink w:history="1" r:id="rIdgorujklhh_ufjia6lsuga">
+            <w:hyperlink w:history="1" r:id="rIdqb5pd_9skaebrf9_auatj">
               <w:r>
                 <w:rPr>
                   <w:rStyle w:val="Hyperlink"/>
@@ -2970,7 +2837,7 @@
               </w:rPr>
               <w:t xml:space="preserve">One-click: </w:t>
             </w:r>
-            <w:hyperlink w:history="1" r:id="rIdm73ut_r8mrpx46oavdos4">
+            <w:hyperlink w:history="1" r:id="rIda2ebhcknke8bcnn1-du6w">
               <w:r>
                 <w:rPr>
                   <w:rStyle w:val="Hyperlink"/>
@@ -3119,7 +2986,7 @@
                 <w:sz w:val="18"/>
                 <w:szCs w:val="18"/>
               </w:rPr>
-              <w:t xml:space="preserve">Deck.pptx slide 10-11 (Beth may drive from master or her own deck)</w:t>
+              <w:t xml:space="preserve">Beth's deck (in Speaker Decks/)</w:t>
             </w:r>
           </w:p>
         </w:tc>
@@ -3155,7 +3022,7 @@
               </w:rPr>
               <w:t xml:space="preserve">Walk-on: </w:t>
             </w:r>
-            <w:hyperlink w:history="1" r:id="rId6m55gzkbviahdlun_wxuo">
+            <w:hyperlink w:history="1" r:id="rIdbxs4j5ke4re1mqq5pbhoe">
               <w:r>
                 <w:rPr>
                   <w:rStyle w:val="Hyperlink"/>
@@ -3206,7 +3073,25 @@
                 <w:sz w:val="18"/>
                 <w:szCs w:val="18"/>
               </w:rPr>
-              <w:t xml:space="preserve">Advance Deck.pptx to slide 10-11. Beth presents from here or hands off to her deck. Play walk-on before she takes stage.</w:t>
+              <w:t xml:space="preserve">Fade playlist. Play walk-on. Load </w:t>
+            </w:r>
+            <w:r>
+              <w:rPr>
+                <w:rFonts w:ascii="Calibri" w:cs="Calibri" w:eastAsia="Calibri" w:hAnsi="Calibri"/>
+                <w:b/>
+                <w:bCs/>
+                <w:sz w:val="18"/>
+                <w:szCs w:val="18"/>
+              </w:rPr>
+              <w:t xml:space="preserve">Beth_Fahey-RolloutPresentation_Dallas_2026_Updated.pptx</w:t>
+            </w:r>
+            <w:r>
+              <w:rPr>
+                <w:rFonts w:ascii="Calibri" w:cs="Calibri" w:eastAsia="Calibri" w:hAnsi="Calibri"/>
+                <w:sz w:val="18"/>
+                <w:szCs w:val="18"/>
+              </w:rPr>
+              <w:t xml:space="preserve"> and press F5 when Beth takes the stage.</w:t>
             </w:r>
           </w:p>
         </w:tc>
@@ -3326,7 +3211,7 @@
             <w:pPr>
               <w:spacing w:after="40" w:before="0"/>
             </w:pPr>
-            <w:hyperlink w:history="1" r:id="rIdphhmmlhjw_mjl2tcced7q">
+            <w:hyperlink w:history="1" r:id="rIdv1ph3mobrpq6h6_wljn9f">
               <w:r>
                 <w:rPr>
                   <w:rStyle w:val="Hyperlink"/>
@@ -3368,7 +3253,7 @@
               </w:rPr>
               <w:t xml:space="preserve">One-click: </w:t>
             </w:r>
-            <w:hyperlink w:history="1" r:id="rIds420g7xfixre7j9pipei8">
+            <w:hyperlink w:history="1" r:id="rIddybyfbrmgyfvmc44izssv">
               <w:r>
                 <w:rPr>
                   <w:rStyle w:val="Hyperlink"/>
@@ -3385,25 +3270,7 @@
                 <w:sz w:val="18"/>
                 <w:szCs w:val="18"/>
               </w:rPr>
-              <w:t xml:space="preserve">. </w:t>
-            </w:r>
-            <w:r>
-              <w:rPr>
-                <w:rFonts w:ascii="Calibri" w:cs="Calibri" w:eastAsia="Calibri" w:hAnsi="Calibri"/>
-                <w:b/>
-                <w:bCs/>
-                <w:sz w:val="18"/>
-                <w:szCs w:val="18"/>
-              </w:rPr>
-              <w:t xml:space="preserve">Sponsor thank-you</w:t>
-            </w:r>
-            <w:r>
-              <w:rPr>
-                <w:rFonts w:ascii="Calibri" w:cs="Calibri" w:eastAsia="Calibri" w:hAnsi="Calibri"/>
-                <w:sz w:val="18"/>
-                <w:szCs w:val="18"/>
-              </w:rPr>
-              <w:t xml:space="preserve"> at Deck.pptx slides 13-14 will play on emcee return.</w:t>
+              <w:t xml:space="preserve">. MC Max handles sponsor thank-yous verbally on return.</w:t>
             </w:r>
           </w:p>
         </w:tc>
@@ -3517,7 +3384,7 @@
                 <w:sz w:val="18"/>
                 <w:szCs w:val="18"/>
               </w:rPr>
-              <w:t xml:space="preserve">Deck.pptx slide 13-16, then Winters' deck</w:t>
+              <w:t xml:space="preserve">Winters' deck (in Speaker Decks/)</w:t>
             </w:r>
           </w:p>
         </w:tc>
@@ -3594,43 +3461,25 @@
                 <w:sz w:val="18"/>
                 <w:szCs w:val="18"/>
               </w:rPr>
-              <w:t xml:space="preserve">Advance Deck.pptx to slides 13-14 (sponsor thank-you), then slide 15 (session cover), then slide 16. </w:t>
-            </w:r>
-            <w:r>
-              <w:rPr>
-                <w:rFonts w:ascii="Calibri" w:cs="Calibri" w:eastAsia="Calibri" w:hAnsi="Calibri"/>
-                <w:b/>
-                <w:bCs/>
-                <w:sz w:val="18"/>
-                <w:szCs w:val="18"/>
-              </w:rPr>
-              <w:t xml:space="preserve">Esc</w:t>
-            </w:r>
-            <w:r>
-              <w:rPr>
-                <w:rFonts w:ascii="Calibri" w:cs="Calibri" w:eastAsia="Calibri" w:hAnsi="Calibri"/>
-                <w:sz w:val="18"/>
-                <w:szCs w:val="18"/>
-              </w:rPr>
-              <w:t xml:space="preserve">, then open </w:t>
-            </w:r>
-            <w:r>
-              <w:rPr>
-                <w:rFonts w:ascii="Calibri" w:cs="Calibri" w:eastAsia="Calibri" w:hAnsi="Calibri"/>
-                <w:b/>
-                <w:bCs/>
-                <w:sz w:val="18"/>
-                <w:szCs w:val="18"/>
-              </w:rPr>
-              <w:t xml:space="preserve">Mark C. Winters — 10 Pillars.pptx</w:t>
-            </w:r>
-            <w:r>
-              <w:rPr>
-                <w:rFonts w:ascii="Calibri" w:cs="Calibri" w:eastAsia="Calibri" w:hAnsi="Calibri"/>
-                <w:sz w:val="18"/>
-                <w:szCs w:val="18"/>
-              </w:rPr>
-              <w:t xml:space="preserve"> and press F5. Play walk-on before he takes stage.</w:t>
+              <w:t xml:space="preserve">Fade playlist. Play walk-on. Load </w:t>
+            </w:r>
+            <w:r>
+              <w:rPr>
+                <w:rFonts w:ascii="Calibri" w:cs="Calibri" w:eastAsia="Calibri" w:hAnsi="Calibri"/>
+                <w:b/>
+                <w:bCs/>
+                <w:sz w:val="18"/>
+                <w:szCs w:val="18"/>
+              </w:rPr>
+              <w:t xml:space="preserve">Mark_Winters_10_Pillars.pptx</w:t>
+            </w:r>
+            <w:r>
+              <w:rPr>
+                <w:rFonts w:ascii="Calibri" w:cs="Calibri" w:eastAsia="Calibri" w:hAnsi="Calibri"/>
+                <w:sz w:val="18"/>
+                <w:szCs w:val="18"/>
+              </w:rPr>
+              <w:t xml:space="preserve"> and press F5 when Mark takes the stage.</w:t>
             </w:r>
           </w:p>
         </w:tc>
@@ -3775,7 +3624,7 @@
                 <w:sz w:val="18"/>
                 <w:szCs w:val="18"/>
               </w:rPr>
-              <w:t xml:space="preserve">Deck.pptx slide 17 (Happy Hour close)</w:t>
+              <w:t xml:space="preserve">Celebrations Loop OR timer page (any static screen)</w:t>
             </w:r>
           </w:p>
         </w:tc>
@@ -3837,7 +3686,7 @@
                 <w:sz w:val="18"/>
                 <w:szCs w:val="18"/>
               </w:rPr>
-              <w:t xml:space="preserve">Advance Deck.pptx to slide 17. Leave on-screen through Happy Hour. Music continues.</w:t>
+              <w:t xml:space="preserve">Leave Celebrations-Loop.pptx running on the main screen through Happy Hour. Music continues.</w:t>
             </w:r>
           </w:p>
         </w:tc>
@@ -4098,7 +3947,7 @@
             <w:pPr>
               <w:spacing w:after="40" w:before="0"/>
             </w:pPr>
-            <w:hyperlink w:history="1" r:id="rIdnrzhtpujnmbegevstlu_t">
+            <w:hyperlink w:history="1" r:id="rIdahd_pclgffydnzdf1l4yp">
               <w:r>
                 <w:rPr>
                   <w:rStyle w:val="Hyperlink"/>
@@ -4201,7 +4050,7 @@
             <w:pPr>
               <w:spacing w:after="40" w:before="0"/>
             </w:pPr>
-            <w:hyperlink w:history="1" r:id="rIdmd3sbsnhalonogzxhrzyv">
+            <w:hyperlink w:history="1" r:id="rIdbuwp_u6cbpc0fzxrnfocq">
               <w:r>
                 <w:rPr>
                   <w:rStyle w:val="Hyperlink"/>
@@ -4301,7 +4150,7 @@
             <w:pPr>
               <w:spacing w:after="40" w:before="0"/>
             </w:pPr>
-            <w:hyperlink w:history="1" r:id="rIdoirech_utbmq5q17sf_dn">
+            <w:hyperlink w:history="1" r:id="rId_-vvwlqmo2eo878wyyl8f">
               <w:r>
                 <w:rPr>
                   <w:rStyle w:val="Hyperlink"/>
@@ -4404,7 +4253,7 @@
             <w:pPr>
               <w:spacing w:after="40" w:before="0"/>
             </w:pPr>
-            <w:hyperlink w:history="1" r:id="rIdddp0w2e85-knusopcwa_b">
+            <w:hyperlink w:history="1" r:id="rIdxvwmrqe21lbc5lblduusx">
               <w:r>
                 <w:rPr>
                   <w:rStyle w:val="Hyperlink"/>
@@ -4688,7 +4537,7 @@
             <w:pPr>
               <w:spacing w:after="40" w:before="0"/>
             </w:pPr>
-            <w:hyperlink w:history="1" r:id="rIdo381ovjaoplbk6m1aqoso">
+            <w:hyperlink w:history="1" r:id="rIdotmy5x10qfunleuavo1f3">
               <w:r>
                 <w:rPr>
                   <w:rStyle w:val="Hyperlink"/>
@@ -4832,7 +4681,7 @@
             <w:pPr>
               <w:spacing w:after="40" w:before="0"/>
             </w:pPr>
-            <w:hyperlink w:history="1" r:id="rIdwlchcl2a4gs7epvcmsjq8">
+            <w:hyperlink w:history="1" r:id="rIdayaxv_wpbybs655iaklk0">
               <w:r>
                 <w:rPr>
                   <w:rStyle w:val="Hyperlink"/>
@@ -4976,7 +4825,7 @@
             <w:pPr>
               <w:spacing w:after="40" w:before="0"/>
             </w:pPr>
-            <w:hyperlink w:history="1" r:id="rIdft90lbbcbfvzyjrabpy_v">
+            <w:hyperlink w:history="1" r:id="rId-alkm0-nossfbtbvtos62">
               <w:r>
                 <w:rPr>
                   <w:rStyle w:val="Hyperlink"/>
@@ -5118,7 +4967,7 @@
             <w:pPr>
               <w:spacing w:after="40" w:before="0"/>
             </w:pPr>
-            <w:hyperlink w:history="1" r:id="rIdecz7h1bg2xg-se-9spt7z">
+            <w:hyperlink w:history="1" r:id="rIdc0ib4fv5v_iflvrwqp8t1">
               <w:r>
                 <w:rPr>
                   <w:rStyle w:val="Hyperlink"/>
@@ -5262,7 +5111,7 @@
             <w:pPr>
               <w:spacing w:after="40" w:before="0"/>
             </w:pPr>
-            <w:hyperlink w:history="1" r:id="rIddq5dpjhpcknbxqz1fldxj">
+            <w:hyperlink w:history="1" r:id="rId3vd9579nhrv2o4eksfsgu">
               <w:r>
                 <w:rPr>
                   <w:rStyle w:val="Hyperlink"/>
@@ -5404,7 +5253,7 @@
             <w:pPr>
               <w:spacing w:after="40" w:before="0"/>
             </w:pPr>
-            <w:hyperlink w:history="1" r:id="rIdbnz90sfbrvg2unnghexea">
+            <w:hyperlink w:history="1" r:id="rIdcbvmsqy_nqubs1sz36uv5">
               <w:r>
                 <w:rPr>
                   <w:rStyle w:val="Hyperlink"/>
@@ -5591,7 +5440,7 @@
               </w:rPr>
               <w:t xml:space="preserve">Default to </w:t>
             </w:r>
-            <w:hyperlink w:history="1" r:id="rIdhdghhdos15isjbgmitrjq">
+            <w:hyperlink w:history="1" r:id="rIdsfjufv4-olce9spvv4rlm">
               <w:r>
                 <w:rPr>
                   <w:rStyle w:val="Hyperlink"/>
@@ -5657,7 +5506,7 @@
         </w:rPr>
         <w:t xml:space="preserve">•  Pre-Lunch bridge (11:55 AM): </w:t>
       </w:r>
-      <w:hyperlink w:history="1" r:id="rId1tscfapdtmfxw64l9ziig">
+      <w:hyperlink w:history="1" r:id="rId96hogtzulsdkkwbfl6-qh">
         <w:r>
           <w:rPr>
             <w:rStyle w:val="Hyperlink"/>
@@ -5693,7 +5542,7 @@
         </w:rPr>
         <w:t xml:space="preserve">•  Post-Lunch return (1:00 PM): </w:t>
       </w:r>
-      <w:hyperlink w:history="1" r:id="rIdwiljlktv73tgpnuz9hew1">
+      <w:hyperlink w:history="1" r:id="rIdyoyjemguisnwtbi1p6frc">
         <w:r>
           <w:rPr>
             <w:rStyle w:val="Hyperlink"/>
@@ -5714,7 +5563,7 @@
         </w:rPr>
         <w:t xml:space="preserve"> by Dolly Parton, then resume </w:t>
       </w:r>
-      <w:hyperlink w:history="1" r:id="rIddp3s8b1nixt_g4gud6phn">
+      <w:hyperlink w:history="1" r:id="rIdvnzdg1std4b3_ii0cd6sr">
         <w:r>
           <w:rPr>
             <w:rStyle w:val="Hyperlink"/>
@@ -5780,20 +5629,10 @@
       <w:r>
         <w:rPr>
           <w:rFonts w:ascii="Calibri" w:cs="Calibri" w:eastAsia="Calibri" w:hAnsi="Calibri"/>
-          <w:b/>
-          <w:bCs/>
           <w:sz w:val="18"/>
           <w:szCs w:val="18"/>
         </w:rPr>
-        <w:t xml:space="preserve">Press Esc</w:t>
-      </w:r>
-      <w:r>
-        <w:rPr>
-          <w:rFonts w:ascii="Calibri" w:cs="Calibri" w:eastAsia="Calibri" w:hAnsi="Calibri"/>
-          <w:sz w:val="18"/>
-          <w:szCs w:val="18"/>
-        </w:rPr>
-        <w:t xml:space="preserve"> to exit the current master deck.</w:t>
+        <w:t xml:space="preserve">Fade the countdown playlist and play the speaker's walk-on song.</w:t>
       </w:r>
     </w:p>
     <w:p>
@@ -5826,7 +5665,7 @@
           <w:sz w:val="18"/>
           <w:szCs w:val="18"/>
         </w:rPr>
-        <w:t xml:space="preserve">deliverables/speaker-decks/</w:t>
+        <w:t xml:space="preserve">Speaker Decks/</w:t>
       </w:r>
       <w:r>
         <w:rPr>
@@ -5834,7 +5673,25 @@
           <w:sz w:val="18"/>
           <w:szCs w:val="18"/>
         </w:rPr>
-        <w:t xml:space="preserve"> in PowerPoint.</w:t>
+        <w:t xml:space="preserve"> in PowerPoint and press </w:t>
+      </w:r>
+      <w:r>
+        <w:rPr>
+          <w:rFonts w:ascii="Calibri" w:cs="Calibri" w:eastAsia="Calibri" w:hAnsi="Calibri"/>
+          <w:b/>
+          <w:bCs/>
+          <w:sz w:val="18"/>
+          <w:szCs w:val="18"/>
+        </w:rPr>
+        <w:t xml:space="preserve">F5</w:t>
+      </w:r>
+      <w:r>
+        <w:rPr>
+          <w:rFonts w:ascii="Calibri" w:cs="Calibri" w:eastAsia="Calibri" w:hAnsi="Calibri"/>
+          <w:sz w:val="18"/>
+          <w:szCs w:val="18"/>
+        </w:rPr>
+        <w:t xml:space="preserve"> to run the deck.</w:t>
       </w:r>
     </w:p>
     <w:p>
@@ -5850,39 +5707,6 @@
           <w:szCs w:val="18"/>
         </w:rPr>
         <w:t xml:space="preserve">   3.  </w:t>
-      </w:r>
-      <w:r>
-        <w:rPr>
-          <w:rFonts w:ascii="Calibri" w:cs="Calibri" w:eastAsia="Calibri" w:hAnsi="Calibri"/>
-          <w:b/>
-          <w:bCs/>
-          <w:sz w:val="18"/>
-          <w:szCs w:val="18"/>
-        </w:rPr>
-        <w:t xml:space="preserve">Press F5</w:t>
-      </w:r>
-      <w:r>
-        <w:rPr>
-          <w:rFonts w:ascii="Calibri" w:cs="Calibri" w:eastAsia="Calibri" w:hAnsi="Calibri"/>
-          <w:sz w:val="18"/>
-          <w:szCs w:val="18"/>
-        </w:rPr>
-        <w:t xml:space="preserve"> to run the presenter's deck.</w:t>
-      </w:r>
-    </w:p>
-    <w:p>
-      <w:pPr>
-        <w:spacing w:after="30" w:before="0"/>
-      </w:pPr>
-      <w:r>
-        <w:rPr>
-          <w:rFonts w:ascii="Calibri" w:cs="Calibri" w:eastAsia="Calibri" w:hAnsi="Calibri"/>
-          <w:b/>
-          <w:bCs/>
-          <w:sz w:val="18"/>
-          <w:szCs w:val="18"/>
-        </w:rPr>
-        <w:t xml:space="preserve">   4.  </w:t>
       </w:r>
       <w:r>
         <w:rPr>
@@ -5908,8 +5732,13 @@
           <w:sz w:val="18"/>
           <w:szCs w:val="18"/>
         </w:rPr>
-        <w:t xml:space="preserve"> and re-open </w:t>
+        <w:t xml:space="preserve">. Return to the timer page (or Celebrations Loop) on the main screen.</w:t>
       </w:r>
+    </w:p>
+    <w:p>
+      <w:pPr>
+        <w:spacing w:after="30" w:before="0"/>
+      </w:pPr>
       <w:r>
         <w:rPr>
           <w:rFonts w:ascii="Calibri" w:cs="Calibri" w:eastAsia="Calibri" w:hAnsi="Calibri"/>
@@ -5918,7 +5747,7 @@
           <w:sz w:val="18"/>
           <w:szCs w:val="18"/>
         </w:rPr>
-        <w:t xml:space="preserve">Deck.pptx</w:t>
+        <w:t xml:space="preserve">   4.  </w:t>
       </w:r>
       <w:r>
         <w:rPr>
@@ -5926,25 +5755,7 @@
           <w:sz w:val="18"/>
           <w:szCs w:val="18"/>
         </w:rPr>
-        <w:t xml:space="preserve">, then Slide Show » Custom Show » </w:t>
-      </w:r>
-      <w:r>
-        <w:rPr>
-          <w:rFonts w:ascii="Calibri" w:cs="Calibri" w:eastAsia="Calibri" w:hAnsi="Calibri"/>
-          <w:b/>
-          <w:bCs/>
-          <w:sz w:val="18"/>
-          <w:szCs w:val="18"/>
-        </w:rPr>
-        <w:t xml:space="preserve">Event</w:t>
-      </w:r>
-      <w:r>
-        <w:rPr>
-          <w:rFonts w:ascii="Calibri" w:cs="Calibri" w:eastAsia="Calibri" w:hAnsi="Calibri"/>
-          <w:sz w:val="18"/>
-          <w:szCs w:val="18"/>
-        </w:rPr>
-        <w:t xml:space="preserve"> to continue on the next master slide.</w:t>
+        <w:t xml:space="preserve">MC Max handles all segment transitions and sponsor thank-yous verbally between decks.</w:t>
       </w:r>
     </w:p>
     <w:p>
@@ -5999,7 +5810,7 @@
         </w:rPr>
         <w:t xml:space="preserve"> (deck / files / AV lead) · </w:t>
       </w:r>
-      <w:hyperlink w:history="1" r:id="rIdleam1atdm-wdcyobuogkp">
+      <w:hyperlink w:history="1" r:id="rIdhqfcvhbp6znbrzocr0sdg">
         <w:r>
           <w:rPr>
             <w:rStyle w:val="Hyperlink"/>
@@ -6018,7 +5829,7 @@
         </w:rPr>
         <w:t xml:space="preserve"> · </w:t>
       </w:r>
-      <w:hyperlink w:history="1" r:id="rId-3jz_icpxvp6panoetgvu">
+      <w:hyperlink w:history="1" r:id="rIdv5ocjihrycc2_8ipiwiu5">
         <w:r>
           <w:rPr>
             <w:rStyle w:val="Hyperlink"/>
@@ -6052,7 +5863,7 @@
         </w:rPr>
         <w:t xml:space="preserve"> (Day-of Show Operations (event lead, run of show)) · </w:t>
       </w:r>
-      <w:hyperlink w:history="1" r:id="rIdx9cxf61dsjw67ftn5hsc-">
+      <w:hyperlink w:history="1" r:id="rIduxoux501ryxc30pxzdaz5">
         <w:r>
           <w:rPr>
             <w:rStyle w:val="Hyperlink"/>
@@ -6071,7 +5882,7 @@
         </w:rPr>
         <w:t xml:space="preserve"> · </w:t>
       </w:r>
-      <w:hyperlink w:history="1" r:id="rIde4mfntrec7v-y5uum6ams">
+      <w:hyperlink w:history="1" r:id="rIdishyewkbapsvon11fnlj5">
         <w:r>
           <w:rPr>
             <w:rStyle w:val="Hyperlink"/>
@@ -6105,7 +5916,7 @@
         </w:rPr>
         <w:t xml:space="preserve"> (Venue Liaison (knows the Statler)) · </w:t>
       </w:r>
-      <w:hyperlink w:history="1" r:id="rIdlrxmidm7olstnjzsrxofp">
+      <w:hyperlink w:history="1" r:id="rId3q49m1v_vu-q9enplak2m">
         <w:r>
           <w:rPr>
             <w:rStyle w:val="Hyperlink"/>
@@ -6124,7 +5935,7 @@
         </w:rPr>
         <w:t xml:space="preserve"> · </w:t>
       </w:r>
-      <w:hyperlink w:history="1" r:id="rId8tw9frmjfqi_rzqg2snfd">
+      <w:hyperlink w:history="1" r:id="rId5afhe8-kjoqeayseh5aia">
         <w:r>
           <w:rPr>
             <w:rStyle w:val="Hyperlink"/>
@@ -6158,7 +5969,7 @@
         </w:rPr>
         <w:t xml:space="preserve"> (Encore / Statler AV contact) · </w:t>
       </w:r>
-      <w:hyperlink w:history="1" r:id="rIdhih5zno2ydfcquzuvoaig">
+      <w:hyperlink w:history="1" r:id="rId10i8bpguaqeootozqdevk">
         <w:r>
           <w:rPr>
             <w:rStyle w:val="Hyperlink"/>
@@ -6177,7 +5988,7 @@
         </w:rPr>
         <w:t xml:space="preserve"> · </w:t>
       </w:r>
-      <w:hyperlink w:history="1" r:id="rIdr7bkyhvxopvabo2ecaajd">
+      <w:hyperlink w:history="1" r:id="rIdfvsng636ryp1zbxdzpofr">
         <w:r>
           <w:rPr>
             <w:rStyle w:val="Hyperlink"/>
@@ -6211,7 +6022,7 @@
         </w:rPr>
         <w:t xml:space="preserve"> (MC (emcee)) · </w:t>
       </w:r>
-      <w:hyperlink w:history="1" r:id="rIdbvd_thzjdxwwtxirixfma">
+      <w:hyperlink w:history="1" r:id="rIdgr_n8578hxt2y6c9j5n9t">
         <w:r>
           <w:rPr>
             <w:rStyle w:val="Hyperlink"/>
@@ -6245,7 +6056,7 @@
         </w:rPr>
         <w:t xml:space="preserve"> (stage-side coordinator (eyes on stage all day, supports MC Max)) · </w:t>
       </w:r>
-      <w:hyperlink w:history="1" r:id="rId4zst6n7vsf_1lxbrzxvnz">
+      <w:hyperlink w:history="1" r:id="rIdydjgxilumdijpdnyub4p9">
         <w:r>
           <w:rPr>
             <w:rStyle w:val="Hyperlink"/>

</xml_diff>

<commit_message>
AV Timeline: alternate sponsors/celebrations loops per Shane (Pre-Ann sponsors, Pre-Brian celebrations, etc.)
</commit_message>
<xml_diff>
--- a/deliverables/av-package/AV-Timeline.docx
+++ b/deliverables/av-package/AV-Timeline.docx
@@ -102,7 +102,7 @@
             <w:pPr>
               <w:spacing w:after="40" w:before="0"/>
             </w:pPr>
-            <w:hyperlink w:history="1" r:id="rIdit8_w7fcoyurvhizlrip-">
+            <w:hyperlink w:history="1" r:id="rIddam_xsso4u4dhj7a0dcff">
               <w:r>
                 <w:rPr>
                   <w:rStyle w:val="Hyperlink"/>
@@ -180,7 +180,7 @@
             <w:pPr>
               <w:spacing w:after="40" w:before="0"/>
             </w:pPr>
-            <w:hyperlink w:history="1" r:id="rIdnv6sutaqb5xn3gj1f7lyy">
+            <w:hyperlink w:history="1" r:id="rIdncnr6zc19mbvearknqnfg">
               <w:r>
                 <w:rPr>
                   <w:rStyle w:val="Hyperlink"/>
@@ -199,7 +199,7 @@
               </w:rPr>
               <w:t xml:space="preserve"> · </w:t>
             </w:r>
-            <w:hyperlink w:history="1" r:id="rIdma8u3wynk8jei6picqc61">
+            <w:hyperlink w:history="1" r:id="rId28sia1tqpxtdo-3owyk_u">
               <w:r>
                 <w:rPr>
                   <w:rStyle w:val="Hyperlink"/>
@@ -218,7 +218,7 @@
               </w:rPr>
               <w:t xml:space="preserve"> · </w:t>
             </w:r>
-            <w:hyperlink w:history="1" r:id="rIdgxkylfe29xy1vi2z9h-s6">
+            <w:hyperlink w:history="1" r:id="rIdfs49ixumsdl5xerreszgm">
               <w:r>
                 <w:rPr>
                   <w:rStyle w:val="Hyperlink"/>
@@ -237,7 +237,7 @@
               </w:rPr>
               <w:t xml:space="preserve"> · </w:t>
             </w:r>
-            <w:hyperlink w:history="1" r:id="rIdij99f_kylpwtfcpsyguvm">
+            <w:hyperlink w:history="1" r:id="rIdpmfunblyoaxl9p2gw9zvf">
               <w:r>
                 <w:rPr>
                   <w:rStyle w:val="Hyperlink"/>
@@ -404,7 +404,82 @@
                 <w:sz w:val="18"/>
                 <w:szCs w:val="18"/>
               </w:rPr>
-              <w:t xml:space="preserve"> · 18-slide auto-looping customer wins deck. Optional visual for breaks or between speakers if you want something other than the timer page.</w:t>
+              <w:t xml:space="preserve"> · 18-slide auto-looping customer wins deck. Runs in kiosk mode (F5) and loops continuously until Esc.</w:t>
+            </w:r>
+          </w:p>
+        </w:tc>
+      </w:tr>
+      <w:tr>
+        <w:tc>
+          <w:tcPr>
+            <w:tcW w:type="dxa" w:w="2000"/>
+            <w:tcBorders>
+              <w:top w:val="single" w:color="D4D1CA" w:sz="4"/>
+              <w:left w:val="single" w:color="D4D1CA" w:sz="4"/>
+              <w:bottom w:val="single" w:color="D4D1CA" w:sz="4"/>
+              <w:right w:val="single" w:color="D4D1CA" w:sz="4"/>
+            </w:tcBorders>
+            <w:shd w:fill="0B1F3A" w:val="clear"/>
+            <w:tcMar>
+              <w:top w:type="dxa" w:w="80"/>
+              <w:left w:type="dxa" w:w="120"/>
+              <w:bottom w:type="dxa" w:w="80"/>
+              <w:right w:type="dxa" w:w="120"/>
+            </w:tcMar>
+            <w:vAlign w:val="center"/>
+          </w:tcPr>
+          <w:p>
+            <w:r>
+              <w:rPr>
+                <w:rFonts w:ascii="Calibri" w:cs="Calibri" w:eastAsia="Calibri" w:hAnsi="Calibri"/>
+                <w:b/>
+                <w:bCs/>
+                <w:color w:val="FFFFFF"/>
+                <w:sz w:val="18"/>
+                <w:szCs w:val="18"/>
+              </w:rPr>
+              <w:t xml:space="preserve">BREAK PATTERN</w:t>
+            </w:r>
+          </w:p>
+        </w:tc>
+        <w:tc>
+          <w:tcPr>
+            <w:tcW w:type="dxa" w:w="12400"/>
+            <w:tcBorders>
+              <w:top w:val="single" w:color="D4D1CA" w:sz="4"/>
+              <w:left w:val="single" w:color="D4D1CA" w:sz="4"/>
+              <w:bottom w:val="single" w:color="D4D1CA" w:sz="4"/>
+              <w:right w:val="single" w:color="D4D1CA" w:sz="4"/>
+            </w:tcBorders>
+            <w:tcMar>
+              <w:top w:type="dxa" w:w="80"/>
+              <w:left w:type="dxa" w:w="100"/>
+              <w:bottom w:type="dxa" w:w="80"/>
+              <w:right w:type="dxa" w:w="100"/>
+            </w:tcMar>
+            <w:vAlign w:val="center"/>
+          </w:tcPr>
+          <w:p>
+            <w:pPr>
+              <w:spacing w:after="40" w:before="0"/>
+            </w:pPr>
+            <w:r>
+              <w:rPr>
+                <w:rFonts w:ascii="Calibri" w:cs="Calibri" w:eastAsia="Calibri" w:hAnsi="Calibri"/>
+                <w:b/>
+                <w:bCs/>
+                <w:sz w:val="18"/>
+                <w:szCs w:val="18"/>
+              </w:rPr>
+              <w:t xml:space="preserve">Alternating breaks per Shane: </w:t>
+            </w:r>
+            <w:r>
+              <w:rPr>
+                <w:rFonts w:ascii="Calibri" w:cs="Calibri" w:eastAsia="Calibri" w:hAnsi="Calibri"/>
+                <w:sz w:val="18"/>
+                <w:szCs w:val="18"/>
+              </w:rPr>
+              <w:t xml:space="preserve">sponsors loop (timer page) before Ann · celebrations loop before Brian · sponsors before Steve · celebrations for the 30-min lunch before Walt · sponsors before Mark S. · celebrations before Beth · sponsors before Mark W. See each break row below.</w:t>
             </w:r>
           </w:p>
         </w:tc>
@@ -728,10 +803,20 @@
             <w:r>
               <w:rPr>
                 <w:rFonts w:ascii="Calibri" w:cs="Calibri" w:eastAsia="Calibri" w:hAnsi="Calibri"/>
-                <w:sz w:val="18"/>
-                <w:szCs w:val="18"/>
-              </w:rPr>
-              <w:t xml:space="preserve">Timer page (countdown to 8:00)</w:t>
+                <w:b/>
+                <w:bCs/>
+                <w:sz w:val="18"/>
+                <w:szCs w:val="18"/>
+              </w:rPr>
+              <w:t xml:space="preserve">Sponsors loop: </w:t>
+            </w:r>
+            <w:r>
+              <w:rPr>
+                <w:rFonts w:ascii="Calibri" w:cs="Calibri" w:eastAsia="Calibri" w:hAnsi="Calibri"/>
+                <w:sz w:val="18"/>
+                <w:szCs w:val="18"/>
+              </w:rPr>
+              <w:t xml:space="preserve">timer page (countdown to 8:00 with scrolling sponsor logos)</w:t>
             </w:r>
           </w:p>
         </w:tc>
@@ -756,7 +841,7 @@
             <w:pPr>
               <w:spacing w:after="40" w:before="0"/>
             </w:pPr>
-            <w:hyperlink w:history="1" r:id="rIdnyiftd2yy52snoaiidy0n">
+            <w:hyperlink w:history="1" r:id="rId7g4hb52scwip7_1c5qrma">
               <w:r>
                 <w:rPr>
                   <w:rStyle w:val="Hyperlink"/>
@@ -793,12 +878,22 @@
             <w:r>
               <w:rPr>
                 <w:rFonts w:ascii="Calibri" w:cs="Calibri" w:eastAsia="Calibri" w:hAnsi="Calibri"/>
+                <w:b/>
+                <w:bCs/>
+                <w:sz w:val="18"/>
+                <w:szCs w:val="18"/>
+              </w:rPr>
+              <w:t xml:space="preserve">Pre-Ann: </w:t>
+            </w:r>
+            <w:r>
+              <w:rPr>
+                <w:rFonts w:ascii="Calibri" w:cs="Calibri" w:eastAsia="Calibri" w:hAnsi="Calibri"/>
                 <w:sz w:val="18"/>
                 <w:szCs w:val="18"/>
               </w:rPr>
               <w:t xml:space="preserve">Open </w:t>
             </w:r>
-            <w:hyperlink w:history="1" r:id="rIdqabjds-ptfyhy56dg8t3f">
+            <w:hyperlink w:history="1" r:id="rIdg-w_rd5bpd11-mohaj6gk">
               <w:r>
                 <w:rPr>
                   <w:rStyle w:val="Hyperlink"/>
@@ -815,7 +910,7 @@
                 <w:sz w:val="18"/>
                 <w:szCs w:val="18"/>
               </w:rPr>
-              <w:t xml:space="preserve"> on main screen. Start playlist.</w:t>
+              <w:t xml:space="preserve"> on main screen. Sponsors scroll across the top. Start playlist.</w:t>
             </w:r>
           </w:p>
         </w:tc>
@@ -965,7 +1060,7 @@
               </w:rPr>
               <w:t xml:space="preserve">Walk-on: </w:t>
             </w:r>
-            <w:hyperlink w:history="1" r:id="rIdtnsvzcquxdcs08prmieqt">
+            <w:hyperlink w:history="1" r:id="rIdk_ybm_rysmwergrk7vury">
               <w:r>
                 <w:rPr>
                   <w:rStyle w:val="Hyperlink"/>
@@ -1118,10 +1213,20 @@
             <w:r>
               <w:rPr>
                 <w:rFonts w:ascii="Calibri" w:cs="Calibri" w:eastAsia="Calibri" w:hAnsi="Calibri"/>
-                <w:sz w:val="18"/>
-                <w:szCs w:val="18"/>
-              </w:rPr>
-              <w:t xml:space="preserve">Timer page (countdown to 9:50)</w:t>
+                <w:b/>
+                <w:bCs/>
+                <w:sz w:val="18"/>
+                <w:szCs w:val="18"/>
+              </w:rPr>
+              <w:t xml:space="preserve">Celebrations loop: </w:t>
+            </w:r>
+            <w:r>
+              <w:rPr>
+                <w:rFonts w:ascii="Calibri" w:cs="Calibri" w:eastAsia="Calibri" w:hAnsi="Calibri"/>
+                <w:sz w:val="18"/>
+                <w:szCs w:val="18"/>
+              </w:rPr>
+              <w:t xml:space="preserve">run Celebrations-Loop.pptx (F5, kiosk mode)</w:t>
             </w:r>
           </w:p>
         </w:tc>
@@ -1146,7 +1251,7 @@
             <w:pPr>
               <w:spacing w:after="40" w:before="0"/>
             </w:pPr>
-            <w:hyperlink w:history="1" r:id="rIdvyyxrnz9qdvnpnmejpj46">
+            <w:hyperlink w:history="1" r:id="rIdhqrf1qa3ztk8q-y-w1bx-">
               <w:r>
                 <w:rPr>
                   <w:rStyle w:val="Hyperlink"/>
@@ -1183,29 +1288,74 @@
             <w:r>
               <w:rPr>
                 <w:rFonts w:ascii="Calibri" w:cs="Calibri" w:eastAsia="Calibri" w:hAnsi="Calibri"/>
-                <w:sz w:val="18"/>
-                <w:szCs w:val="18"/>
-              </w:rPr>
-              <w:t xml:space="preserve">One-click: </w:t>
-            </w:r>
-            <w:hyperlink w:history="1" r:id="rIdvider5tjlo0fzwwzvrprr">
-              <w:r>
-                <w:rPr>
-                  <w:rStyle w:val="Hyperlink"/>
-                  <w:rFonts w:ascii="Calibri" w:cs="Calibri" w:eastAsia="Calibri" w:hAnsi="Calibri"/>
-                  <w:sz w:val="18"/>
-                  <w:szCs w:val="18"/>
-                </w:rPr>
-                <w:t xml:space="preserve">countdown to 9:50 AM</w:t>
-              </w:r>
-            </w:hyperlink>
-            <w:r>
-              <w:rPr>
-                <w:rFonts w:ascii="Calibri" w:cs="Calibri" w:eastAsia="Calibri" w:hAnsi="Calibri"/>
-                <w:sz w:val="18"/>
-                <w:szCs w:val="18"/>
-              </w:rPr>
-              <w:t xml:space="preserve">. Resume playlist.</w:t>
+                <w:b/>
+                <w:bCs/>
+                <w:sz w:val="18"/>
+                <w:szCs w:val="18"/>
+              </w:rPr>
+              <w:t xml:space="preserve">Pre-Brian: </w:t>
+            </w:r>
+            <w:r>
+              <w:rPr>
+                <w:rFonts w:ascii="Calibri" w:cs="Calibri" w:eastAsia="Calibri" w:hAnsi="Calibri"/>
+                <w:sz w:val="18"/>
+                <w:szCs w:val="18"/>
+              </w:rPr>
+              <w:t xml:space="preserve">Launch </w:t>
+            </w:r>
+            <w:r>
+              <w:rPr>
+                <w:rFonts w:ascii="Calibri" w:cs="Calibri" w:eastAsia="Calibri" w:hAnsi="Calibri"/>
+                <w:b/>
+                <w:bCs/>
+                <w:sz w:val="18"/>
+                <w:szCs w:val="18"/>
+              </w:rPr>
+              <w:t xml:space="preserve">Celebrations-Loop.pptx</w:t>
+            </w:r>
+            <w:r>
+              <w:rPr>
+                <w:rFonts w:ascii="Calibri" w:cs="Calibri" w:eastAsia="Calibri" w:hAnsi="Calibri"/>
+                <w:sz w:val="18"/>
+                <w:szCs w:val="18"/>
+              </w:rPr>
+              <w:t xml:space="preserve"> on main screen and press </w:t>
+            </w:r>
+            <w:r>
+              <w:rPr>
+                <w:rFonts w:ascii="Calibri" w:cs="Calibri" w:eastAsia="Calibri" w:hAnsi="Calibri"/>
+                <w:b/>
+                <w:bCs/>
+                <w:sz w:val="18"/>
+                <w:szCs w:val="18"/>
+              </w:rPr>
+              <w:t xml:space="preserve">F5</w:t>
+            </w:r>
+            <w:r>
+              <w:rPr>
+                <w:rFonts w:ascii="Calibri" w:cs="Calibri" w:eastAsia="Calibri" w:hAnsi="Calibri"/>
+                <w:sz w:val="18"/>
+                <w:szCs w:val="18"/>
+              </w:rPr>
+              <w:t xml:space="preserve">. Resume playlist. Deck auto-loops until you press </w:t>
+            </w:r>
+            <w:r>
+              <w:rPr>
+                <w:rFonts w:ascii="Calibri" w:cs="Calibri" w:eastAsia="Calibri" w:hAnsi="Calibri"/>
+                <w:b/>
+                <w:bCs/>
+                <w:sz w:val="18"/>
+                <w:szCs w:val="18"/>
+              </w:rPr>
+              <w:t xml:space="preserve">Esc</w:t>
+            </w:r>
+            <w:r>
+              <w:rPr>
+                <w:rFonts w:ascii="Calibri" w:cs="Calibri" w:eastAsia="Calibri" w:hAnsi="Calibri"/>
+                <w:sz w:val="18"/>
+                <w:szCs w:val="18"/>
+              </w:rPr>
+              <w:t xml:space="preserve">.</w:t>
             </w:r>
           </w:p>
         </w:tc>
@@ -1355,7 +1505,7 @@
               </w:rPr>
               <w:t xml:space="preserve">Walk-on: </w:t>
             </w:r>
-            <w:hyperlink w:history="1" r:id="rId_4x9j7trjkv-yikv47ruc">
+            <w:hyperlink w:history="1" r:id="rIdzh9qz-8eednpisvozrdkm">
               <w:r>
                 <w:rPr>
                   <w:rStyle w:val="Hyperlink"/>
@@ -1498,10 +1648,20 @@
             <w:r>
               <w:rPr>
                 <w:rFonts w:ascii="Calibri" w:cs="Calibri" w:eastAsia="Calibri" w:hAnsi="Calibri"/>
-                <w:sz w:val="18"/>
-                <w:szCs w:val="18"/>
-              </w:rPr>
-              <w:t xml:space="preserve">Timer page (countdown to 10:55)</w:t>
+                <w:b/>
+                <w:bCs/>
+                <w:sz w:val="18"/>
+                <w:szCs w:val="18"/>
+              </w:rPr>
+              <w:t xml:space="preserve">Sponsors loop: </w:t>
+            </w:r>
+            <w:r>
+              <w:rPr>
+                <w:rFonts w:ascii="Calibri" w:cs="Calibri" w:eastAsia="Calibri" w:hAnsi="Calibri"/>
+                <w:sz w:val="18"/>
+                <w:szCs w:val="18"/>
+              </w:rPr>
+              <w:t xml:space="preserve">timer page (countdown to 10:55 with scrolling sponsor logos)</w:t>
             </w:r>
           </w:p>
         </w:tc>
@@ -1526,7 +1686,7 @@
             <w:pPr>
               <w:spacing w:after="40" w:before="0"/>
             </w:pPr>
-            <w:hyperlink w:history="1" r:id="rIdemgm94dsks4eodgeny3dx">
+            <w:hyperlink w:history="1" r:id="rIdscrzzpfj89q3xg7wqdu_g">
               <w:r>
                 <w:rPr>
                   <w:rStyle w:val="Hyperlink"/>
@@ -1563,12 +1723,40 @@
             <w:r>
               <w:rPr>
                 <w:rFonts w:ascii="Calibri" w:cs="Calibri" w:eastAsia="Calibri" w:hAnsi="Calibri"/>
-                <w:sz w:val="18"/>
-                <w:szCs w:val="18"/>
-              </w:rPr>
-              <w:t xml:space="preserve">One-click: </w:t>
-            </w:r>
-            <w:hyperlink w:history="1" r:id="rIdr6vkwh8v94vtvth3u4kx5">
+                <w:b/>
+                <w:bCs/>
+                <w:sz w:val="18"/>
+                <w:szCs w:val="18"/>
+              </w:rPr>
+              <w:t xml:space="preserve">Pre-Steve: </w:t>
+            </w:r>
+            <w:r>
+              <w:rPr>
+                <w:rFonts w:ascii="Calibri" w:cs="Calibri" w:eastAsia="Calibri" w:hAnsi="Calibri"/>
+                <w:sz w:val="18"/>
+                <w:szCs w:val="18"/>
+              </w:rPr>
+              <w:t xml:space="preserve">Press </w:t>
+            </w:r>
+            <w:r>
+              <w:rPr>
+                <w:rFonts w:ascii="Calibri" w:cs="Calibri" w:eastAsia="Calibri" w:hAnsi="Calibri"/>
+                <w:b/>
+                <w:bCs/>
+                <w:sz w:val="18"/>
+                <w:szCs w:val="18"/>
+              </w:rPr>
+              <w:t xml:space="preserve">Esc</w:t>
+            </w:r>
+            <w:r>
+              <w:rPr>
+                <w:rFonts w:ascii="Calibri" w:cs="Calibri" w:eastAsia="Calibri" w:hAnsi="Calibri"/>
+                <w:sz w:val="18"/>
+                <w:szCs w:val="18"/>
+              </w:rPr>
+              <w:t xml:space="preserve"> to exit Celebrations loop. One-click: </w:t>
+            </w:r>
+            <w:hyperlink w:history="1" r:id="rId5yx6vdfjsj3_zr4bbl9rp">
               <w:r>
                 <w:rPr>
                   <w:rStyle w:val="Hyperlink"/>
@@ -1735,7 +1923,7 @@
               </w:rPr>
               <w:t xml:space="preserve">Walk-on: </w:t>
             </w:r>
-            <w:hyperlink w:history="1" r:id="rIdrmtdsbxssfsbub6ubfwg4">
+            <w:hyperlink w:history="1" r:id="rIdbj3j9ajreiiz5xjc9ohoz">
               <w:r>
                 <w:rPr>
                   <w:rStyle w:val="Hyperlink"/>
@@ -1878,10 +2066,20 @@
             <w:r>
               <w:rPr>
                 <w:rFonts w:ascii="Calibri" w:cs="Calibri" w:eastAsia="Calibri" w:hAnsi="Calibri"/>
-                <w:sz w:val="18"/>
-                <w:szCs w:val="18"/>
-              </w:rPr>
-              <w:t xml:space="preserve">Lunch title card</w:t>
+                <w:b/>
+                <w:bCs/>
+                <w:sz w:val="18"/>
+                <w:szCs w:val="18"/>
+              </w:rPr>
+              <w:t xml:space="preserve">Celebrations loop: </w:t>
+            </w:r>
+            <w:r>
+              <w:rPr>
+                <w:rFonts w:ascii="Calibri" w:cs="Calibri" w:eastAsia="Calibri" w:hAnsi="Calibri"/>
+                <w:sz w:val="18"/>
+                <w:szCs w:val="18"/>
+              </w:rPr>
+              <w:t xml:space="preserve">run Celebrations-Loop.pptx (F5, kiosk mode) — loops through the bridge until Walt takes the stage at 12:00</w:t>
             </w:r>
           </w:p>
         </w:tc>
@@ -1916,7 +2114,7 @@
               </w:rPr>
               <w:t xml:space="preserve">Pre-Lunch: </w:t>
             </w:r>
-            <w:hyperlink w:history="1" r:id="rIdkcyqjgvbec04wxkdfuizj">
+            <w:hyperlink w:history="1" r:id="rIdww2p6jcsveiqwwrtu6puc">
               <w:r>
                 <w:rPr>
                   <w:rStyle w:val="Hyperlink"/>
@@ -1963,10 +2161,56 @@
             <w:r>
               <w:rPr>
                 <w:rFonts w:ascii="Calibri" w:cs="Calibri" w:eastAsia="Calibri" w:hAnsi="Calibri"/>
-                <w:sz w:val="18"/>
-                <w:szCs w:val="18"/>
-              </w:rPr>
-              <w:t xml:space="preserve">Play pre-lunch song as guests transition to lunch tables.</w:t>
+                <w:b/>
+                <w:bCs/>
+                <w:sz w:val="18"/>
+                <w:szCs w:val="18"/>
+              </w:rPr>
+              <w:t xml:space="preserve">Post-Steve: </w:t>
+            </w:r>
+            <w:r>
+              <w:rPr>
+                <w:rFonts w:ascii="Calibri" w:cs="Calibri" w:eastAsia="Calibri" w:hAnsi="Calibri"/>
+                <w:sz w:val="18"/>
+                <w:szCs w:val="18"/>
+              </w:rPr>
+              <w:t xml:space="preserve">Launch </w:t>
+            </w:r>
+            <w:r>
+              <w:rPr>
+                <w:rFonts w:ascii="Calibri" w:cs="Calibri" w:eastAsia="Calibri" w:hAnsi="Calibri"/>
+                <w:b/>
+                <w:bCs/>
+                <w:sz w:val="18"/>
+                <w:szCs w:val="18"/>
+              </w:rPr>
+              <w:t xml:space="preserve">Celebrations-Loop.pptx</w:t>
+            </w:r>
+            <w:r>
+              <w:rPr>
+                <w:rFonts w:ascii="Calibri" w:cs="Calibri" w:eastAsia="Calibri" w:hAnsi="Calibri"/>
+                <w:sz w:val="18"/>
+                <w:szCs w:val="18"/>
+              </w:rPr>
+              <w:t xml:space="preserve"> on main screen and press </w:t>
+            </w:r>
+            <w:r>
+              <w:rPr>
+                <w:rFonts w:ascii="Calibri" w:cs="Calibri" w:eastAsia="Calibri" w:hAnsi="Calibri"/>
+                <w:b/>
+                <w:bCs/>
+                <w:sz w:val="18"/>
+                <w:szCs w:val="18"/>
+              </w:rPr>
+              <w:t xml:space="preserve">F5</w:t>
+            </w:r>
+            <w:r>
+              <w:rPr>
+                <w:rFonts w:ascii="Calibri" w:cs="Calibri" w:eastAsia="Calibri" w:hAnsi="Calibri"/>
+                <w:sz w:val="18"/>
+                <w:szCs w:val="18"/>
+              </w:rPr>
+              <w:t xml:space="preserve">. Play pre-lunch song as guests transition. Deck auto-loops until Walt takes the stage (per Shane's plan the loop should be ready to fill ~30 min if Walt's start slips while guests are seated).</w:t>
             </w:r>
           </w:p>
         </w:tc>
@@ -2150,7 +2394,7 @@
               </w:rPr>
               <w:t xml:space="preserve">Walk-on: </w:t>
             </w:r>
-            <w:hyperlink w:history="1" r:id="rIdmcebcynsrjqjrcgse-hfi">
+            <w:hyperlink w:history="1" r:id="rId5nbohpqbhh1sitikssjuu">
               <w:r>
                 <w:rPr>
                   <w:rStyle w:val="Hyperlink"/>
@@ -2201,7 +2445,43 @@
                 <w:sz w:val="18"/>
                 <w:szCs w:val="18"/>
               </w:rPr>
-              <w:t xml:space="preserve">Load Walt Brown — 7 Critical Needs (fixed).pptx. Play walk-on when Walt takes the stage after guests are seated.</w:t>
+              <w:t xml:space="preserve">Press </w:t>
+            </w:r>
+            <w:r>
+              <w:rPr>
+                <w:rFonts w:ascii="Calibri" w:cs="Calibri" w:eastAsia="Calibri" w:hAnsi="Calibri"/>
+                <w:b/>
+                <w:bCs/>
+                <w:sz w:val="18"/>
+                <w:szCs w:val="18"/>
+              </w:rPr>
+              <w:t xml:space="preserve">Esc</w:t>
+            </w:r>
+            <w:r>
+              <w:rPr>
+                <w:rFonts w:ascii="Calibri" w:cs="Calibri" w:eastAsia="Calibri" w:hAnsi="Calibri"/>
+                <w:sz w:val="18"/>
+                <w:szCs w:val="18"/>
+              </w:rPr>
+              <w:t xml:space="preserve"> to exit Celebrations loop. Load </w:t>
+            </w:r>
+            <w:r>
+              <w:rPr>
+                <w:rFonts w:ascii="Calibri" w:cs="Calibri" w:eastAsia="Calibri" w:hAnsi="Calibri"/>
+                <w:b/>
+                <w:bCs/>
+                <w:sz w:val="18"/>
+                <w:szCs w:val="18"/>
+              </w:rPr>
+              <w:t xml:space="preserve">Walt Brown — 7 Critical Needs (fixed).pptx</w:t>
+            </w:r>
+            <w:r>
+              <w:rPr>
+                <w:rFonts w:ascii="Calibri" w:cs="Calibri" w:eastAsia="Calibri" w:hAnsi="Calibri"/>
+                <w:sz w:val="18"/>
+                <w:szCs w:val="18"/>
+              </w:rPr>
+              <w:t xml:space="preserve">. Play walk-on when Walt takes the stage after guests are seated.</w:t>
             </w:r>
           </w:p>
         </w:tc>
@@ -2290,24 +2570,23 @@
             <w:pPr>
               <w:spacing w:after="40" w:before="0"/>
             </w:pPr>
-            <w:hyperlink w:history="1" r:id="rIdyd_bknjarrubnsj1iozn3">
-              <w:r>
-                <w:rPr>
-                  <w:rStyle w:val="Hyperlink"/>
-                  <w:rFonts w:ascii="Calibri" w:cs="Calibri" w:eastAsia="Calibri" w:hAnsi="Calibri"/>
-                  <w:sz w:val="18"/>
-                  <w:szCs w:val="18"/>
-                </w:rPr>
-                <w:t xml:space="preserve">Timer countdown to 1:10 PM</w:t>
-              </w:r>
-            </w:hyperlink>
-            <w:r>
-              <w:rPr>
-                <w:rFonts w:ascii="Calibri" w:cs="Calibri" w:eastAsia="Calibri" w:hAnsi="Calibri"/>
-                <w:sz w:val="18"/>
-                <w:szCs w:val="18"/>
-              </w:rPr>
-              <w:t xml:space="preserve"> (or Celebrations Loop)</w:t>
+            <w:r>
+              <w:rPr>
+                <w:rFonts w:ascii="Calibri" w:cs="Calibri" w:eastAsia="Calibri" w:hAnsi="Calibri"/>
+                <w:b/>
+                <w:bCs/>
+                <w:sz w:val="18"/>
+                <w:szCs w:val="18"/>
+              </w:rPr>
+              <w:t xml:space="preserve">Sponsors loop: </w:t>
+            </w:r>
+            <w:r>
+              <w:rPr>
+                <w:rFonts w:ascii="Calibri" w:cs="Calibri" w:eastAsia="Calibri" w:hAnsi="Calibri"/>
+                <w:sz w:val="18"/>
+                <w:szCs w:val="18"/>
+              </w:rPr>
+              <w:t xml:space="preserve">timer page (countdown to 1:10 with scrolling sponsor logos)</w:t>
             </w:r>
           </w:p>
         </w:tc>
@@ -2342,7 +2621,7 @@
               </w:rPr>
               <w:t xml:space="preserve">Post-Lunch: </w:t>
             </w:r>
-            <w:hyperlink w:history="1" r:id="rId33dsjdc1ssvepbd0yx2ry">
+            <w:hyperlink w:history="1" r:id="rId60l0o41dsvrti9xnmhpxo">
               <w:r>
                 <w:rPr>
                   <w:rStyle w:val="Hyperlink"/>
@@ -2363,7 +2642,7 @@
               </w:rPr>
               <w:t xml:space="preserve"> — Dolly Parton, then </w:t>
             </w:r>
-            <w:hyperlink w:history="1" r:id="rIdclddg0jk5dad1ph98utf4">
+            <w:hyperlink w:history="1" r:id="rId2v87qlgze9sznefh68xp2">
               <w:r>
                 <w:rPr>
                   <w:rStyle w:val="Hyperlink"/>
@@ -2400,12 +2679,40 @@
             <w:r>
               <w:rPr>
                 <w:rFonts w:ascii="Calibri" w:cs="Calibri" w:eastAsia="Calibri" w:hAnsi="Calibri"/>
-                <w:sz w:val="18"/>
-                <w:szCs w:val="18"/>
-              </w:rPr>
-              <w:t xml:space="preserve">Play post-lunch song. One-click: </w:t>
-            </w:r>
-            <w:hyperlink w:history="1" r:id="rIdpjbjoqanduyxnc_7e_os0">
+                <w:b/>
+                <w:bCs/>
+                <w:sz w:val="18"/>
+                <w:szCs w:val="18"/>
+              </w:rPr>
+              <w:t xml:space="preserve">Pre-Mark S.: </w:t>
+            </w:r>
+            <w:r>
+              <w:rPr>
+                <w:rFonts w:ascii="Calibri" w:cs="Calibri" w:eastAsia="Calibri" w:hAnsi="Calibri"/>
+                <w:sz w:val="18"/>
+                <w:szCs w:val="18"/>
+              </w:rPr>
+              <w:t xml:space="preserve">Press </w:t>
+            </w:r>
+            <w:r>
+              <w:rPr>
+                <w:rFonts w:ascii="Calibri" w:cs="Calibri" w:eastAsia="Calibri" w:hAnsi="Calibri"/>
+                <w:b/>
+                <w:bCs/>
+                <w:sz w:val="18"/>
+                <w:szCs w:val="18"/>
+              </w:rPr>
+              <w:t xml:space="preserve">Esc</w:t>
+            </w:r>
+            <w:r>
+              <w:rPr>
+                <w:rFonts w:ascii="Calibri" w:cs="Calibri" w:eastAsia="Calibri" w:hAnsi="Calibri"/>
+                <w:sz w:val="18"/>
+                <w:szCs w:val="18"/>
+              </w:rPr>
+              <w:t xml:space="preserve"> to exit lunch Celebrations loop. Play post-lunch song. One-click: </w:t>
+            </w:r>
+            <w:hyperlink w:history="1" r:id="rIdvadabb4rje2rlzoxqkpen">
               <w:r>
                 <w:rPr>
                   <w:rStyle w:val="Hyperlink"/>
@@ -2422,7 +2729,7 @@
                 <w:sz w:val="18"/>
                 <w:szCs w:val="18"/>
               </w:rPr>
-              <w:t xml:space="preserve">.</w:t>
+              <w:t xml:space="preserve">. Resume playlist.</w:t>
             </w:r>
           </w:p>
         </w:tc>
@@ -2606,7 +2913,7 @@
               </w:rPr>
               <w:t xml:space="preserve">Walk-on: </w:t>
             </w:r>
-            <w:hyperlink w:history="1" r:id="rId7brbec7d7sistphmydihp">
+            <w:hyperlink w:history="1" r:id="rIdni8gxhu_dno4n9osaluuf">
               <w:r>
                 <w:rPr>
                   <w:rStyle w:val="Hyperlink"/>
@@ -2767,10 +3074,20 @@
             <w:r>
               <w:rPr>
                 <w:rFonts w:ascii="Calibri" w:cs="Calibri" w:eastAsia="Calibri" w:hAnsi="Calibri"/>
-                <w:sz w:val="18"/>
-                <w:szCs w:val="18"/>
-              </w:rPr>
-              <w:t xml:space="preserve">Timer page (countdown to 2:55) OR Celebrations Loop</w:t>
+                <w:b/>
+                <w:bCs/>
+                <w:sz w:val="18"/>
+                <w:szCs w:val="18"/>
+              </w:rPr>
+              <w:t xml:space="preserve">Celebrations loop: </w:t>
+            </w:r>
+            <w:r>
+              <w:rPr>
+                <w:rFonts w:ascii="Calibri" w:cs="Calibri" w:eastAsia="Calibri" w:hAnsi="Calibri"/>
+                <w:sz w:val="18"/>
+                <w:szCs w:val="18"/>
+              </w:rPr>
+              <w:t xml:space="preserve">run Celebrations-Loop.pptx (F5, kiosk mode)</w:t>
             </w:r>
           </w:p>
         </w:tc>
@@ -2795,7 +3112,7 @@
             <w:pPr>
               <w:spacing w:after="40" w:before="0"/>
             </w:pPr>
-            <w:hyperlink w:history="1" r:id="rIdqb5pd_9skaebrf9_auatj">
+            <w:hyperlink w:history="1" r:id="rIdibh7-93aasaoh3zhuwiox">
               <w:r>
                 <w:rPr>
                   <w:rStyle w:val="Hyperlink"/>
@@ -2832,47 +3149,74 @@
             <w:r>
               <w:rPr>
                 <w:rFonts w:ascii="Calibri" w:cs="Calibri" w:eastAsia="Calibri" w:hAnsi="Calibri"/>
-                <w:sz w:val="18"/>
-                <w:szCs w:val="18"/>
-              </w:rPr>
-              <w:t xml:space="preserve">One-click: </w:t>
-            </w:r>
-            <w:hyperlink w:history="1" r:id="rIda2ebhcknke8bcnn1-du6w">
-              <w:r>
-                <w:rPr>
-                  <w:rStyle w:val="Hyperlink"/>
-                  <w:rFonts w:ascii="Calibri" w:cs="Calibri" w:eastAsia="Calibri" w:hAnsi="Calibri"/>
-                  <w:sz w:val="18"/>
-                  <w:szCs w:val="18"/>
-                </w:rPr>
-                <w:t xml:space="preserve">countdown to 2:55 PM</w:t>
-              </w:r>
-            </w:hyperlink>
-            <w:r>
-              <w:rPr>
-                <w:rFonts w:ascii="Calibri" w:cs="Calibri" w:eastAsia="Calibri" w:hAnsi="Calibri"/>
-                <w:sz w:val="18"/>
-                <w:szCs w:val="18"/>
-              </w:rPr>
-              <w:t xml:space="preserve">. </w:t>
-            </w:r>
-            <w:r>
-              <w:rPr>
-                <w:rFonts w:ascii="Calibri" w:cs="Calibri" w:eastAsia="Calibri" w:hAnsi="Calibri"/>
-                <w:b/>
-                <w:bCs/>
-                <w:sz w:val="18"/>
-                <w:szCs w:val="18"/>
-              </w:rPr>
-              <w:t xml:space="preserve">Option:</w:t>
-            </w:r>
-            <w:r>
-              <w:rPr>
-                <w:rFonts w:ascii="Calibri" w:cs="Calibri" w:eastAsia="Calibri" w:hAnsi="Calibri"/>
-                <w:sz w:val="18"/>
-                <w:szCs w:val="18"/>
-              </w:rPr>
-              <w:t xml:space="preserve"> switch to Celebrations-Loop.pptx on main projector during this break for extra content.</w:t>
+                <w:b/>
+                <w:bCs/>
+                <w:sz w:val="18"/>
+                <w:szCs w:val="18"/>
+              </w:rPr>
+              <w:t xml:space="preserve">Pre-Beth: </w:t>
+            </w:r>
+            <w:r>
+              <w:rPr>
+                <w:rFonts w:ascii="Calibri" w:cs="Calibri" w:eastAsia="Calibri" w:hAnsi="Calibri"/>
+                <w:sz w:val="18"/>
+                <w:szCs w:val="18"/>
+              </w:rPr>
+              <w:t xml:space="preserve">Launch </w:t>
+            </w:r>
+            <w:r>
+              <w:rPr>
+                <w:rFonts w:ascii="Calibri" w:cs="Calibri" w:eastAsia="Calibri" w:hAnsi="Calibri"/>
+                <w:b/>
+                <w:bCs/>
+                <w:sz w:val="18"/>
+                <w:szCs w:val="18"/>
+              </w:rPr>
+              <w:t xml:space="preserve">Celebrations-Loop.pptx</w:t>
+            </w:r>
+            <w:r>
+              <w:rPr>
+                <w:rFonts w:ascii="Calibri" w:cs="Calibri" w:eastAsia="Calibri" w:hAnsi="Calibri"/>
+                <w:sz w:val="18"/>
+                <w:szCs w:val="18"/>
+              </w:rPr>
+              <w:t xml:space="preserve"> on main screen and press </w:t>
+            </w:r>
+            <w:r>
+              <w:rPr>
+                <w:rFonts w:ascii="Calibri" w:cs="Calibri" w:eastAsia="Calibri" w:hAnsi="Calibri"/>
+                <w:b/>
+                <w:bCs/>
+                <w:sz w:val="18"/>
+                <w:szCs w:val="18"/>
+              </w:rPr>
+              <w:t xml:space="preserve">F5</w:t>
+            </w:r>
+            <w:r>
+              <w:rPr>
+                <w:rFonts w:ascii="Calibri" w:cs="Calibri" w:eastAsia="Calibri" w:hAnsi="Calibri"/>
+                <w:sz w:val="18"/>
+                <w:szCs w:val="18"/>
+              </w:rPr>
+              <w:t xml:space="preserve">. Resume playlist. Deck auto-loops until you press </w:t>
+            </w:r>
+            <w:r>
+              <w:rPr>
+                <w:rFonts w:ascii="Calibri" w:cs="Calibri" w:eastAsia="Calibri" w:hAnsi="Calibri"/>
+                <w:b/>
+                <w:bCs/>
+                <w:sz w:val="18"/>
+                <w:szCs w:val="18"/>
+              </w:rPr>
+              <w:t xml:space="preserve">Esc</w:t>
+            </w:r>
+            <w:r>
+              <w:rPr>
+                <w:rFonts w:ascii="Calibri" w:cs="Calibri" w:eastAsia="Calibri" w:hAnsi="Calibri"/>
+                <w:sz w:val="18"/>
+                <w:szCs w:val="18"/>
+              </w:rPr>
+              <w:t xml:space="preserve">.</w:t>
             </w:r>
           </w:p>
         </w:tc>
@@ -3022,7 +3366,7 @@
               </w:rPr>
               <w:t xml:space="preserve">Walk-on: </w:t>
             </w:r>
-            <w:hyperlink w:history="1" r:id="rIdbxs4j5ke4re1mqq5pbhoe">
+            <w:hyperlink w:history="1" r:id="rId-m6cpsyzgelvvljrjdhic">
               <w:r>
                 <w:rPr>
                   <w:rStyle w:val="Hyperlink"/>
@@ -3183,10 +3527,20 @@
             <w:r>
               <w:rPr>
                 <w:rFonts w:ascii="Calibri" w:cs="Calibri" w:eastAsia="Calibri" w:hAnsi="Calibri"/>
-                <w:sz w:val="18"/>
-                <w:szCs w:val="18"/>
-              </w:rPr>
-              <w:t xml:space="preserve">Timer page (countdown to 4:45) OR Celebrations Loop</w:t>
+                <w:b/>
+                <w:bCs/>
+                <w:sz w:val="18"/>
+                <w:szCs w:val="18"/>
+              </w:rPr>
+              <w:t xml:space="preserve">Sponsors loop: </w:t>
+            </w:r>
+            <w:r>
+              <w:rPr>
+                <w:rFonts w:ascii="Calibri" w:cs="Calibri" w:eastAsia="Calibri" w:hAnsi="Calibri"/>
+                <w:sz w:val="18"/>
+                <w:szCs w:val="18"/>
+              </w:rPr>
+              <w:t xml:space="preserve">timer page (countdown to 4:45 with scrolling sponsor logos)</w:t>
             </w:r>
           </w:p>
         </w:tc>
@@ -3211,7 +3565,7 @@
             <w:pPr>
               <w:spacing w:after="40" w:before="0"/>
             </w:pPr>
-            <w:hyperlink w:history="1" r:id="rIdv1ph3mobrpq6h6_wljn9f">
+            <w:hyperlink w:history="1" r:id="rIdkkknouorrxhc9k-o5qdgw">
               <w:r>
                 <w:rPr>
                   <w:rStyle w:val="Hyperlink"/>
@@ -3248,12 +3602,40 @@
             <w:r>
               <w:rPr>
                 <w:rFonts w:ascii="Calibri" w:cs="Calibri" w:eastAsia="Calibri" w:hAnsi="Calibri"/>
-                <w:sz w:val="18"/>
-                <w:szCs w:val="18"/>
-              </w:rPr>
-              <w:t xml:space="preserve">One-click: </w:t>
-            </w:r>
-            <w:hyperlink w:history="1" r:id="rIddybyfbrmgyfvmc44izssv">
+                <w:b/>
+                <w:bCs/>
+                <w:sz w:val="18"/>
+                <w:szCs w:val="18"/>
+              </w:rPr>
+              <w:t xml:space="preserve">Pre-Mark W.: </w:t>
+            </w:r>
+            <w:r>
+              <w:rPr>
+                <w:rFonts w:ascii="Calibri" w:cs="Calibri" w:eastAsia="Calibri" w:hAnsi="Calibri"/>
+                <w:sz w:val="18"/>
+                <w:szCs w:val="18"/>
+              </w:rPr>
+              <w:t xml:space="preserve">Press </w:t>
+            </w:r>
+            <w:r>
+              <w:rPr>
+                <w:rFonts w:ascii="Calibri" w:cs="Calibri" w:eastAsia="Calibri" w:hAnsi="Calibri"/>
+                <w:b/>
+                <w:bCs/>
+                <w:sz w:val="18"/>
+                <w:szCs w:val="18"/>
+              </w:rPr>
+              <w:t xml:space="preserve">Esc</w:t>
+            </w:r>
+            <w:r>
+              <w:rPr>
+                <w:rFonts w:ascii="Calibri" w:cs="Calibri" w:eastAsia="Calibri" w:hAnsi="Calibri"/>
+                <w:sz w:val="18"/>
+                <w:szCs w:val="18"/>
+              </w:rPr>
+              <w:t xml:space="preserve"> to exit Celebrations loop. One-click: </w:t>
+            </w:r>
+            <w:hyperlink w:history="1" r:id="rIdx6cmokx8ibjzgbb_ec37i">
               <w:r>
                 <w:rPr>
                   <w:rStyle w:val="Hyperlink"/>
@@ -3270,7 +3652,7 @@
                 <w:sz w:val="18"/>
                 <w:szCs w:val="18"/>
               </w:rPr>
-              <w:t xml:space="preserve">. MC Max handles sponsor thank-yous verbally on return.</w:t>
+              <w:t xml:space="preserve">. Resume playlist. MC Max handles sponsor thank-yous verbally on return.</w:t>
             </w:r>
           </w:p>
         </w:tc>
@@ -3947,7 +4329,7 @@
             <w:pPr>
               <w:spacing w:after="40" w:before="0"/>
             </w:pPr>
-            <w:hyperlink w:history="1" r:id="rIdahd_pclgffydnzdf1l4yp">
+            <w:hyperlink w:history="1" r:id="rIdtthy3bini2eg_uyikqzwe">
               <w:r>
                 <w:rPr>
                   <w:rStyle w:val="Hyperlink"/>
@@ -4050,7 +4432,7 @@
             <w:pPr>
               <w:spacing w:after="40" w:before="0"/>
             </w:pPr>
-            <w:hyperlink w:history="1" r:id="rIdbuwp_u6cbpc0fzxrnfocq">
+            <w:hyperlink w:history="1" r:id="rIdtpfa2flvymuzursdwbdnw">
               <w:r>
                 <w:rPr>
                   <w:rStyle w:val="Hyperlink"/>
@@ -4150,7 +4532,7 @@
             <w:pPr>
               <w:spacing w:after="40" w:before="0"/>
             </w:pPr>
-            <w:hyperlink w:history="1" r:id="rId_-vvwlqmo2eo878wyyl8f">
+            <w:hyperlink w:history="1" r:id="rIdpbb90no_6rw-hoc1bj570">
               <w:r>
                 <w:rPr>
                   <w:rStyle w:val="Hyperlink"/>
@@ -4253,7 +4635,7 @@
             <w:pPr>
               <w:spacing w:after="40" w:before="0"/>
             </w:pPr>
-            <w:hyperlink w:history="1" r:id="rIdxvwmrqe21lbc5lblduusx">
+            <w:hyperlink w:history="1" r:id="rIdawvbs2ftt4xrl7vymt8uq">
               <w:r>
                 <w:rPr>
                   <w:rStyle w:val="Hyperlink"/>
@@ -4537,7 +4919,7 @@
             <w:pPr>
               <w:spacing w:after="40" w:before="0"/>
             </w:pPr>
-            <w:hyperlink w:history="1" r:id="rIdotmy5x10qfunleuavo1f3">
+            <w:hyperlink w:history="1" r:id="rIdoqqy0o1yfsjflekkrxjsr">
               <w:r>
                 <w:rPr>
                   <w:rStyle w:val="Hyperlink"/>
@@ -4681,7 +5063,7 @@
             <w:pPr>
               <w:spacing w:after="40" w:before="0"/>
             </w:pPr>
-            <w:hyperlink w:history="1" r:id="rIdayaxv_wpbybs655iaklk0">
+            <w:hyperlink w:history="1" r:id="rIdv4ug4le9xwvxhvwrlausr">
               <w:r>
                 <w:rPr>
                   <w:rStyle w:val="Hyperlink"/>
@@ -4825,7 +5207,7 @@
             <w:pPr>
               <w:spacing w:after="40" w:before="0"/>
             </w:pPr>
-            <w:hyperlink w:history="1" r:id="rId-alkm0-nossfbtbvtos62">
+            <w:hyperlink w:history="1" r:id="rIdul1dn-uaisjlz6oyimwpg">
               <w:r>
                 <w:rPr>
                   <w:rStyle w:val="Hyperlink"/>
@@ -4967,7 +5349,7 @@
             <w:pPr>
               <w:spacing w:after="40" w:before="0"/>
             </w:pPr>
-            <w:hyperlink w:history="1" r:id="rIdc0ib4fv5v_iflvrwqp8t1">
+            <w:hyperlink w:history="1" r:id="rIdps-uhfduexwhinvftzkg4">
               <w:r>
                 <w:rPr>
                   <w:rStyle w:val="Hyperlink"/>
@@ -5111,7 +5493,7 @@
             <w:pPr>
               <w:spacing w:after="40" w:before="0"/>
             </w:pPr>
-            <w:hyperlink w:history="1" r:id="rId3vd9579nhrv2o4eksfsgu">
+            <w:hyperlink w:history="1" r:id="rIdjwvvpjohwyhoxjz5t1x_b">
               <w:r>
                 <w:rPr>
                   <w:rStyle w:val="Hyperlink"/>
@@ -5253,7 +5635,7 @@
             <w:pPr>
               <w:spacing w:after="40" w:before="0"/>
             </w:pPr>
-            <w:hyperlink w:history="1" r:id="rIdcbvmsqy_nqubs1sz36uv5">
+            <w:hyperlink w:history="1" r:id="rIddwbe9esgjkaac6qfwput_">
               <w:r>
                 <w:rPr>
                   <w:rStyle w:val="Hyperlink"/>
@@ -5440,7 +5822,7 @@
               </w:rPr>
               <w:t xml:space="preserve">Default to </w:t>
             </w:r>
-            <w:hyperlink w:history="1" r:id="rIdsfjufv4-olce9spvv4rlm">
+            <w:hyperlink w:history="1" r:id="rIdaavaf5_9vqqukupsp1yr3">
               <w:r>
                 <w:rPr>
                   <w:rStyle w:val="Hyperlink"/>
@@ -5506,7 +5888,7 @@
         </w:rPr>
         <w:t xml:space="preserve">•  Pre-Lunch bridge (11:55 AM): </w:t>
       </w:r>
-      <w:hyperlink w:history="1" r:id="rId96hogtzulsdkkwbfl6-qh">
+      <w:hyperlink w:history="1" r:id="rIdurzmfb3yztxjmpcdcssk0">
         <w:r>
           <w:rPr>
             <w:rStyle w:val="Hyperlink"/>
@@ -5542,7 +5924,7 @@
         </w:rPr>
         <w:t xml:space="preserve">•  Post-Lunch return (1:00 PM): </w:t>
       </w:r>
-      <w:hyperlink w:history="1" r:id="rIdyoyjemguisnwtbi1p6frc">
+      <w:hyperlink w:history="1" r:id="rIdtydjghobeecpiuy3hk9fr">
         <w:r>
           <w:rPr>
             <w:rStyle w:val="Hyperlink"/>
@@ -5563,7 +5945,7 @@
         </w:rPr>
         <w:t xml:space="preserve"> by Dolly Parton, then resume </w:t>
       </w:r>
-      <w:hyperlink w:history="1" r:id="rIdvnzdg1std4b3_ii0cd6sr">
+      <w:hyperlink w:history="1" r:id="rIdrmubg7napyqg4bnmcaykc">
         <w:r>
           <w:rPr>
             <w:rStyle w:val="Hyperlink"/>
@@ -5810,7 +6192,7 @@
         </w:rPr>
         <w:t xml:space="preserve"> (deck / files / AV lead) · </w:t>
       </w:r>
-      <w:hyperlink w:history="1" r:id="rIdhqfcvhbp6znbrzocr0sdg">
+      <w:hyperlink w:history="1" r:id="rIdgi_dyhoei5swiwcz36hfb">
         <w:r>
           <w:rPr>
             <w:rStyle w:val="Hyperlink"/>
@@ -5829,7 +6211,7 @@
         </w:rPr>
         <w:t xml:space="preserve"> · </w:t>
       </w:r>
-      <w:hyperlink w:history="1" r:id="rIdv5ocjihrycc2_8ipiwiu5">
+      <w:hyperlink w:history="1" r:id="rIdfifh31grduotjymjlurrt">
         <w:r>
           <w:rPr>
             <w:rStyle w:val="Hyperlink"/>
@@ -5863,7 +6245,7 @@
         </w:rPr>
         <w:t xml:space="preserve"> (Day-of Show Operations (event lead, run of show)) · </w:t>
       </w:r>
-      <w:hyperlink w:history="1" r:id="rIduxoux501ryxc30pxzdaz5">
+      <w:hyperlink w:history="1" r:id="rIdyje-oyhologawx1qupf37">
         <w:r>
           <w:rPr>
             <w:rStyle w:val="Hyperlink"/>
@@ -5882,7 +6264,7 @@
         </w:rPr>
         <w:t xml:space="preserve"> · </w:t>
       </w:r>
-      <w:hyperlink w:history="1" r:id="rIdishyewkbapsvon11fnlj5">
+      <w:hyperlink w:history="1" r:id="rIdlya1fiihtlcfmi0mhbm1z">
         <w:r>
           <w:rPr>
             <w:rStyle w:val="Hyperlink"/>
@@ -5916,7 +6298,7 @@
         </w:rPr>
         <w:t xml:space="preserve"> (Venue Liaison (knows the Statler)) · </w:t>
       </w:r>
-      <w:hyperlink w:history="1" r:id="rId3q49m1v_vu-q9enplak2m">
+      <w:hyperlink w:history="1" r:id="rIdpxi6tm0u640cgttpdithj">
         <w:r>
           <w:rPr>
             <w:rStyle w:val="Hyperlink"/>
@@ -5935,7 +6317,7 @@
         </w:rPr>
         <w:t xml:space="preserve"> · </w:t>
       </w:r>
-      <w:hyperlink w:history="1" r:id="rId5afhe8-kjoqeayseh5aia">
+      <w:hyperlink w:history="1" r:id="rIdy65nqilvchipvg7c0qwtr">
         <w:r>
           <w:rPr>
             <w:rStyle w:val="Hyperlink"/>
@@ -5969,7 +6351,7 @@
         </w:rPr>
         <w:t xml:space="preserve"> (Encore / Statler AV contact) · </w:t>
       </w:r>
-      <w:hyperlink w:history="1" r:id="rId10i8bpguaqeootozqdevk">
+      <w:hyperlink w:history="1" r:id="rIdjlm84py0pa5xrhe4di7hz">
         <w:r>
           <w:rPr>
             <w:rStyle w:val="Hyperlink"/>
@@ -5988,7 +6370,7 @@
         </w:rPr>
         <w:t xml:space="preserve"> · </w:t>
       </w:r>
-      <w:hyperlink w:history="1" r:id="rIdfvsng636ryp1zbxdzpofr">
+      <w:hyperlink w:history="1" r:id="rIdrisagyjw0ijgx8l_67bnr">
         <w:r>
           <w:rPr>
             <w:rStyle w:val="Hyperlink"/>
@@ -6022,7 +6404,7 @@
         </w:rPr>
         <w:t xml:space="preserve"> (MC (emcee)) · </w:t>
       </w:r>
-      <w:hyperlink w:history="1" r:id="rIdgr_n8578hxt2y6c9j5n9t">
+      <w:hyperlink w:history="1" r:id="rIdli0afhjlx5pekhepbjcr5">
         <w:r>
           <w:rPr>
             <w:rStyle w:val="Hyperlink"/>
@@ -6056,7 +6438,7 @@
         </w:rPr>
         <w:t xml:space="preserve"> (stage-side coordinator (eyes on stage all day, supports MC Max)) · </w:t>
       </w:r>
-      <w:hyperlink w:history="1" r:id="rIdydjgxilumdijpdnyub4p9">
+      <w:hyperlink w:history="1" r:id="rIdcltryv6ccvp3-sj7lwptq">
         <w:r>
           <w:rPr>
             <w:rStyle w:val="Hyperlink"/>

</xml_diff>